<commit_message>
Fælles topbjælke med navigation og tema på alle sider
Topbjælken erstatter brødkrummerne og temaknapperne i sidehovedet. Forsiden
mister sin store overskrift, og navigationssiderne mister undertitlerne.
Journalen: "Fysik C" er nu "Fysik", ny fodnote om redigeret elevjournal, og
versionen hedder "Word + WordMat + Excel". Rettet vandret scroll ved 320 px.

Co-Authored-By: Claude Opus 5.5 (1M context) <noreply@anthropic.com>
</commit_message>
<xml_diff>
--- a/journal/Hookes lov - journal.docx
+++ b/journal/Hookes lov - journal.docx
@@ -15,7 +15,18 @@
           <w:sz w:val="20"/>
           <w:szCs w:val="20"/>
         </w:rPr>
-        <w:t>FYSIK C · JOURNAL</w:t>
+        <w:t>FYSIK</w:t>
+      </w:r>
+      <w:r>
+        <w:rPr>
+          <w:b/>
+          <w:bCs/>
+          <w:color w:val="2F5496"/>
+          <w:spacing w:val="40"/>
+          <w:sz w:val="20"/>
+          <w:szCs w:val="20"/>
+        </w:rPr>
+        <w:t xml:space="preserve"> · JOURNAL</w:t>
       </w:r>
     </w:p>
     <w:p>
@@ -114,12 +125,6 @@
         <w:gridCol w:w="6426"/>
       </w:tblGrid>
       <w:tr>
-        <w:tblPrEx>
-          <w:tblCellMar>
-            <w:top w:w="0" w:type="dxa"/>
-            <w:bottom w:w="0" w:type="dxa"/>
-          </w:tblCellMar>
-        </w:tblPrEx>
         <w:tc>
           <w:tcPr>
             <w:tcW w:w="2600" w:type="dxa"/>
@@ -163,12 +168,6 @@
         </w:tc>
       </w:tr>
       <w:tr>
-        <w:tblPrEx>
-          <w:tblCellMar>
-            <w:top w:w="0" w:type="dxa"/>
-            <w:bottom w:w="0" w:type="dxa"/>
-          </w:tblCellMar>
-        </w:tblPrEx>
         <w:tc>
           <w:tcPr>
             <w:tcW w:w="2600" w:type="dxa"/>
@@ -206,18 +205,15 @@
               <w:spacing w:after="80"/>
             </w:pPr>
             <w:r>
-              <w:t>1.x, fysik C</w:t>
+              <w:t xml:space="preserve">1.x, </w:t>
+            </w:r>
+            <w:r>
+              <w:t>fysik</w:t>
             </w:r>
           </w:p>
         </w:tc>
       </w:tr>
       <w:tr>
-        <w:tblPrEx>
-          <w:tblCellMar>
-            <w:top w:w="0" w:type="dxa"/>
-            <w:bottom w:w="0" w:type="dxa"/>
-          </w:tblCellMar>
-        </w:tblPrEx>
         <w:tc>
           <w:tcPr>
             <w:tcW w:w="2600" w:type="dxa"/>
@@ -261,12 +257,6 @@
         </w:tc>
       </w:tr>
       <w:tr>
-        <w:tblPrEx>
-          <w:tblCellMar>
-            <w:top w:w="0" w:type="dxa"/>
-            <w:bottom w:w="0" w:type="dxa"/>
-          </w:tblCellMar>
-        </w:tblPrEx>
         <w:tc>
           <w:tcPr>
             <w:tcW w:w="2600" w:type="dxa"/>
@@ -310,12 +300,6 @@
         </w:tc>
       </w:tr>
       <w:tr>
-        <w:tblPrEx>
-          <w:tblCellMar>
-            <w:top w:w="0" w:type="dxa"/>
-            <w:bottom w:w="0" w:type="dxa"/>
-          </w:tblCellMar>
-        </w:tblPrEx>
         <w:tc>
           <w:tcPr>
             <w:tcW w:w="2600" w:type="dxa"/>
@@ -1193,13 +1177,7 @@
                 <w:rPr>
                   <w:rFonts w:ascii="Cambria Math" w:hAnsi="Cambria Math"/>
                 </w:rPr>
-                <m:t>Δx</m:t>
-              </m:r>
-              <m:r>
-                <w:rPr>
-                  <w:rFonts w:ascii="Cambria Math" w:hAnsi="Cambria Math"/>
-                </w:rPr>
-                <m:t>#</m:t>
+                <m:t>Δx#</m:t>
               </m:r>
               <m:d>
                 <m:dPr>
@@ -1333,13 +1311,7 @@
                 <w:rPr>
                   <w:rFonts w:ascii="Cambria Math" w:hAnsi="Cambria Math"/>
                 </w:rPr>
-                <m:t>g</m:t>
-              </m:r>
-              <m:r>
-                <w:rPr>
-                  <w:rFonts w:ascii="Cambria Math" w:hAnsi="Cambria Math"/>
-                </w:rPr>
-                <m:t>#</m:t>
+                <m:t>g#</m:t>
               </m:r>
               <m:d>
                 <m:dPr>
@@ -1980,12 +1952,6 @@
         <w:gridCol w:w="2000"/>
       </w:tblGrid>
       <w:tr>
-        <w:tblPrEx>
-          <w:tblCellMar>
-            <w:top w:w="0" w:type="dxa"/>
-            <w:bottom w:w="0" w:type="dxa"/>
-          </w:tblCellMar>
-        </w:tblPrEx>
         <w:trPr>
           <w:tblHeader/>
           <w:jc w:val="center"/>
@@ -2120,12 +2086,6 @@
         </w:tc>
       </w:tr>
       <w:tr>
-        <w:tblPrEx>
-          <w:tblCellMar>
-            <w:top w:w="0" w:type="dxa"/>
-            <w:bottom w:w="0" w:type="dxa"/>
-          </w:tblCellMar>
-        </w:tblPrEx>
         <w:trPr>
           <w:jc w:val="center"/>
         </w:trPr>
@@ -2239,12 +2199,6 @@
         </w:tc>
       </w:tr>
       <w:tr>
-        <w:tblPrEx>
-          <w:tblCellMar>
-            <w:top w:w="0" w:type="dxa"/>
-            <w:bottom w:w="0" w:type="dxa"/>
-          </w:tblCellMar>
-        </w:tblPrEx>
         <w:trPr>
           <w:jc w:val="center"/>
         </w:trPr>
@@ -2358,12 +2312,6 @@
         </w:tc>
       </w:tr>
       <w:tr>
-        <w:tblPrEx>
-          <w:tblCellMar>
-            <w:top w:w="0" w:type="dxa"/>
-            <w:bottom w:w="0" w:type="dxa"/>
-          </w:tblCellMar>
-        </w:tblPrEx>
         <w:trPr>
           <w:jc w:val="center"/>
         </w:trPr>
@@ -2477,12 +2425,6 @@
         </w:tc>
       </w:tr>
       <w:tr>
-        <w:tblPrEx>
-          <w:tblCellMar>
-            <w:top w:w="0" w:type="dxa"/>
-            <w:bottom w:w="0" w:type="dxa"/>
-          </w:tblCellMar>
-        </w:tblPrEx>
         <w:trPr>
           <w:jc w:val="center"/>
         </w:trPr>
@@ -2596,12 +2538,6 @@
         </w:tc>
       </w:tr>
       <w:tr>
-        <w:tblPrEx>
-          <w:tblCellMar>
-            <w:top w:w="0" w:type="dxa"/>
-            <w:bottom w:w="0" w:type="dxa"/>
-          </w:tblCellMar>
-        </w:tblPrEx>
         <w:trPr>
           <w:jc w:val="center"/>
         </w:trPr>
@@ -2715,12 +2651,6 @@
         </w:tc>
       </w:tr>
       <w:tr>
-        <w:tblPrEx>
-          <w:tblCellMar>
-            <w:top w:w="0" w:type="dxa"/>
-            <w:bottom w:w="0" w:type="dxa"/>
-          </w:tblCellMar>
-        </w:tblPrEx>
         <w:trPr>
           <w:jc w:val="center"/>
         </w:trPr>
@@ -2834,12 +2764,6 @@
         </w:tc>
       </w:tr>
       <w:tr>
-        <w:tblPrEx>
-          <w:tblCellMar>
-            <w:top w:w="0" w:type="dxa"/>
-            <w:bottom w:w="0" w:type="dxa"/>
-          </w:tblCellMar>
-        </w:tblPrEx>
         <w:trPr>
           <w:jc w:val="center"/>
         </w:trPr>
@@ -3853,7 +3777,15 @@
         <w:sz w:val="18"/>
         <w:szCs w:val="18"/>
       </w:rPr>
-      <w:t>Freja Madsen, 1.x · Fysik C</w:t>
+      <w:t xml:space="preserve">Freja Madsen, 1.x · </w:t>
+    </w:r>
+    <w:r>
+      <w:rPr>
+        <w:color w:val="7F7F7F"/>
+        <w:sz w:val="18"/>
+        <w:szCs w:val="18"/>
+      </w:rPr>
+      <w:t>Fysik</w:t>
     </w:r>
     <w:r>
       <w:rPr>

</xml_diff>

<commit_message>
Excel-guiden bliver til "Punktdiagram med lineær regression"
- Omdøbt fra graf-i-excel.html og skrevet generelt, med Hookes lov som eksempel
- Rigtige skærmbilleder fra dansk Excel 365 med røde markeringer
- Ét trin ad gangen som standard (assets/guide.js), med "Vis alle trin"
- Tabeloverskrifter og aksetitler som symbol / enhed, også i journalen
- Journalen (docx, pdf, Figur 2 og HTML) er bygget igen
- docx installeret som afhængighed i package.json

Co-Authored-By: Claude Opus 5.5 (1M context) <noreply@anthropic.com>
</commit_message>
<xml_diff>
--- a/journal/Hookes lov - journal.docx
+++ b/journal/Hookes lov - journal.docx
@@ -15,18 +15,7 @@
           <w:sz w:val="20"/>
           <w:szCs w:val="20"/>
         </w:rPr>
-        <w:t>FYSIK</w:t>
-      </w:r>
-      <w:r>
-        <w:rPr>
-          <w:b/>
-          <w:bCs/>
-          <w:color w:val="2F5496"/>
-          <w:spacing w:val="40"/>
-          <w:sz w:val="20"/>
-          <w:szCs w:val="20"/>
-        </w:rPr>
-        <w:t xml:space="preserve"> · JOURNAL</w:t>
+        <w:t>FYSIK · JOURNAL</w:t>
       </w:r>
     </w:p>
     <w:p>
@@ -59,7 +48,7 @@
           <w:noProof/>
         </w:rPr>
         <w:drawing>
-          <wp:inline distT="0" distB="0" distL="0" distR="0" wp14:anchorId="270E03C1" wp14:editId="5FB2BB9C">
+          <wp:inline distT="0" distB="0" distL="0" distR="0" wp14:anchorId="18EE334C" wp14:editId="0532B9AA">
             <wp:extent cx="1809750" cy="1876425"/>
             <wp:effectExtent l="0" t="0" r="0" b="0"/>
             <wp:docPr id="1" name="Billede 1"/>
@@ -118,13 +107,19 @@
           <w:left w:w="10" w:type="dxa"/>
           <w:right w:w="10" w:type="dxa"/>
         </w:tblCellMar>
-        <w:tblLook w:val="0000" w:firstRow="0" w:lastRow="0" w:firstColumn="0" w:lastColumn="0" w:noHBand="0" w:noVBand="0"/>
+        <w:tblLook w:val="04A0" w:firstRow="1" w:lastRow="0" w:firstColumn="1" w:lastColumn="0" w:noHBand="0" w:noVBand="1"/>
       </w:tblPr>
       <w:tblGrid>
         <w:gridCol w:w="2600"/>
         <w:gridCol w:w="6426"/>
       </w:tblGrid>
       <w:tr>
+        <w:tblPrEx>
+          <w:tblCellMar>
+            <w:top w:w="0" w:type="dxa"/>
+            <w:bottom w:w="0" w:type="dxa"/>
+          </w:tblCellMar>
+        </w:tblPrEx>
         <w:tc>
           <w:tcPr>
             <w:tcW w:w="2600" w:type="dxa"/>
@@ -168,6 +163,12 @@
         </w:tc>
       </w:tr>
       <w:tr>
+        <w:tblPrEx>
+          <w:tblCellMar>
+            <w:top w:w="0" w:type="dxa"/>
+            <w:bottom w:w="0" w:type="dxa"/>
+          </w:tblCellMar>
+        </w:tblPrEx>
         <w:tc>
           <w:tcPr>
             <w:tcW w:w="2600" w:type="dxa"/>
@@ -205,15 +206,18 @@
               <w:spacing w:after="80"/>
             </w:pPr>
             <w:r>
-              <w:t xml:space="preserve">1.x, </w:t>
-            </w:r>
-            <w:r>
-              <w:t>fysik</w:t>
+              <w:t>1.x, fysik</w:t>
             </w:r>
           </w:p>
         </w:tc>
       </w:tr>
       <w:tr>
+        <w:tblPrEx>
+          <w:tblCellMar>
+            <w:top w:w="0" w:type="dxa"/>
+            <w:bottom w:w="0" w:type="dxa"/>
+          </w:tblCellMar>
+        </w:tblPrEx>
         <w:tc>
           <w:tcPr>
             <w:tcW w:w="2600" w:type="dxa"/>
@@ -257,6 +261,12 @@
         </w:tc>
       </w:tr>
       <w:tr>
+        <w:tblPrEx>
+          <w:tblCellMar>
+            <w:top w:w="0" w:type="dxa"/>
+            <w:bottom w:w="0" w:type="dxa"/>
+          </w:tblCellMar>
+        </w:tblPrEx>
         <w:tc>
           <w:tcPr>
             <w:tcW w:w="2600" w:type="dxa"/>
@@ -300,6 +310,12 @@
         </w:tc>
       </w:tr>
       <w:tr>
+        <w:tblPrEx>
+          <w:tblCellMar>
+            <w:top w:w="0" w:type="dxa"/>
+            <w:bottom w:w="0" w:type="dxa"/>
+          </w:tblCellMar>
+        </w:tblPrEx>
         <w:tc>
           <w:tcPr>
             <w:tcW w:w="2600" w:type="dxa"/>
@@ -366,7 +382,7 @@
     <w:sdt>
       <w:sdtPr>
         <w:alias w:val="Indholdsfortegnelse"/>
-        <w:id w:val="-671328649"/>
+        <w:id w:val="898790614"/>
       </w:sdtPr>
       <w:sdtEndPr/>
       <w:sdtContent>
@@ -395,7 +411,7 @@
           <w:r>
             <w:fldChar w:fldCharType="separate"/>
           </w:r>
-          <w:hyperlink w:anchor="_Toc241079443" w:history="1">
+          <w:hyperlink w:anchor="_Toc241169351" w:history="1">
             <w:r>
               <w:rPr>
                 <w:rStyle w:val="Hyperlink"/>
@@ -437,7 +453,7 @@
               <w:rPr>
                 <w:noProof/>
               </w:rPr>
-              <w:instrText xml:space="preserve"> PAGEREF _Toc241079443 \h </w:instrText>
+              <w:instrText xml:space="preserve"> PAGEREF _Toc241169351 \h </w:instrText>
             </w:r>
             <w:r>
               <w:rPr>
@@ -480,7 +496,7 @@
               <w14:ligatures w14:val="standardContextual"/>
             </w:rPr>
           </w:pPr>
-          <w:hyperlink w:anchor="_Toc241079444" w:history="1">
+          <w:hyperlink w:anchor="_Toc241169352" w:history="1">
             <w:r>
               <w:rPr>
                 <w:rStyle w:val="Hyperlink"/>
@@ -522,7 +538,7 @@
               <w:rPr>
                 <w:noProof/>
               </w:rPr>
-              <w:instrText xml:space="preserve"> PAGEREF _Toc241079444 \h </w:instrText>
+              <w:instrText xml:space="preserve"> PAGEREF _Toc241169352 \h </w:instrText>
             </w:r>
             <w:r>
               <w:rPr>
@@ -565,7 +581,7 @@
               <w14:ligatures w14:val="standardContextual"/>
             </w:rPr>
           </w:pPr>
-          <w:hyperlink w:anchor="_Toc241079445" w:history="1">
+          <w:hyperlink w:anchor="_Toc241169353" w:history="1">
             <w:r>
               <w:rPr>
                 <w:rStyle w:val="Hyperlink"/>
@@ -607,7 +623,7 @@
               <w:rPr>
                 <w:noProof/>
               </w:rPr>
-              <w:instrText xml:space="preserve"> PAGEREF _Toc241079445 \h </w:instrText>
+              <w:instrText xml:space="preserve"> PAGEREF _Toc241169353 \h </w:instrText>
             </w:r>
             <w:r>
               <w:rPr>
@@ -650,7 +666,7 @@
               <w14:ligatures w14:val="standardContextual"/>
             </w:rPr>
           </w:pPr>
-          <w:hyperlink w:anchor="_Toc241079446" w:history="1">
+          <w:hyperlink w:anchor="_Toc241169354" w:history="1">
             <w:r>
               <w:rPr>
                 <w:rStyle w:val="Hyperlink"/>
@@ -692,7 +708,7 @@
               <w:rPr>
                 <w:noProof/>
               </w:rPr>
-              <w:instrText xml:space="preserve"> PAGEREF _Toc241079446 \h </w:instrText>
+              <w:instrText xml:space="preserve"> PAGEREF _Toc241169354 \h </w:instrText>
             </w:r>
             <w:r>
               <w:rPr>
@@ -735,7 +751,7 @@
               <w14:ligatures w14:val="standardContextual"/>
             </w:rPr>
           </w:pPr>
-          <w:hyperlink w:anchor="_Toc241079447" w:history="1">
+          <w:hyperlink w:anchor="_Toc241169355" w:history="1">
             <w:r>
               <w:rPr>
                 <w:rStyle w:val="Hyperlink"/>
@@ -777,7 +793,7 @@
               <w:rPr>
                 <w:noProof/>
               </w:rPr>
-              <w:instrText xml:space="preserve"> PAGEREF _Toc241079447 \h </w:instrText>
+              <w:instrText xml:space="preserve"> PAGEREF _Toc241169355 \h </w:instrText>
             </w:r>
             <w:r>
               <w:rPr>
@@ -820,7 +836,7 @@
               <w14:ligatures w14:val="standardContextual"/>
             </w:rPr>
           </w:pPr>
-          <w:hyperlink w:anchor="_Toc241079448" w:history="1">
+          <w:hyperlink w:anchor="_Toc241169356" w:history="1">
             <w:r>
               <w:rPr>
                 <w:rStyle w:val="Hyperlink"/>
@@ -862,7 +878,7 @@
               <w:rPr>
                 <w:noProof/>
               </w:rPr>
-              <w:instrText xml:space="preserve"> PAGEREF _Toc241079448 \h </w:instrText>
+              <w:instrText xml:space="preserve"> PAGEREF _Toc241169356 \h </w:instrText>
             </w:r>
             <w:r>
               <w:rPr>
@@ -905,7 +921,7 @@
               <w14:ligatures w14:val="standardContextual"/>
             </w:rPr>
           </w:pPr>
-          <w:hyperlink w:anchor="_Toc241079449" w:history="1">
+          <w:hyperlink w:anchor="_Toc241169357" w:history="1">
             <w:r>
               <w:rPr>
                 <w:rStyle w:val="Hyperlink"/>
@@ -947,7 +963,7 @@
               <w:rPr>
                 <w:noProof/>
               </w:rPr>
-              <w:instrText xml:space="preserve"> PAGEREF _Toc241079449 \h </w:instrText>
+              <w:instrText xml:space="preserve"> PAGEREF _Toc241169357 \h </w:instrText>
             </w:r>
             <w:r>
               <w:rPr>
@@ -990,7 +1006,7 @@
               <w14:ligatures w14:val="standardContextual"/>
             </w:rPr>
           </w:pPr>
-          <w:hyperlink w:anchor="_Toc241079450" w:history="1">
+          <w:hyperlink w:anchor="_Toc241169358" w:history="1">
             <w:r>
               <w:rPr>
                 <w:rStyle w:val="Hyperlink"/>
@@ -1032,7 +1048,7 @@
               <w:rPr>
                 <w:noProof/>
               </w:rPr>
-              <w:instrText xml:space="preserve"> PAGEREF _Toc241079450 \h </w:instrText>
+              <w:instrText xml:space="preserve"> PAGEREF _Toc241169358 \h </w:instrText>
             </w:r>
             <w:r>
               <w:rPr>
@@ -1073,7 +1089,7 @@
           <w:tab w:val="left" w:pos="567"/>
         </w:tabs>
       </w:pPr>
-      <w:bookmarkStart w:id="0" w:name="_Toc241079443"/>
+      <w:bookmarkStart w:id="0" w:name="_Toc241169351"/>
       <w:r>
         <w:t>1</w:t>
       </w:r>
@@ -1128,7 +1144,7 @@
           <w:tab w:val="left" w:pos="567"/>
         </w:tabs>
       </w:pPr>
-      <w:bookmarkStart w:id="1" w:name="_Toc241079444"/>
+      <w:bookmarkStart w:id="1" w:name="_Toc241169352"/>
       <w:r>
         <w:t>2</w:t>
       </w:r>
@@ -1177,7 +1193,13 @@
                 <w:rPr>
                   <w:rFonts w:ascii="Cambria Math" w:hAnsi="Cambria Math"/>
                 </w:rPr>
-                <m:t>Δx#</m:t>
+                <m:t>Δx</m:t>
+              </m:r>
+              <m:r>
+                <w:rPr>
+                  <w:rFonts w:ascii="Cambria Math" w:hAnsi="Cambria Math"/>
+                </w:rPr>
+                <m:t>#</m:t>
               </m:r>
               <m:d>
                 <m:dPr>
@@ -1311,7 +1333,13 @@
                 <w:rPr>
                   <w:rFonts w:ascii="Cambria Math" w:hAnsi="Cambria Math"/>
                 </w:rPr>
-                <m:t>g#</m:t>
+                <m:t>g</m:t>
+              </m:r>
+              <m:r>
+                <w:rPr>
+                  <w:rFonts w:ascii="Cambria Math" w:hAnsi="Cambria Math"/>
+                </w:rPr>
+                <m:t>#</m:t>
               </m:r>
               <m:d>
                 <m:dPr>
@@ -1467,7 +1495,7 @@
           <w:tab w:val="left" w:pos="567"/>
         </w:tabs>
       </w:pPr>
-      <w:bookmarkStart w:id="2" w:name="_Toc241079445"/>
+      <w:bookmarkStart w:id="2" w:name="_Toc241169353"/>
       <w:r>
         <w:t>3</w:t>
       </w:r>
@@ -1604,10 +1632,10 @@
           <w:noProof/>
         </w:rPr>
         <w:drawing>
-          <wp:inline distT="0" distB="0" distL="0" distR="0" wp14:anchorId="66D427DC" wp14:editId="740A1B1B">
+          <wp:inline distT="0" distB="0" distL="0" distR="0" wp14:anchorId="06095413" wp14:editId="2EEB21EA">
             <wp:extent cx="2381250" cy="2466975"/>
             <wp:effectExtent l="0" t="0" r="0" b="0"/>
-            <wp:docPr id="1839216410" name="Billede 1839216410"/>
+            <wp:docPr id="803853430" name="Billede 803853430"/>
             <wp:cNvGraphicFramePr>
               <a:graphicFrameLocks xmlns:a="http://schemas.openxmlformats.org/drawingml/2006/main" noChangeAspect="1"/>
             </wp:cNvGraphicFramePr>
@@ -1680,7 +1708,7 @@
           <w:tab w:val="left" w:pos="567"/>
         </w:tabs>
       </w:pPr>
-      <w:bookmarkStart w:id="3" w:name="_Toc241079446"/>
+      <w:bookmarkStart w:id="3" w:name="_Toc241169354"/>
       <w:r>
         <w:t>4</w:t>
       </w:r>
@@ -1835,7 +1863,7 @@
           <w:tab w:val="left" w:pos="567"/>
         </w:tabs>
       </w:pPr>
-      <w:bookmarkStart w:id="4" w:name="_Toc241079447"/>
+      <w:bookmarkStart w:id="4" w:name="_Toc241169355"/>
       <w:r>
         <w:t>5</w:t>
       </w:r>
@@ -1943,7 +1971,7 @@
           <w:left w:w="10" w:type="dxa"/>
           <w:right w:w="10" w:type="dxa"/>
         </w:tblCellMar>
-        <w:tblLook w:val="0000" w:firstRow="0" w:lastRow="0" w:firstColumn="0" w:lastColumn="0" w:noHBand="0" w:noVBand="0"/>
+        <w:tblLook w:val="04A0" w:firstRow="1" w:lastRow="0" w:firstColumn="1" w:lastColumn="0" w:noHBand="0" w:noVBand="1"/>
       </w:tblPr>
       <w:tblGrid>
         <w:gridCol w:w="2000"/>
@@ -1952,6 +1980,12 @@
         <w:gridCol w:w="2000"/>
       </w:tblGrid>
       <w:tr>
+        <w:tblPrEx>
+          <w:tblCellMar>
+            <w:top w:w="0" w:type="dxa"/>
+            <w:bottom w:w="0" w:type="dxa"/>
+          </w:tblCellMar>
+        </w:tblPrEx>
         <w:trPr>
           <w:tblHeader/>
           <w:jc w:val="center"/>
@@ -1984,7 +2018,7 @@
                 <w:b/>
                 <w:bCs/>
               </w:rPr>
-              <w:t>Masse m (g)</w:t>
+              <w:t>Masse m / g</w:t>
             </w:r>
           </w:p>
         </w:tc>
@@ -2016,7 +2050,7 @@
                 <w:b/>
                 <w:bCs/>
               </w:rPr>
-              <w:t>Position L (cm)</w:t>
+              <w:t>Position L / cm</w:t>
             </w:r>
           </w:p>
         </w:tc>
@@ -2048,7 +2082,7 @@
                 <w:b/>
                 <w:bCs/>
               </w:rPr>
-              <w:t>Forlængelse Δx (m)</w:t>
+              <w:t>Forlængelse Δx / m</w:t>
             </w:r>
           </w:p>
         </w:tc>
@@ -2080,12 +2114,18 @@
                 <w:b/>
                 <w:bCs/>
               </w:rPr>
-              <w:t>Kraft F (N)</w:t>
+              <w:t>Kraft F / N</w:t>
             </w:r>
           </w:p>
         </w:tc>
       </w:tr>
       <w:tr>
+        <w:tblPrEx>
+          <w:tblCellMar>
+            <w:top w:w="0" w:type="dxa"/>
+            <w:bottom w:w="0" w:type="dxa"/>
+          </w:tblCellMar>
+        </w:tblPrEx>
         <w:trPr>
           <w:jc w:val="center"/>
         </w:trPr>
@@ -2199,6 +2239,12 @@
         </w:tc>
       </w:tr>
       <w:tr>
+        <w:tblPrEx>
+          <w:tblCellMar>
+            <w:top w:w="0" w:type="dxa"/>
+            <w:bottom w:w="0" w:type="dxa"/>
+          </w:tblCellMar>
+        </w:tblPrEx>
         <w:trPr>
           <w:jc w:val="center"/>
         </w:trPr>
@@ -2312,6 +2358,12 @@
         </w:tc>
       </w:tr>
       <w:tr>
+        <w:tblPrEx>
+          <w:tblCellMar>
+            <w:top w:w="0" w:type="dxa"/>
+            <w:bottom w:w="0" w:type="dxa"/>
+          </w:tblCellMar>
+        </w:tblPrEx>
         <w:trPr>
           <w:jc w:val="center"/>
         </w:trPr>
@@ -2425,6 +2477,12 @@
         </w:tc>
       </w:tr>
       <w:tr>
+        <w:tblPrEx>
+          <w:tblCellMar>
+            <w:top w:w="0" w:type="dxa"/>
+            <w:bottom w:w="0" w:type="dxa"/>
+          </w:tblCellMar>
+        </w:tblPrEx>
         <w:trPr>
           <w:jc w:val="center"/>
         </w:trPr>
@@ -2538,6 +2596,12 @@
         </w:tc>
       </w:tr>
       <w:tr>
+        <w:tblPrEx>
+          <w:tblCellMar>
+            <w:top w:w="0" w:type="dxa"/>
+            <w:bottom w:w="0" w:type="dxa"/>
+          </w:tblCellMar>
+        </w:tblPrEx>
         <w:trPr>
           <w:jc w:val="center"/>
         </w:trPr>
@@ -2651,6 +2715,12 @@
         </w:tc>
       </w:tr>
       <w:tr>
+        <w:tblPrEx>
+          <w:tblCellMar>
+            <w:top w:w="0" w:type="dxa"/>
+            <w:bottom w:w="0" w:type="dxa"/>
+          </w:tblCellMar>
+        </w:tblPrEx>
         <w:trPr>
           <w:jc w:val="center"/>
         </w:trPr>
@@ -2764,6 +2834,12 @@
         </w:tc>
       </w:tr>
       <w:tr>
+        <w:tblPrEx>
+          <w:tblCellMar>
+            <w:top w:w="0" w:type="dxa"/>
+            <w:bottom w:w="0" w:type="dxa"/>
+          </w:tblCellMar>
+        </w:tblPrEx>
         <w:trPr>
           <w:jc w:val="center"/>
         </w:trPr>
@@ -2884,7 +2960,7 @@
           <w:tab w:val="left" w:pos="567"/>
         </w:tabs>
       </w:pPr>
-      <w:bookmarkStart w:id="5" w:name="_Toc241079448"/>
+      <w:bookmarkStart w:id="5" w:name="_Toc241169356"/>
       <w:r>
         <w:lastRenderedPageBreak/>
         <w:t>6</w:t>
@@ -3203,10 +3279,10 @@
           <w:noProof/>
         </w:rPr>
         <w:drawing>
-          <wp:inline distT="0" distB="0" distL="0" distR="0" wp14:anchorId="42BEC223" wp14:editId="2B2A7EC6">
+          <wp:inline distT="0" distB="0" distL="0" distR="0" wp14:anchorId="0D80CCA7" wp14:editId="2137D074">
             <wp:extent cx="5143500" cy="3105150"/>
             <wp:effectExtent l="0" t="0" r="0" b="0"/>
-            <wp:docPr id="1347255834" name="Billede 1347255834"/>
+            <wp:docPr id="1345877330" name="Billede 1345877330"/>
             <wp:cNvGraphicFramePr>
               <a:graphicFrameLocks xmlns:a="http://schemas.openxmlformats.org/drawingml/2006/main" noChangeAspect="1"/>
             </wp:cNvGraphicFramePr>
@@ -3356,7 +3432,7 @@
           <w:tab w:val="left" w:pos="567"/>
         </w:tabs>
       </w:pPr>
-      <w:bookmarkStart w:id="6" w:name="_Toc241079449"/>
+      <w:bookmarkStart w:id="6" w:name="_Toc241169357"/>
       <w:r>
         <w:t>7</w:t>
       </w:r>
@@ -3504,7 +3580,7 @@
           <w:tab w:val="left" w:pos="567"/>
         </w:tabs>
       </w:pPr>
-      <w:bookmarkStart w:id="7" w:name="_Toc241079450"/>
+      <w:bookmarkStart w:id="7" w:name="_Toc241169358"/>
       <w:r>
         <w:t>8</w:t>
       </w:r>
@@ -3777,15 +3853,7 @@
         <w:sz w:val="18"/>
         <w:szCs w:val="18"/>
       </w:rPr>
-      <w:t xml:space="preserve">Freja Madsen, 1.x · </w:t>
-    </w:r>
-    <w:r>
-      <w:rPr>
-        <w:color w:val="7F7F7F"/>
-        <w:sz w:val="18"/>
-        <w:szCs w:val="18"/>
-      </w:rPr>
-      <w:t>Fysik</w:t>
+      <w:t>Freja Madsen, 1.x · Fysik</w:t>
     </w:r>
     <w:r>
       <w:rPr>
@@ -3809,10 +3877,10 @@
 <file path=word/numbering.xml><?xml version="1.0" encoding="utf-8"?>
 <w:numbering xmlns:wpc="http://schemas.microsoft.com/office/word/2010/wordprocessingCanvas" xmlns:cx="http://schemas.microsoft.com/office/drawing/2014/chartex" xmlns:cx1="http://schemas.microsoft.com/office/drawing/2015/9/8/chartex" xmlns:cx2="http://schemas.microsoft.com/office/drawing/2015/10/21/chartex" xmlns:cx3="http://schemas.microsoft.com/office/drawing/2016/5/9/chartex" xmlns:cx4="http://schemas.microsoft.com/office/drawing/2016/5/10/chartex" xmlns:cx5="http://schemas.microsoft.com/office/drawing/2016/5/11/chartex" xmlns:cx6="http://schemas.microsoft.com/office/drawing/2016/5/12/chartex" xmlns:cx7="http://schemas.microsoft.com/office/drawing/2016/5/13/chartex" xmlns:cx8="http://schemas.microsoft.com/office/drawing/2016/5/14/chartex" xmlns:mc="http://schemas.openxmlformats.org/markup-compatibility/2006" xmlns:aink="http://schemas.microsoft.com/office/drawing/2016/ink" xmlns:am3d="http://schemas.microsoft.com/office/drawing/2017/model3d" xmlns:o="urn:schemas-microsoft-com:office:office" xmlns:oel="http://schemas.microsoft.com/office/2019/extlst" xmlns:r="http://schemas.openxmlformats.org/officeDocument/2006/relationships" xmlns:m="http://schemas.openxmlformats.org/officeDocument/2006/math" xmlns:v="urn:schemas-microsoft-com:vml" xmlns:wp14="http://schemas.microsoft.com/office/word/2010/wordprocessingDrawing" xmlns:wp="http://schemas.openxmlformats.org/drawingml/2006/wordprocessingDrawing" xmlns:w10="urn:schemas-microsoft-com:office:word" xmlns:w="http://schemas.openxmlformats.org/wordprocessingml/2006/main" xmlns:w14="http://schemas.microsoft.com/office/word/2010/wordml" xmlns:w15="http://schemas.microsoft.com/office/word/2012/wordml" xmlns:w16cex="http://schemas.microsoft.com/office/word/2018/wordml/cex" xmlns:w16cid="http://schemas.microsoft.com/office/word/2016/wordml/cid" xmlns:w16="http://schemas.microsoft.com/office/word/2018/wordml" xmlns:w16du="http://schemas.microsoft.com/office/word/2023/wordml/word16du" xmlns:w16sdtdh="http://schemas.microsoft.com/office/word/2020/wordml/sdtdatahash" xmlns:w16sdtfl="http://schemas.microsoft.com/office/word/2024/wordml/sdtformatlock" xmlns:w16se="http://schemas.microsoft.com/office/word/2015/wordml/symex" xmlns:wpg="http://schemas.microsoft.com/office/word/2010/wordprocessingGroup" xmlns:wpi="http://schemas.microsoft.com/office/word/2010/wordprocessingInk" xmlns:wne="http://schemas.microsoft.com/office/word/2006/wordml" xmlns:wps="http://schemas.microsoft.com/office/word/2010/wordprocessingShape" mc:Ignorable="w14 w15 w16se w16cid w16 w16cex w16sdtdh w16sdtfl w16du wp14">
   <w:abstractNum w:abstractNumId="0" w15:restartNumberingAfterBreak="0">
-    <w:nsid w:val="32941423"/>
+    <w:nsid w:val="27B03C36"/>
     <w:multiLevelType w:val="hybridMultilevel"/>
-    <w:tmpl w:val="4D82D7D8"/>
-    <w:lvl w:ilvl="0" w:tplc="151E808E">
+    <w:tmpl w:val="58AC1108"/>
+    <w:lvl w:ilvl="0" w:tplc="E1B2045C">
       <w:start w:val="1"/>
       <w:numFmt w:val="decimal"/>
       <w:lvlText w:val="%1."/>
@@ -3821,52 +3889,138 @@
         <w:ind w:left="720" w:hanging="360"/>
       </w:pPr>
     </w:lvl>
-    <w:lvl w:ilvl="1" w:tplc="57582F0E">
+    <w:lvl w:ilvl="1" w:tplc="892E164C">
       <w:numFmt w:val="decimal"/>
       <w:lvlText w:val=""/>
       <w:lvlJc w:val="left"/>
     </w:lvl>
-    <w:lvl w:ilvl="2" w:tplc="BCCA437A">
+    <w:lvl w:ilvl="2" w:tplc="DEE81DCC">
       <w:numFmt w:val="decimal"/>
       <w:lvlText w:val=""/>
       <w:lvlJc w:val="left"/>
     </w:lvl>
-    <w:lvl w:ilvl="3" w:tplc="EECCC604">
+    <w:lvl w:ilvl="3" w:tplc="5E5AF89A">
       <w:numFmt w:val="decimal"/>
       <w:lvlText w:val=""/>
       <w:lvlJc w:val="left"/>
     </w:lvl>
-    <w:lvl w:ilvl="4" w:tplc="15C8EE94">
+    <w:lvl w:ilvl="4" w:tplc="EA12694A">
       <w:numFmt w:val="decimal"/>
       <w:lvlText w:val=""/>
       <w:lvlJc w:val="left"/>
     </w:lvl>
-    <w:lvl w:ilvl="5" w:tplc="4D46ECFA">
+    <w:lvl w:ilvl="5" w:tplc="CEC637D0">
       <w:numFmt w:val="decimal"/>
       <w:lvlText w:val=""/>
       <w:lvlJc w:val="left"/>
     </w:lvl>
-    <w:lvl w:ilvl="6" w:tplc="EFFAE6AA">
+    <w:lvl w:ilvl="6" w:tplc="9D402F00">
       <w:numFmt w:val="decimal"/>
       <w:lvlText w:val=""/>
       <w:lvlJc w:val="left"/>
     </w:lvl>
-    <w:lvl w:ilvl="7" w:tplc="95C8A1E8">
+    <w:lvl w:ilvl="7" w:tplc="614AEF9C">
       <w:numFmt w:val="decimal"/>
       <w:lvlText w:val=""/>
       <w:lvlJc w:val="left"/>
     </w:lvl>
-    <w:lvl w:ilvl="8" w:tplc="BD7CCFD4">
+    <w:lvl w:ilvl="8" w:tplc="FB28D46C">
       <w:numFmt w:val="decimal"/>
       <w:lvlText w:val=""/>
       <w:lvlJc w:val="left"/>
     </w:lvl>
   </w:abstractNum>
   <w:abstractNum w:abstractNumId="1" w15:restartNumberingAfterBreak="0">
-    <w:nsid w:val="50CC7A73"/>
+    <w:nsid w:val="7BC57DCD"/>
     <w:multiLevelType w:val="hybridMultilevel"/>
-    <w:tmpl w:val="DAEE7E98"/>
-    <w:lvl w:ilvl="0" w:tplc="173EE80C">
+    <w:tmpl w:val="06AC62F0"/>
+    <w:lvl w:ilvl="0" w:tplc="01020322">
+      <w:start w:val="1"/>
+      <w:numFmt w:val="bullet"/>
+      <w:lvlText w:val="●"/>
+      <w:lvlJc w:val="left"/>
+      <w:pPr>
+        <w:ind w:left="720" w:hanging="360"/>
+      </w:pPr>
+    </w:lvl>
+    <w:lvl w:ilvl="1" w:tplc="8EE462EE">
+      <w:start w:val="1"/>
+      <w:numFmt w:val="bullet"/>
+      <w:lvlText w:val="○"/>
+      <w:lvlJc w:val="left"/>
+      <w:pPr>
+        <w:ind w:left="1440" w:hanging="360"/>
+      </w:pPr>
+    </w:lvl>
+    <w:lvl w:ilvl="2" w:tplc="AE462412">
+      <w:start w:val="1"/>
+      <w:numFmt w:val="bullet"/>
+      <w:lvlText w:val="■"/>
+      <w:lvlJc w:val="left"/>
+      <w:pPr>
+        <w:ind w:left="2160" w:hanging="360"/>
+      </w:pPr>
+    </w:lvl>
+    <w:lvl w:ilvl="3" w:tplc="31087D12">
+      <w:start w:val="1"/>
+      <w:numFmt w:val="bullet"/>
+      <w:lvlText w:val="●"/>
+      <w:lvlJc w:val="left"/>
+      <w:pPr>
+        <w:ind w:left="2880" w:hanging="360"/>
+      </w:pPr>
+    </w:lvl>
+    <w:lvl w:ilvl="4" w:tplc="9D8EF04C">
+      <w:start w:val="1"/>
+      <w:numFmt w:val="bullet"/>
+      <w:lvlText w:val="○"/>
+      <w:lvlJc w:val="left"/>
+      <w:pPr>
+        <w:ind w:left="3600" w:hanging="360"/>
+      </w:pPr>
+    </w:lvl>
+    <w:lvl w:ilvl="5" w:tplc="15B40BD8">
+      <w:start w:val="1"/>
+      <w:numFmt w:val="bullet"/>
+      <w:lvlText w:val="■"/>
+      <w:lvlJc w:val="left"/>
+      <w:pPr>
+        <w:ind w:left="4320" w:hanging="360"/>
+      </w:pPr>
+    </w:lvl>
+    <w:lvl w:ilvl="6" w:tplc="BB949242">
+      <w:start w:val="1"/>
+      <w:numFmt w:val="bullet"/>
+      <w:lvlText w:val="●"/>
+      <w:lvlJc w:val="left"/>
+      <w:pPr>
+        <w:ind w:left="5040" w:hanging="360"/>
+      </w:pPr>
+    </w:lvl>
+    <w:lvl w:ilvl="7" w:tplc="965CF5A6">
+      <w:start w:val="1"/>
+      <w:numFmt w:val="bullet"/>
+      <w:lvlText w:val="●"/>
+      <w:lvlJc w:val="left"/>
+      <w:pPr>
+        <w:ind w:left="5760" w:hanging="360"/>
+      </w:pPr>
+    </w:lvl>
+    <w:lvl w:ilvl="8" w:tplc="AB28BDE4">
+      <w:start w:val="1"/>
+      <w:numFmt w:val="bullet"/>
+      <w:lvlText w:val="●"/>
+      <w:lvlJc w:val="left"/>
+      <w:pPr>
+        <w:ind w:left="6480" w:hanging="360"/>
+      </w:pPr>
+    </w:lvl>
+  </w:abstractNum>
+  <w:abstractNum w:abstractNumId="2" w15:restartNumberingAfterBreak="0">
+    <w:nsid w:val="7C615891"/>
+    <w:multiLevelType w:val="hybridMultilevel"/>
+    <w:tmpl w:val="EA0EA620"/>
+    <w:lvl w:ilvl="0" w:tplc="999EC970">
       <w:start w:val="1"/>
       <w:numFmt w:val="bullet"/>
       <w:lvlText w:val="•"/>
@@ -3875,146 +4029,60 @@
         <w:ind w:left="720" w:hanging="360"/>
       </w:pPr>
     </w:lvl>
-    <w:lvl w:ilvl="1" w:tplc="CC3C9B88">
+    <w:lvl w:ilvl="1" w:tplc="69B23866">
       <w:numFmt w:val="decimal"/>
       <w:lvlText w:val=""/>
       <w:lvlJc w:val="left"/>
     </w:lvl>
-    <w:lvl w:ilvl="2" w:tplc="3F004058">
+    <w:lvl w:ilvl="2" w:tplc="F4C23960">
       <w:numFmt w:val="decimal"/>
       <w:lvlText w:val=""/>
       <w:lvlJc w:val="left"/>
     </w:lvl>
-    <w:lvl w:ilvl="3" w:tplc="B9B62406">
+    <w:lvl w:ilvl="3" w:tplc="7B283EC6">
       <w:numFmt w:val="decimal"/>
       <w:lvlText w:val=""/>
       <w:lvlJc w:val="left"/>
     </w:lvl>
-    <w:lvl w:ilvl="4" w:tplc="56DE04FA">
+    <w:lvl w:ilvl="4" w:tplc="BED8D9BE">
       <w:numFmt w:val="decimal"/>
       <w:lvlText w:val=""/>
       <w:lvlJc w:val="left"/>
     </w:lvl>
-    <w:lvl w:ilvl="5" w:tplc="4D96D574">
+    <w:lvl w:ilvl="5" w:tplc="0524A0EA">
       <w:numFmt w:val="decimal"/>
       <w:lvlText w:val=""/>
       <w:lvlJc w:val="left"/>
     </w:lvl>
-    <w:lvl w:ilvl="6" w:tplc="580E9A32">
+    <w:lvl w:ilvl="6" w:tplc="A790AAB2">
       <w:numFmt w:val="decimal"/>
       <w:lvlText w:val=""/>
       <w:lvlJc w:val="left"/>
     </w:lvl>
-    <w:lvl w:ilvl="7" w:tplc="1E6EB1B8">
+    <w:lvl w:ilvl="7" w:tplc="D7FC8B5E">
       <w:numFmt w:val="decimal"/>
       <w:lvlText w:val=""/>
       <w:lvlJc w:val="left"/>
     </w:lvl>
-    <w:lvl w:ilvl="8" w:tplc="4F9C982C">
+    <w:lvl w:ilvl="8" w:tplc="09ECE0CA">
       <w:numFmt w:val="decimal"/>
       <w:lvlText w:val=""/>
       <w:lvlJc w:val="left"/>
     </w:lvl>
   </w:abstractNum>
-  <w:abstractNum w:abstractNumId="2" w15:restartNumberingAfterBreak="0">
-    <w:nsid w:val="615B328F"/>
-    <w:multiLevelType w:val="hybridMultilevel"/>
-    <w:tmpl w:val="C41AAEDC"/>
-    <w:lvl w:ilvl="0" w:tplc="9C0871D6">
-      <w:start w:val="1"/>
-      <w:numFmt w:val="bullet"/>
-      <w:lvlText w:val="●"/>
-      <w:lvlJc w:val="left"/>
-      <w:pPr>
-        <w:ind w:left="720" w:hanging="360"/>
-      </w:pPr>
-    </w:lvl>
-    <w:lvl w:ilvl="1" w:tplc="7A5EFD8C">
-      <w:start w:val="1"/>
-      <w:numFmt w:val="bullet"/>
-      <w:lvlText w:val="○"/>
-      <w:lvlJc w:val="left"/>
-      <w:pPr>
-        <w:ind w:left="1440" w:hanging="360"/>
-      </w:pPr>
-    </w:lvl>
-    <w:lvl w:ilvl="2" w:tplc="AAD6630E">
-      <w:start w:val="1"/>
-      <w:numFmt w:val="bullet"/>
-      <w:lvlText w:val="■"/>
-      <w:lvlJc w:val="left"/>
-      <w:pPr>
-        <w:ind w:left="2160" w:hanging="360"/>
-      </w:pPr>
-    </w:lvl>
-    <w:lvl w:ilvl="3" w:tplc="894475B4">
-      <w:start w:val="1"/>
-      <w:numFmt w:val="bullet"/>
-      <w:lvlText w:val="●"/>
-      <w:lvlJc w:val="left"/>
-      <w:pPr>
-        <w:ind w:left="2880" w:hanging="360"/>
-      </w:pPr>
-    </w:lvl>
-    <w:lvl w:ilvl="4" w:tplc="0AFEF2E6">
-      <w:start w:val="1"/>
-      <w:numFmt w:val="bullet"/>
-      <w:lvlText w:val="○"/>
-      <w:lvlJc w:val="left"/>
-      <w:pPr>
-        <w:ind w:left="3600" w:hanging="360"/>
-      </w:pPr>
-    </w:lvl>
-    <w:lvl w:ilvl="5" w:tplc="2360A0D6">
-      <w:start w:val="1"/>
-      <w:numFmt w:val="bullet"/>
-      <w:lvlText w:val="■"/>
-      <w:lvlJc w:val="left"/>
-      <w:pPr>
-        <w:ind w:left="4320" w:hanging="360"/>
-      </w:pPr>
-    </w:lvl>
-    <w:lvl w:ilvl="6" w:tplc="C55E4D0E">
-      <w:start w:val="1"/>
-      <w:numFmt w:val="bullet"/>
-      <w:lvlText w:val="●"/>
-      <w:lvlJc w:val="left"/>
-      <w:pPr>
-        <w:ind w:left="5040" w:hanging="360"/>
-      </w:pPr>
-    </w:lvl>
-    <w:lvl w:ilvl="7" w:tplc="8812AD36">
-      <w:start w:val="1"/>
-      <w:numFmt w:val="bullet"/>
-      <w:lvlText w:val="●"/>
-      <w:lvlJc w:val="left"/>
-      <w:pPr>
-        <w:ind w:left="5760" w:hanging="360"/>
-      </w:pPr>
-    </w:lvl>
-    <w:lvl w:ilvl="8" w:tplc="9550B862">
-      <w:start w:val="1"/>
-      <w:numFmt w:val="bullet"/>
-      <w:lvlText w:val="●"/>
-      <w:lvlJc w:val="left"/>
-      <w:pPr>
-        <w:ind w:left="6480" w:hanging="360"/>
-      </w:pPr>
-    </w:lvl>
-  </w:abstractNum>
-  <w:num w:numId="1" w16cid:durableId="1717705711">
+  <w:num w:numId="1" w16cid:durableId="264534696">
+    <w:abstractNumId w:val="1"/>
+    <w:lvlOverride w:ilvl="0">
+      <w:startOverride w:val="1"/>
+    </w:lvlOverride>
+  </w:num>
+  <w:num w:numId="2" w16cid:durableId="272827045">
     <w:abstractNumId w:val="2"/>
     <w:lvlOverride w:ilvl="0">
       <w:startOverride w:val="1"/>
     </w:lvlOverride>
   </w:num>
-  <w:num w:numId="2" w16cid:durableId="1872523974">
-    <w:abstractNumId w:val="1"/>
-    <w:lvlOverride w:ilvl="0">
-      <w:startOverride w:val="1"/>
-    </w:lvlOverride>
-  </w:num>
-  <w:num w:numId="3" w16cid:durableId="19939788">
+  <w:num w:numId="3" w16cid:durableId="1360206248">
     <w:abstractNumId w:val="0"/>
     <w:lvlOverride w:ilvl="0">
       <w:startOverride w:val="1"/>
@@ -4673,7 +4741,7 @@
     <w:autoRedefine/>
     <w:uiPriority w:val="39"/>
     <w:unhideWhenUsed/>
-    <w:rsid w:val="00F86240"/>
+    <w:rsid w:val="00BE6CEB"/>
     <w:pPr>
       <w:spacing w:after="100"/>
     </w:pPr>

</xml_diff>

<commit_message>
Figur 2 som rigtigt Word-diagram og trin 8 i graf-guiden
- finish_word.ps1 laver Figur 2 som diagram med integreret projektmappe (i stedet for PNG)
- Dansk decimalkomma i diagrammet: Excels indstilling skiftes under kørslen og stilles tilbage
- build_html.py: kommentarer kan pege på en figur via figurteksten ("figur": 2)
- Guiden får trin 8: Sæt grafen ind i Word med "Bevar kildeformatering, og integrer projektmappe"
- excel_chart.ps1 og figur2-graf.png fjernet

Co-Authored-By: Claude Opus 5.5 (1M context) <noreply@anthropic.com>
</commit_message>
<xml_diff>
--- a/journal/Hookes lov - journal.docx
+++ b/journal/Hookes lov - journal.docx
@@ -33,8 +33,13 @@
           <w:bottom w:val="single" w:sz="8" w:space="12" w:color="2F5496"/>
         </w:pBdr>
       </w:pPr>
-      <w:r>
-        <w:t>Hookes lov undersøgt med lodder og en lineal</w:t>
+      <w:proofErr w:type="spellStart"/>
+      <w:r>
+        <w:t>Hookes</w:t>
+      </w:r>
+      <w:proofErr w:type="spellEnd"/>
+      <w:r>
+        <w:t xml:space="preserve"> lov undersøgt med lodder og en lineal</w:t>
       </w:r>
     </w:p>
     <w:p>
@@ -48,7 +53,7 @@
           <w:noProof/>
         </w:rPr>
         <w:drawing>
-          <wp:inline distT="0" distB="0" distL="0" distR="0" wp14:anchorId="18EE334C" wp14:editId="0532B9AA">
+          <wp:inline distT="0" distB="0" distL="0" distR="0" wp14:anchorId="71889BE9" wp14:editId="20D2398D">
             <wp:extent cx="1809750" cy="1876425"/>
             <wp:effectExtent l="0" t="0" r="0" b="0"/>
             <wp:docPr id="1" name="Billede 1"/>
@@ -107,7 +112,7 @@
           <w:left w:w="10" w:type="dxa"/>
           <w:right w:w="10" w:type="dxa"/>
         </w:tblCellMar>
-        <w:tblLook w:val="04A0" w:firstRow="1" w:lastRow="0" w:firstColumn="1" w:lastColumn="0" w:noHBand="0" w:noVBand="1"/>
+        <w:tblLook w:val="0000" w:firstRow="0" w:lastRow="0" w:firstColumn="0" w:lastColumn="0" w:noHBand="0" w:noVBand="0"/>
       </w:tblPr>
       <w:tblGrid>
         <w:gridCol w:w="2600"/>
@@ -382,7 +387,7 @@
     <w:sdt>
       <w:sdtPr>
         <w:alias w:val="Indholdsfortegnelse"/>
-        <w:id w:val="898790614"/>
+        <w:id w:val="-1939363160"/>
       </w:sdtPr>
       <w:sdtEndPr/>
       <w:sdtContent>
@@ -411,7 +416,7 @@
           <w:r>
             <w:fldChar w:fldCharType="separate"/>
           </w:r>
-          <w:hyperlink w:anchor="_Toc241169351" w:history="1">
+          <w:hyperlink w:anchor="_Toc241170179" w:history="1">
             <w:r>
               <w:rPr>
                 <w:rStyle w:val="Hyperlink"/>
@@ -453,7 +458,7 @@
               <w:rPr>
                 <w:noProof/>
               </w:rPr>
-              <w:instrText xml:space="preserve"> PAGEREF _Toc241169351 \h </w:instrText>
+              <w:instrText xml:space="preserve"> PAGEREF _Toc241170179 \h </w:instrText>
             </w:r>
             <w:r>
               <w:rPr>
@@ -496,7 +501,7 @@
               <w14:ligatures w14:val="standardContextual"/>
             </w:rPr>
           </w:pPr>
-          <w:hyperlink w:anchor="_Toc241169352" w:history="1">
+          <w:hyperlink w:anchor="_Toc241170180" w:history="1">
             <w:r>
               <w:rPr>
                 <w:rStyle w:val="Hyperlink"/>
@@ -538,7 +543,7 @@
               <w:rPr>
                 <w:noProof/>
               </w:rPr>
-              <w:instrText xml:space="preserve"> PAGEREF _Toc241169352 \h </w:instrText>
+              <w:instrText xml:space="preserve"> PAGEREF _Toc241170180 \h </w:instrText>
             </w:r>
             <w:r>
               <w:rPr>
@@ -581,7 +586,7 @@
               <w14:ligatures w14:val="standardContextual"/>
             </w:rPr>
           </w:pPr>
-          <w:hyperlink w:anchor="_Toc241169353" w:history="1">
+          <w:hyperlink w:anchor="_Toc241170181" w:history="1">
             <w:r>
               <w:rPr>
                 <w:rStyle w:val="Hyperlink"/>
@@ -623,7 +628,7 @@
               <w:rPr>
                 <w:noProof/>
               </w:rPr>
-              <w:instrText xml:space="preserve"> PAGEREF _Toc241169353 \h </w:instrText>
+              <w:instrText xml:space="preserve"> PAGEREF _Toc241170181 \h </w:instrText>
             </w:r>
             <w:r>
               <w:rPr>
@@ -666,7 +671,7 @@
               <w14:ligatures w14:val="standardContextual"/>
             </w:rPr>
           </w:pPr>
-          <w:hyperlink w:anchor="_Toc241169354" w:history="1">
+          <w:hyperlink w:anchor="_Toc241170182" w:history="1">
             <w:r>
               <w:rPr>
                 <w:rStyle w:val="Hyperlink"/>
@@ -708,7 +713,7 @@
               <w:rPr>
                 <w:noProof/>
               </w:rPr>
-              <w:instrText xml:space="preserve"> PAGEREF _Toc241169354 \h </w:instrText>
+              <w:instrText xml:space="preserve"> PAGEREF _Toc241170182 \h </w:instrText>
             </w:r>
             <w:r>
               <w:rPr>
@@ -751,7 +756,7 @@
               <w14:ligatures w14:val="standardContextual"/>
             </w:rPr>
           </w:pPr>
-          <w:hyperlink w:anchor="_Toc241169355" w:history="1">
+          <w:hyperlink w:anchor="_Toc241170183" w:history="1">
             <w:r>
               <w:rPr>
                 <w:rStyle w:val="Hyperlink"/>
@@ -793,7 +798,7 @@
               <w:rPr>
                 <w:noProof/>
               </w:rPr>
-              <w:instrText xml:space="preserve"> PAGEREF _Toc241169355 \h </w:instrText>
+              <w:instrText xml:space="preserve"> PAGEREF _Toc241170183 \h </w:instrText>
             </w:r>
             <w:r>
               <w:rPr>
@@ -836,7 +841,7 @@
               <w14:ligatures w14:val="standardContextual"/>
             </w:rPr>
           </w:pPr>
-          <w:hyperlink w:anchor="_Toc241169356" w:history="1">
+          <w:hyperlink w:anchor="_Toc241170184" w:history="1">
             <w:r>
               <w:rPr>
                 <w:rStyle w:val="Hyperlink"/>
@@ -878,7 +883,7 @@
               <w:rPr>
                 <w:noProof/>
               </w:rPr>
-              <w:instrText xml:space="preserve"> PAGEREF _Toc241169356 \h </w:instrText>
+              <w:instrText xml:space="preserve"> PAGEREF _Toc241170184 \h </w:instrText>
             </w:r>
             <w:r>
               <w:rPr>
@@ -921,7 +926,7 @@
               <w14:ligatures w14:val="standardContextual"/>
             </w:rPr>
           </w:pPr>
-          <w:hyperlink w:anchor="_Toc241169357" w:history="1">
+          <w:hyperlink w:anchor="_Toc241170185" w:history="1">
             <w:r>
               <w:rPr>
                 <w:rStyle w:val="Hyperlink"/>
@@ -963,7 +968,7 @@
               <w:rPr>
                 <w:noProof/>
               </w:rPr>
-              <w:instrText xml:space="preserve"> PAGEREF _Toc241169357 \h </w:instrText>
+              <w:instrText xml:space="preserve"> PAGEREF _Toc241170185 \h </w:instrText>
             </w:r>
             <w:r>
               <w:rPr>
@@ -1006,7 +1011,7 @@
               <w14:ligatures w14:val="standardContextual"/>
             </w:rPr>
           </w:pPr>
-          <w:hyperlink w:anchor="_Toc241169358" w:history="1">
+          <w:hyperlink w:anchor="_Toc241170186" w:history="1">
             <w:r>
               <w:rPr>
                 <w:rStyle w:val="Hyperlink"/>
@@ -1048,7 +1053,7 @@
               <w:rPr>
                 <w:noProof/>
               </w:rPr>
-              <w:instrText xml:space="preserve"> PAGEREF _Toc241169358 \h </w:instrText>
+              <w:instrText xml:space="preserve"> PAGEREF _Toc241170186 \h </w:instrText>
             </w:r>
             <w:r>
               <w:rPr>
@@ -1089,7 +1094,7 @@
           <w:tab w:val="left" w:pos="567"/>
         </w:tabs>
       </w:pPr>
-      <w:bookmarkStart w:id="0" w:name="_Toc241169351"/>
+      <w:bookmarkStart w:id="0" w:name="_Toc241170179"/>
       <w:r>
         <w:t>1</w:t>
       </w:r>
@@ -1144,7 +1149,7 @@
           <w:tab w:val="left" w:pos="567"/>
         </w:tabs>
       </w:pPr>
-      <w:bookmarkStart w:id="1" w:name="_Toc241169352"/>
+      <w:bookmarkStart w:id="1" w:name="_Toc241170180"/>
       <w:r>
         <w:t>2</w:t>
       </w:r>
@@ -1156,7 +1161,15 @@
     </w:p>
     <w:p>
       <w:r>
-        <w:t>Når man hænger et lod i en fjeder, strækker fjederen sig. Ifølge Hookes lov er kraften fra fjederen proportional med forlængelsen:</w:t>
+        <w:t xml:space="preserve">Når man hænger et lod i en fjeder, strækker fjederen sig. Ifølge </w:t>
+      </w:r>
+      <w:proofErr w:type="spellStart"/>
+      <w:r>
+        <w:t>Hookes</w:t>
+      </w:r>
+      <w:proofErr w:type="spellEnd"/>
+      <w:r>
+        <w:t xml:space="preserve"> lov er kraften fra fjederen proportional med forlængelsen:</w:t>
       </w:r>
     </w:p>
     <w:p>
@@ -1495,7 +1508,7 @@
           <w:tab w:val="left" w:pos="567"/>
         </w:tabs>
       </w:pPr>
-      <w:bookmarkStart w:id="2" w:name="_Toc241169353"/>
+      <w:bookmarkStart w:id="2" w:name="_Toc241170181"/>
       <w:r>
         <w:t>3</w:t>
       </w:r>
@@ -1632,10 +1645,10 @@
           <w:noProof/>
         </w:rPr>
         <w:drawing>
-          <wp:inline distT="0" distB="0" distL="0" distR="0" wp14:anchorId="06095413" wp14:editId="2EEB21EA">
+          <wp:inline distT="0" distB="0" distL="0" distR="0" wp14:anchorId="3BF68C19" wp14:editId="7C69658F">
             <wp:extent cx="2381250" cy="2466975"/>
             <wp:effectExtent l="0" t="0" r="0" b="0"/>
-            <wp:docPr id="803853430" name="Billede 803853430"/>
+            <wp:docPr id="913265714" name="Billede 913265714"/>
             <wp:cNvGraphicFramePr>
               <a:graphicFrameLocks xmlns:a="http://schemas.openxmlformats.org/drawingml/2006/main" noChangeAspect="1"/>
             </wp:cNvGraphicFramePr>
@@ -1698,7 +1711,15 @@
         <w:fldChar w:fldCharType="end"/>
       </w:r>
       <w:r>
-        <w:t>: Opstillingen. Viserens position L aflæses på linealen, og forlængelsen er Δx = L − L₀.</w:t>
+        <w:t xml:space="preserve">: Opstillingen. Viserens position L aflæses på linealen, og forlængelsen er </w:t>
+      </w:r>
+      <w:proofErr w:type="spellStart"/>
+      <w:r>
+        <w:t>Δx</w:t>
+      </w:r>
+      <w:proofErr w:type="spellEnd"/>
+      <w:r>
+        <w:t xml:space="preserve"> = L − L₀.</w:t>
       </w:r>
     </w:p>
     <w:p>
@@ -1708,7 +1729,7 @@
           <w:tab w:val="left" w:pos="567"/>
         </w:tabs>
       </w:pPr>
-      <w:bookmarkStart w:id="3" w:name="_Toc241169354"/>
+      <w:bookmarkStart w:id="3" w:name="_Toc241170182"/>
       <w:r>
         <w:t>4</w:t>
       </w:r>
@@ -1863,7 +1884,7 @@
           <w:tab w:val="left" w:pos="567"/>
         </w:tabs>
       </w:pPr>
-      <w:bookmarkStart w:id="4" w:name="_Toc241169355"/>
+      <w:bookmarkStart w:id="4" w:name="_Toc241170183"/>
       <w:r>
         <w:t>5</w:t>
       </w:r>
@@ -1971,7 +1992,7 @@
           <w:left w:w="10" w:type="dxa"/>
           <w:right w:w="10" w:type="dxa"/>
         </w:tblCellMar>
-        <w:tblLook w:val="04A0" w:firstRow="1" w:lastRow="0" w:firstColumn="1" w:lastColumn="0" w:noHBand="0" w:noVBand="1"/>
+        <w:tblLook w:val="0000" w:firstRow="0" w:lastRow="0" w:firstColumn="0" w:lastColumn="0" w:noHBand="0" w:noVBand="0"/>
       </w:tblPr>
       <w:tblGrid>
         <w:gridCol w:w="2000"/>
@@ -2082,7 +2103,23 @@
                 <w:b/>
                 <w:bCs/>
               </w:rPr>
-              <w:t>Forlængelse Δx / m</w:t>
+              <w:t xml:space="preserve">Forlængelse </w:t>
+            </w:r>
+            <w:proofErr w:type="spellStart"/>
+            <w:r>
+              <w:rPr>
+                <w:b/>
+                <w:bCs/>
+              </w:rPr>
+              <w:t>Δx</w:t>
+            </w:r>
+            <w:proofErr w:type="spellEnd"/>
+            <w:r>
+              <w:rPr>
+                <w:b/>
+                <w:bCs/>
+              </w:rPr>
+              <w:t xml:space="preserve"> / m</w:t>
             </w:r>
           </w:p>
         </w:tc>
@@ -2960,7 +2997,7 @@
           <w:tab w:val="left" w:pos="567"/>
         </w:tabs>
       </w:pPr>
-      <w:bookmarkStart w:id="5" w:name="_Toc241169356"/>
+      <w:bookmarkStart w:id="5" w:name="_Toc241170184"/>
       <w:r>
         <w:lastRenderedPageBreak/>
         <w:t>6</w:t>
@@ -3203,8 +3240,19 @@
             <w:rPr>
               <w:rFonts w:ascii="Cambria Math" w:hAnsi="Cambria Math"/>
             </w:rPr>
-            <m:t xml:space="preserve"> cm</m:t>
+            <m:t xml:space="preserve"> </m:t>
           </m:r>
+          <w:proofErr w:type="spellStart"/>
+          <m:r>
+            <m:rPr>
+              <m:nor/>
+            </m:rPr>
+            <w:rPr>
+              <w:rFonts w:ascii="Cambria Math" w:hAnsi="Cambria Math"/>
+            </w:rPr>
+            <m:t>cm</m:t>
+          </m:r>
+          <w:proofErr w:type="spellEnd"/>
           <m:r>
             <w:rPr>
               <w:rFonts w:ascii="Cambria Math" w:hAnsi="Cambria Math"/>
@@ -3218,8 +3266,19 @@
             <w:rPr>
               <w:rFonts w:ascii="Cambria Math" w:hAnsi="Cambria Math"/>
             </w:rPr>
-            <m:t xml:space="preserve"> cm</m:t>
+            <m:t xml:space="preserve"> </m:t>
           </m:r>
+          <w:proofErr w:type="spellStart"/>
+          <m:r>
+            <m:rPr>
+              <m:nor/>
+            </m:rPr>
+            <w:rPr>
+              <w:rFonts w:ascii="Cambria Math" w:hAnsi="Cambria Math"/>
+            </w:rPr>
+            <m:t>cm</m:t>
+          </m:r>
+          <w:proofErr w:type="spellEnd"/>
           <m:r>
             <w:rPr>
               <w:rFonts w:ascii="Cambria Math" w:hAnsi="Cambria Math"/>
@@ -3279,39 +3338,14 @@
           <w:noProof/>
         </w:rPr>
         <w:drawing>
-          <wp:inline distT="0" distB="0" distL="0" distR="0" wp14:anchorId="0D80CCA7" wp14:editId="2137D074">
-            <wp:extent cx="5143500" cy="3105150"/>
+          <wp:inline distT="0" distB="0" distL="0" distR="0" wp14:anchorId="3D3A5BAA" wp14:editId="0B1156CD">
+            <wp:extent cx="5143500" cy="3111500"/>
             <wp:effectExtent l="0" t="0" r="0" b="0"/>
-            <wp:docPr id="1345877330" name="Billede 1345877330"/>
-            <wp:cNvGraphicFramePr>
-              <a:graphicFrameLocks xmlns:a="http://schemas.openxmlformats.org/drawingml/2006/main" noChangeAspect="1"/>
-            </wp:cNvGraphicFramePr>
+            <wp:docPr id="517436092" name="Diagram 1" descr="Punktdiagram af kraften F som funktion af forlængelsen Δx med lineær tendenslinje: y = 19,95x + 0,0024, R² = 0,9998."/>
+            <wp:cNvGraphicFramePr/>
             <a:graphic xmlns:a="http://schemas.openxmlformats.org/drawingml/2006/main">
-              <a:graphicData uri="http://schemas.openxmlformats.org/drawingml/2006/picture">
-                <pic:pic xmlns:pic="http://schemas.openxmlformats.org/drawingml/2006/picture">
-                  <pic:nvPicPr>
-                    <pic:cNvPr id="0" name=""/>
-                    <pic:cNvPicPr>
-                      <a:picLocks noChangeAspect="1" noChangeArrowheads="1"/>
-                    </pic:cNvPicPr>
-                  </pic:nvPicPr>
-                  <pic:blipFill>
-                    <a:blip r:embed="rId8"/>
-                    <a:srcRect/>
-                    <a:stretch>
-                      <a:fillRect/>
-                    </a:stretch>
-                  </pic:blipFill>
-                  <pic:spPr bwMode="auto">
-                    <a:xfrm>
-                      <a:off x="0" y="0"/>
-                      <a:ext cx="5143500" cy="3105150"/>
-                    </a:xfrm>
-                    <a:prstGeom prst="rect">
-                      <a:avLst/>
-                    </a:prstGeom>
-                  </pic:spPr>
-                </pic:pic>
+              <a:graphicData uri="http://schemas.openxmlformats.org/drawingml/2006/chart">
+                <c:chart xmlns:c="http://schemas.openxmlformats.org/drawingml/2006/chart" xmlns:r="http://schemas.openxmlformats.org/officeDocument/2006/relationships" r:id="rId8"/>
               </a:graphicData>
             </a:graphic>
           </wp:inline>
@@ -3345,7 +3379,15 @@
         <w:fldChar w:fldCharType="end"/>
       </w:r>
       <w:r>
-        <w:t>: Kraften F som funktion af forlængelsen Δx. Punkterne er målinger, og den stiplede linje er den lineære tendenslinje.</w:t>
+        <w:t xml:space="preserve">: Kraften F som funktion af forlængelsen </w:t>
+      </w:r>
+      <w:proofErr w:type="spellStart"/>
+      <w:r>
+        <w:t>Δx</w:t>
+      </w:r>
+      <w:proofErr w:type="spellEnd"/>
+      <w:r>
+        <w:t>. Punkterne er målinger, og den stiplede linje er den lineære tendenslinje.</w:t>
       </w:r>
     </w:p>
     <w:p>
@@ -3432,7 +3474,7 @@
           <w:tab w:val="left" w:pos="567"/>
         </w:tabs>
       </w:pPr>
-      <w:bookmarkStart w:id="6" w:name="_Toc241169357"/>
+      <w:bookmarkStart w:id="6" w:name="_Toc241170185"/>
       <w:r>
         <w:t>7</w:t>
       </w:r>
@@ -3580,7 +3622,7 @@
           <w:tab w:val="left" w:pos="567"/>
         </w:tabs>
       </w:pPr>
-      <w:bookmarkStart w:id="7" w:name="_Toc241169358"/>
+      <w:bookmarkStart w:id="7" w:name="_Toc241170186"/>
       <w:r>
         <w:t>8</w:t>
       </w:r>
@@ -3862,7 +3904,24 @@
         <w:szCs w:val="18"/>
       </w:rPr>
       <w:tab/>
-      <w:t>Hookes lov – journal</w:t>
+    </w:r>
+    <w:proofErr w:type="spellStart"/>
+    <w:r>
+      <w:rPr>
+        <w:color w:val="7F7F7F"/>
+        <w:sz w:val="18"/>
+        <w:szCs w:val="18"/>
+      </w:rPr>
+      <w:t>Hookes</w:t>
+    </w:r>
+    <w:proofErr w:type="spellEnd"/>
+    <w:r>
+      <w:rPr>
+        <w:color w:val="7F7F7F"/>
+        <w:sz w:val="18"/>
+        <w:szCs w:val="18"/>
+      </w:rPr>
+      <w:t xml:space="preserve"> lov – journal</w:t>
     </w:r>
   </w:p>
 </w:hdr>
@@ -3877,64 +3936,64 @@
 <file path=word/numbering.xml><?xml version="1.0" encoding="utf-8"?>
 <w:numbering xmlns:wpc="http://schemas.microsoft.com/office/word/2010/wordprocessingCanvas" xmlns:cx="http://schemas.microsoft.com/office/drawing/2014/chartex" xmlns:cx1="http://schemas.microsoft.com/office/drawing/2015/9/8/chartex" xmlns:cx2="http://schemas.microsoft.com/office/drawing/2015/10/21/chartex" xmlns:cx3="http://schemas.microsoft.com/office/drawing/2016/5/9/chartex" xmlns:cx4="http://schemas.microsoft.com/office/drawing/2016/5/10/chartex" xmlns:cx5="http://schemas.microsoft.com/office/drawing/2016/5/11/chartex" xmlns:cx6="http://schemas.microsoft.com/office/drawing/2016/5/12/chartex" xmlns:cx7="http://schemas.microsoft.com/office/drawing/2016/5/13/chartex" xmlns:cx8="http://schemas.microsoft.com/office/drawing/2016/5/14/chartex" xmlns:mc="http://schemas.openxmlformats.org/markup-compatibility/2006" xmlns:aink="http://schemas.microsoft.com/office/drawing/2016/ink" xmlns:am3d="http://schemas.microsoft.com/office/drawing/2017/model3d" xmlns:o="urn:schemas-microsoft-com:office:office" xmlns:oel="http://schemas.microsoft.com/office/2019/extlst" xmlns:r="http://schemas.openxmlformats.org/officeDocument/2006/relationships" xmlns:m="http://schemas.openxmlformats.org/officeDocument/2006/math" xmlns:v="urn:schemas-microsoft-com:vml" xmlns:wp14="http://schemas.microsoft.com/office/word/2010/wordprocessingDrawing" xmlns:wp="http://schemas.openxmlformats.org/drawingml/2006/wordprocessingDrawing" xmlns:w10="urn:schemas-microsoft-com:office:word" xmlns:w="http://schemas.openxmlformats.org/wordprocessingml/2006/main" xmlns:w14="http://schemas.microsoft.com/office/word/2010/wordml" xmlns:w15="http://schemas.microsoft.com/office/word/2012/wordml" xmlns:w16cex="http://schemas.microsoft.com/office/word/2018/wordml/cex" xmlns:w16cid="http://schemas.microsoft.com/office/word/2016/wordml/cid" xmlns:w16="http://schemas.microsoft.com/office/word/2018/wordml" xmlns:w16du="http://schemas.microsoft.com/office/word/2023/wordml/word16du" xmlns:w16sdtdh="http://schemas.microsoft.com/office/word/2020/wordml/sdtdatahash" xmlns:w16sdtfl="http://schemas.microsoft.com/office/word/2024/wordml/sdtformatlock" xmlns:w16se="http://schemas.microsoft.com/office/word/2015/wordml/symex" xmlns:wpg="http://schemas.microsoft.com/office/word/2010/wordprocessingGroup" xmlns:wpi="http://schemas.microsoft.com/office/word/2010/wordprocessingInk" xmlns:wne="http://schemas.microsoft.com/office/word/2006/wordml" xmlns:wps="http://schemas.microsoft.com/office/word/2010/wordprocessingShape" mc:Ignorable="w14 w15 w16se w16cid w16 w16cex w16sdtdh w16sdtfl w16du wp14">
   <w:abstractNum w:abstractNumId="0" w15:restartNumberingAfterBreak="0">
-    <w:nsid w:val="27B03C36"/>
+    <w:nsid w:val="11F81BAF"/>
     <w:multiLevelType w:val="hybridMultilevel"/>
-    <w:tmpl w:val="58AC1108"/>
-    <w:lvl w:ilvl="0" w:tplc="E1B2045C">
+    <w:tmpl w:val="750001DC"/>
+    <w:lvl w:ilvl="0" w:tplc="9E640BBA">
       <w:start w:val="1"/>
-      <w:numFmt w:val="decimal"/>
-      <w:lvlText w:val="%1."/>
+      <w:numFmt w:val="bullet"/>
+      <w:lvlText w:val="•"/>
       <w:lvlJc w:val="left"/>
       <w:pPr>
         <w:ind w:left="720" w:hanging="360"/>
       </w:pPr>
     </w:lvl>
-    <w:lvl w:ilvl="1" w:tplc="892E164C">
+    <w:lvl w:ilvl="1" w:tplc="50428662">
       <w:numFmt w:val="decimal"/>
       <w:lvlText w:val=""/>
       <w:lvlJc w:val="left"/>
     </w:lvl>
-    <w:lvl w:ilvl="2" w:tplc="DEE81DCC">
+    <w:lvl w:ilvl="2" w:tplc="0666DEDE">
       <w:numFmt w:val="decimal"/>
       <w:lvlText w:val=""/>
       <w:lvlJc w:val="left"/>
     </w:lvl>
-    <w:lvl w:ilvl="3" w:tplc="5E5AF89A">
+    <w:lvl w:ilvl="3" w:tplc="6FF0E5CC">
       <w:numFmt w:val="decimal"/>
       <w:lvlText w:val=""/>
       <w:lvlJc w:val="left"/>
     </w:lvl>
-    <w:lvl w:ilvl="4" w:tplc="EA12694A">
+    <w:lvl w:ilvl="4" w:tplc="613CA3F6">
       <w:numFmt w:val="decimal"/>
       <w:lvlText w:val=""/>
       <w:lvlJc w:val="left"/>
     </w:lvl>
-    <w:lvl w:ilvl="5" w:tplc="CEC637D0">
+    <w:lvl w:ilvl="5" w:tplc="810C41A0">
       <w:numFmt w:val="decimal"/>
       <w:lvlText w:val=""/>
       <w:lvlJc w:val="left"/>
     </w:lvl>
-    <w:lvl w:ilvl="6" w:tplc="9D402F00">
+    <w:lvl w:ilvl="6" w:tplc="2B4C8E48">
       <w:numFmt w:val="decimal"/>
       <w:lvlText w:val=""/>
       <w:lvlJc w:val="left"/>
     </w:lvl>
-    <w:lvl w:ilvl="7" w:tplc="614AEF9C">
+    <w:lvl w:ilvl="7" w:tplc="FE107794">
       <w:numFmt w:val="decimal"/>
       <w:lvlText w:val=""/>
       <w:lvlJc w:val="left"/>
     </w:lvl>
-    <w:lvl w:ilvl="8" w:tplc="FB28D46C">
+    <w:lvl w:ilvl="8" w:tplc="F10CE58A">
       <w:numFmt w:val="decimal"/>
       <w:lvlText w:val=""/>
       <w:lvlJc w:val="left"/>
     </w:lvl>
   </w:abstractNum>
   <w:abstractNum w:abstractNumId="1" w15:restartNumberingAfterBreak="0">
-    <w:nsid w:val="7BC57DCD"/>
+    <w:nsid w:val="1D58613C"/>
     <w:multiLevelType w:val="hybridMultilevel"/>
-    <w:tmpl w:val="06AC62F0"/>
-    <w:lvl w:ilvl="0" w:tplc="01020322">
+    <w:tmpl w:val="E81C16D0"/>
+    <w:lvl w:ilvl="0" w:tplc="80FCCA2C">
       <w:start w:val="1"/>
       <w:numFmt w:val="bullet"/>
       <w:lvlText w:val="●"/>
@@ -3943,7 +4002,7 @@
         <w:ind w:left="720" w:hanging="360"/>
       </w:pPr>
     </w:lvl>
-    <w:lvl w:ilvl="1" w:tplc="8EE462EE">
+    <w:lvl w:ilvl="1" w:tplc="9DE4B194">
       <w:start w:val="1"/>
       <w:numFmt w:val="bullet"/>
       <w:lvlText w:val="○"/>
@@ -3952,7 +4011,7 @@
         <w:ind w:left="1440" w:hanging="360"/>
       </w:pPr>
     </w:lvl>
-    <w:lvl w:ilvl="2" w:tplc="AE462412">
+    <w:lvl w:ilvl="2" w:tplc="F4E6B98E">
       <w:start w:val="1"/>
       <w:numFmt w:val="bullet"/>
       <w:lvlText w:val="■"/>
@@ -3961,7 +4020,7 @@
         <w:ind w:left="2160" w:hanging="360"/>
       </w:pPr>
     </w:lvl>
-    <w:lvl w:ilvl="3" w:tplc="31087D12">
+    <w:lvl w:ilvl="3" w:tplc="F0B278EE">
       <w:start w:val="1"/>
       <w:numFmt w:val="bullet"/>
       <w:lvlText w:val="●"/>
@@ -3970,7 +4029,7 @@
         <w:ind w:left="2880" w:hanging="360"/>
       </w:pPr>
     </w:lvl>
-    <w:lvl w:ilvl="4" w:tplc="9D8EF04C">
+    <w:lvl w:ilvl="4" w:tplc="CC28C504">
       <w:start w:val="1"/>
       <w:numFmt w:val="bullet"/>
       <w:lvlText w:val="○"/>
@@ -3979,7 +4038,7 @@
         <w:ind w:left="3600" w:hanging="360"/>
       </w:pPr>
     </w:lvl>
-    <w:lvl w:ilvl="5" w:tplc="15B40BD8">
+    <w:lvl w:ilvl="5" w:tplc="C7B874FA">
       <w:start w:val="1"/>
       <w:numFmt w:val="bullet"/>
       <w:lvlText w:val="■"/>
@@ -3988,7 +4047,7 @@
         <w:ind w:left="4320" w:hanging="360"/>
       </w:pPr>
     </w:lvl>
-    <w:lvl w:ilvl="6" w:tplc="BB949242">
+    <w:lvl w:ilvl="6" w:tplc="16E01636">
       <w:start w:val="1"/>
       <w:numFmt w:val="bullet"/>
       <w:lvlText w:val="●"/>
@@ -3997,7 +4056,7 @@
         <w:ind w:left="5040" w:hanging="360"/>
       </w:pPr>
     </w:lvl>
-    <w:lvl w:ilvl="7" w:tplc="965CF5A6">
+    <w:lvl w:ilvl="7" w:tplc="5DB8B06C">
       <w:start w:val="1"/>
       <w:numFmt w:val="bullet"/>
       <w:lvlText w:val="●"/>
@@ -4006,7 +4065,7 @@
         <w:ind w:left="5760" w:hanging="360"/>
       </w:pPr>
     </w:lvl>
-    <w:lvl w:ilvl="8" w:tplc="AB28BDE4">
+    <w:lvl w:ilvl="8" w:tplc="A0D22912">
       <w:start w:val="1"/>
       <w:numFmt w:val="bullet"/>
       <w:lvlText w:val="●"/>
@@ -4017,73 +4076,73 @@
     </w:lvl>
   </w:abstractNum>
   <w:abstractNum w:abstractNumId="2" w15:restartNumberingAfterBreak="0">
-    <w:nsid w:val="7C615891"/>
+    <w:nsid w:val="5C5C7A88"/>
     <w:multiLevelType w:val="hybridMultilevel"/>
-    <w:tmpl w:val="EA0EA620"/>
-    <w:lvl w:ilvl="0" w:tplc="999EC970">
+    <w:tmpl w:val="2F145E18"/>
+    <w:lvl w:ilvl="0" w:tplc="363C03A2">
       <w:start w:val="1"/>
-      <w:numFmt w:val="bullet"/>
-      <w:lvlText w:val="•"/>
+      <w:numFmt w:val="decimal"/>
+      <w:lvlText w:val="%1."/>
       <w:lvlJc w:val="left"/>
       <w:pPr>
         <w:ind w:left="720" w:hanging="360"/>
       </w:pPr>
     </w:lvl>
-    <w:lvl w:ilvl="1" w:tplc="69B23866">
+    <w:lvl w:ilvl="1" w:tplc="D5F0101C">
       <w:numFmt w:val="decimal"/>
       <w:lvlText w:val=""/>
       <w:lvlJc w:val="left"/>
     </w:lvl>
-    <w:lvl w:ilvl="2" w:tplc="F4C23960">
+    <w:lvl w:ilvl="2" w:tplc="767C178C">
       <w:numFmt w:val="decimal"/>
       <w:lvlText w:val=""/>
       <w:lvlJc w:val="left"/>
     </w:lvl>
-    <w:lvl w:ilvl="3" w:tplc="7B283EC6">
+    <w:lvl w:ilvl="3" w:tplc="A156E088">
       <w:numFmt w:val="decimal"/>
       <w:lvlText w:val=""/>
       <w:lvlJc w:val="left"/>
     </w:lvl>
-    <w:lvl w:ilvl="4" w:tplc="BED8D9BE">
+    <w:lvl w:ilvl="4" w:tplc="73D67970">
       <w:numFmt w:val="decimal"/>
       <w:lvlText w:val=""/>
       <w:lvlJc w:val="left"/>
     </w:lvl>
-    <w:lvl w:ilvl="5" w:tplc="0524A0EA">
+    <w:lvl w:ilvl="5" w:tplc="184A3012">
       <w:numFmt w:val="decimal"/>
       <w:lvlText w:val=""/>
       <w:lvlJc w:val="left"/>
     </w:lvl>
-    <w:lvl w:ilvl="6" w:tplc="A790AAB2">
+    <w:lvl w:ilvl="6" w:tplc="8BEC407C">
       <w:numFmt w:val="decimal"/>
       <w:lvlText w:val=""/>
       <w:lvlJc w:val="left"/>
     </w:lvl>
-    <w:lvl w:ilvl="7" w:tplc="D7FC8B5E">
+    <w:lvl w:ilvl="7" w:tplc="46CED1F6">
       <w:numFmt w:val="decimal"/>
       <w:lvlText w:val=""/>
       <w:lvlJc w:val="left"/>
     </w:lvl>
-    <w:lvl w:ilvl="8" w:tplc="09ECE0CA">
+    <w:lvl w:ilvl="8" w:tplc="744C0F62">
       <w:numFmt w:val="decimal"/>
       <w:lvlText w:val=""/>
       <w:lvlJc w:val="left"/>
     </w:lvl>
   </w:abstractNum>
-  <w:num w:numId="1" w16cid:durableId="264534696">
+  <w:num w:numId="1" w16cid:durableId="1285694698">
     <w:abstractNumId w:val="1"/>
     <w:lvlOverride w:ilvl="0">
       <w:startOverride w:val="1"/>
     </w:lvlOverride>
   </w:num>
-  <w:num w:numId="2" w16cid:durableId="272827045">
-    <w:abstractNumId w:val="2"/>
+  <w:num w:numId="2" w16cid:durableId="1889679027">
+    <w:abstractNumId w:val="0"/>
     <w:lvlOverride w:ilvl="0">
       <w:startOverride w:val="1"/>
     </w:lvlOverride>
   </w:num>
-  <w:num w:numId="3" w16cid:durableId="1360206248">
-    <w:abstractNumId w:val="0"/>
+  <w:num w:numId="3" w16cid:durableId="721641168">
+    <w:abstractNumId w:val="2"/>
     <w:lvlOverride w:ilvl="0">
       <w:startOverride w:val="1"/>
     </w:lvlOverride>
@@ -4741,12 +4800,1089 @@
     <w:autoRedefine/>
     <w:uiPriority w:val="39"/>
     <w:unhideWhenUsed/>
-    <w:rsid w:val="00BE6CEB"/>
+    <w:rsid w:val="004248D7"/>
     <w:pPr>
       <w:spacing w:after="100"/>
     </w:pPr>
   </w:style>
 </w:styles>
+</file>
+
+<file path=word/charts/chart1.xml><?xml version="1.0" encoding="utf-8"?>
+<c:chartSpace xmlns:c="http://schemas.openxmlformats.org/drawingml/2006/chart" xmlns:a="http://schemas.openxmlformats.org/drawingml/2006/main" xmlns:r="http://schemas.openxmlformats.org/officeDocument/2006/relationships" xmlns:c16r2="http://schemas.microsoft.com/office/drawing/2015/06/chart">
+  <c:date1904 val="0"/>
+  <c:lang val="da-DK"/>
+  <c:roundedCorners val="0"/>
+  <mc:AlternateContent xmlns:mc="http://schemas.openxmlformats.org/markup-compatibility/2006">
+    <mc:Choice xmlns:c14="http://schemas.microsoft.com/office/drawing/2007/8/2/chart" Requires="c14">
+      <c14:style val="102"/>
+    </mc:Choice>
+    <mc:Fallback>
+      <c:style val="2"/>
+    </mc:Fallback>
+  </mc:AlternateContent>
+  <c:chart>
+    <c:autoTitleDeleted val="1"/>
+    <c:plotArea>
+      <c:layout/>
+      <c:scatterChart>
+        <c:scatterStyle val="lineMarker"/>
+        <c:varyColors val="0"/>
+        <c:ser>
+          <c:idx val="0"/>
+          <c:order val="0"/>
+          <c:tx>
+            <c:strRef>
+              <c:f>'Ark1'!$B$1</c:f>
+              <c:strCache>
+                <c:ptCount val="1"/>
+                <c:pt idx="0">
+                  <c:v>F / N</c:v>
+                </c:pt>
+              </c:strCache>
+            </c:strRef>
+          </c:tx>
+          <c:spPr>
+            <a:ln w="38100" cap="rnd">
+              <a:noFill/>
+              <a:round/>
+            </a:ln>
+            <a:effectLst/>
+          </c:spPr>
+          <c:marker>
+            <c:symbol val="circle"/>
+            <c:size val="6"/>
+            <c:spPr>
+              <a:solidFill>
+                <a:srgbClr val="4472C4"/>
+              </a:solidFill>
+              <a:ln w="9525">
+                <a:solidFill>
+                  <a:srgbClr val="4472C4"/>
+                </a:solidFill>
+                <a:prstDash val="solid"/>
+              </a:ln>
+              <a:effectLst/>
+            </c:spPr>
+          </c:marker>
+          <c:trendline>
+            <c:spPr>
+              <a:ln w="15875" cap="rnd">
+                <a:solidFill>
+                  <a:srgbClr val="7F7F7F"/>
+                </a:solidFill>
+                <a:prstDash val="dash"/>
+              </a:ln>
+              <a:effectLst/>
+            </c:spPr>
+            <c:trendlineType val="linear"/>
+            <c:dispRSqr val="1"/>
+            <c:dispEq val="1"/>
+            <c:trendlineLbl>
+              <c:layout>
+                <c:manualLayout>
+                  <c:x val="3.6848449499368133E-3"/>
+                  <c:y val="0.35666816647919009"/>
+                </c:manualLayout>
+              </c:layout>
+              <c:tx>
+                <c:rich>
+                  <a:bodyPr rot="0" spcFirstLastPara="1" vertOverflow="ellipsis" vert="horz" wrap="square" anchor="ctr" anchorCtr="1"/>
+                  <a:lstStyle/>
+                  <a:p>
+                    <a:pPr>
+                      <a:defRPr sz="1000" b="0" i="0" u="none" strike="noStrike" kern="1200" baseline="0">
+                        <a:solidFill>
+                          <a:schemeClr val="tx1">
+                            <a:lumMod val="65000"/>
+                            <a:lumOff val="35000"/>
+                          </a:schemeClr>
+                        </a:solidFill>
+                        <a:latin typeface="+mn-lt"/>
+                        <a:ea typeface="+mn-ea"/>
+                        <a:cs typeface="+mn-cs"/>
+                      </a:defRPr>
+                    </a:pPr>
+                    <a:r>
+                      <a:rPr lang="en-US" sz="1000" baseline="0"/>
+                      <a:t>y = 19,95x + 0,0024</a:t>
+                    </a:r>
+                    <a:br>
+                      <a:rPr lang="en-US" sz="1000" baseline="0"/>
+                    </a:br>
+                    <a:r>
+                      <a:rPr lang="en-US" sz="1000" baseline="0"/>
+                      <a:t>R² = 0,9998</a:t>
+                    </a:r>
+                    <a:endParaRPr lang="en-US" sz="1000"/>
+                  </a:p>
+                </c:rich>
+              </c:tx>
+              <c:numFmt formatCode="General" sourceLinked="0"/>
+              <c:spPr>
+                <a:noFill/>
+                <a:ln>
+                  <a:noFill/>
+                </a:ln>
+                <a:effectLst/>
+              </c:spPr>
+              <c:txPr>
+                <a:bodyPr rot="0" spcFirstLastPara="1" vertOverflow="ellipsis" vert="horz" wrap="square" anchor="ctr" anchorCtr="1"/>
+                <a:lstStyle/>
+                <a:p>
+                  <a:pPr>
+                    <a:defRPr sz="1000" b="0" i="0" u="none" strike="noStrike" kern="1200" baseline="0">
+                      <a:solidFill>
+                        <a:schemeClr val="tx1">
+                          <a:lumMod val="65000"/>
+                          <a:lumOff val="35000"/>
+                        </a:schemeClr>
+                      </a:solidFill>
+                      <a:latin typeface="+mn-lt"/>
+                      <a:ea typeface="+mn-ea"/>
+                      <a:cs typeface="+mn-cs"/>
+                    </a:defRPr>
+                  </a:pPr>
+                  <a:endParaRPr lang="en-US"/>
+                </a:p>
+              </c:txPr>
+            </c:trendlineLbl>
+          </c:trendline>
+          <c:xVal>
+            <c:numRef>
+              <c:f>'Ark1'!$A$2:$A$8</c:f>
+              <c:numCache>
+                <c:formatCode>General</c:formatCode>
+                <c:ptCount val="7"/>
+                <c:pt idx="0">
+                  <c:v>0</c:v>
+                </c:pt>
+                <c:pt idx="1">
+                  <c:v>2.5000000000000001E-2</c:v>
+                </c:pt>
+                <c:pt idx="2">
+                  <c:v>4.8000000000000001E-2</c:v>
+                </c:pt>
+                <c:pt idx="3">
+                  <c:v>7.3999999999999996E-2</c:v>
+                </c:pt>
+                <c:pt idx="4">
+                  <c:v>9.9000000000000005E-2</c:v>
+                </c:pt>
+                <c:pt idx="5">
+                  <c:v>0.122</c:v>
+                </c:pt>
+                <c:pt idx="6">
+                  <c:v>0.14799999999999999</c:v>
+                </c:pt>
+              </c:numCache>
+            </c:numRef>
+          </c:xVal>
+          <c:yVal>
+            <c:numRef>
+              <c:f>'Ark1'!$B$2:$B$8</c:f>
+              <c:numCache>
+                <c:formatCode>General</c:formatCode>
+                <c:ptCount val="7"/>
+                <c:pt idx="0">
+                  <c:v>0</c:v>
+                </c:pt>
+                <c:pt idx="1">
+                  <c:v>0.49099999999999999</c:v>
+                </c:pt>
+                <c:pt idx="2">
+                  <c:v>0.98199999999999998</c:v>
+                </c:pt>
+                <c:pt idx="3">
+                  <c:v>1.4730000000000001</c:v>
+                </c:pt>
+                <c:pt idx="4">
+                  <c:v>1.964</c:v>
+                </c:pt>
+                <c:pt idx="5">
+                  <c:v>2.4550000000000001</c:v>
+                </c:pt>
+                <c:pt idx="6">
+                  <c:v>2.9460000000000002</c:v>
+                </c:pt>
+              </c:numCache>
+            </c:numRef>
+          </c:yVal>
+          <c:smooth val="0"/>
+          <c:extLst>
+            <c:ext xmlns:c16="http://schemas.microsoft.com/office/drawing/2014/chart" uri="{C3380CC4-5D6E-409C-BE32-E72D297353CC}">
+              <c16:uniqueId val="{00000000-E50E-4C36-BC65-9D5919BAB223}"/>
+            </c:ext>
+          </c:extLst>
+        </c:ser>
+        <c:dLbls>
+          <c:showLegendKey val="0"/>
+          <c:showVal val="0"/>
+          <c:showCatName val="0"/>
+          <c:showSerName val="0"/>
+          <c:showPercent val="0"/>
+          <c:showBubbleSize val="0"/>
+        </c:dLbls>
+        <c:axId val="2051632047"/>
+        <c:axId val="1834013903"/>
+      </c:scatterChart>
+      <c:valAx>
+        <c:axId val="2051632047"/>
+        <c:scaling>
+          <c:orientation val="minMax"/>
+          <c:max val="0.16"/>
+          <c:min val="0"/>
+        </c:scaling>
+        <c:delete val="0"/>
+        <c:axPos val="b"/>
+        <c:majorGridlines>
+          <c:spPr>
+            <a:ln w="9525" cap="flat" cmpd="sng" algn="ctr">
+              <a:solidFill>
+                <a:schemeClr val="tx1">
+                  <a:lumMod val="15000"/>
+                  <a:lumOff val="85000"/>
+                </a:schemeClr>
+              </a:solidFill>
+              <a:round/>
+            </a:ln>
+            <a:effectLst/>
+          </c:spPr>
+        </c:majorGridlines>
+        <c:title>
+          <c:tx>
+            <c:rich>
+              <a:bodyPr rot="0" spcFirstLastPara="1" vertOverflow="ellipsis" vert="horz" wrap="square" anchor="ctr" anchorCtr="1"/>
+              <a:lstStyle/>
+              <a:p>
+                <a:pPr>
+                  <a:defRPr sz="1000" b="0" i="0" u="none" strike="noStrike" kern="1200" baseline="0">
+                    <a:solidFill>
+                      <a:schemeClr val="tx1">
+                        <a:lumMod val="65000"/>
+                        <a:lumOff val="35000"/>
+                      </a:schemeClr>
+                    </a:solidFill>
+                    <a:latin typeface="+mn-lt"/>
+                    <a:ea typeface="+mn-ea"/>
+                    <a:cs typeface="+mn-cs"/>
+                  </a:defRPr>
+                </a:pPr>
+                <a:r>
+                  <a:rPr lang="da-DK"/>
+                  <a:t>Forlængelse </a:t>
+                </a:r>
+                <a:r>
+                  <a:rPr lang="el-GR"/>
+                  <a:t>Δ</a:t>
+                </a:r>
+                <a:r>
+                  <a:rPr lang="da-DK"/>
+                  <a:t>x / m</a:t>
+                </a:r>
+              </a:p>
+            </c:rich>
+          </c:tx>
+          <c:overlay val="0"/>
+          <c:spPr>
+            <a:noFill/>
+            <a:ln>
+              <a:noFill/>
+            </a:ln>
+            <a:effectLst/>
+          </c:spPr>
+          <c:txPr>
+            <a:bodyPr rot="0" spcFirstLastPara="1" vertOverflow="ellipsis" vert="horz" wrap="square" anchor="ctr" anchorCtr="1"/>
+            <a:lstStyle/>
+            <a:p>
+              <a:pPr>
+                <a:defRPr sz="1000" b="0" i="0" u="none" strike="noStrike" kern="1200" baseline="0">
+                  <a:solidFill>
+                    <a:schemeClr val="tx1">
+                      <a:lumMod val="65000"/>
+                      <a:lumOff val="35000"/>
+                    </a:schemeClr>
+                  </a:solidFill>
+                  <a:latin typeface="+mn-lt"/>
+                  <a:ea typeface="+mn-ea"/>
+                  <a:cs typeface="+mn-cs"/>
+                </a:defRPr>
+              </a:pPr>
+              <a:endParaRPr lang="da-DK"/>
+            </a:p>
+          </c:txPr>
+        </c:title>
+        <c:numFmt formatCode="0.00" sourceLinked="0"/>
+        <c:majorTickMark val="none"/>
+        <c:minorTickMark val="none"/>
+        <c:tickLblPos val="nextTo"/>
+        <c:spPr>
+          <a:noFill/>
+          <a:ln w="9525" cap="flat" cmpd="sng" algn="ctr">
+            <a:solidFill>
+              <a:schemeClr val="tx1">
+                <a:lumMod val="25000"/>
+                <a:lumOff val="75000"/>
+              </a:schemeClr>
+            </a:solidFill>
+            <a:round/>
+          </a:ln>
+          <a:effectLst/>
+        </c:spPr>
+        <c:txPr>
+          <a:bodyPr rot="-60000000" spcFirstLastPara="1" vertOverflow="ellipsis" vert="horz" wrap="square" anchor="ctr" anchorCtr="1"/>
+          <a:lstStyle/>
+          <a:p>
+            <a:pPr>
+              <a:defRPr sz="1000" b="0" i="0" u="none" strike="noStrike" kern="1200" baseline="0">
+                <a:solidFill>
+                  <a:schemeClr val="tx1">
+                    <a:lumMod val="65000"/>
+                    <a:lumOff val="35000"/>
+                  </a:schemeClr>
+                </a:solidFill>
+                <a:latin typeface="+mn-lt"/>
+                <a:ea typeface="+mn-ea"/>
+                <a:cs typeface="+mn-cs"/>
+              </a:defRPr>
+            </a:pPr>
+            <a:endParaRPr lang="da-DK"/>
+          </a:p>
+        </c:txPr>
+        <c:crossAx val="1834013903"/>
+        <c:crosses val="autoZero"/>
+        <c:crossBetween val="midCat"/>
+        <c:majorUnit val="0.02"/>
+      </c:valAx>
+      <c:valAx>
+        <c:axId val="1834013903"/>
+        <c:scaling>
+          <c:orientation val="minMax"/>
+          <c:max val="3.5"/>
+          <c:min val="0"/>
+        </c:scaling>
+        <c:delete val="0"/>
+        <c:axPos val="l"/>
+        <c:majorGridlines>
+          <c:spPr>
+            <a:ln w="9525" cap="flat" cmpd="sng" algn="ctr">
+              <a:solidFill>
+                <a:srgbClr val="E0E0E0"/>
+              </a:solidFill>
+              <a:round/>
+            </a:ln>
+            <a:effectLst/>
+          </c:spPr>
+        </c:majorGridlines>
+        <c:title>
+          <c:tx>
+            <c:rich>
+              <a:bodyPr rot="-5400000" spcFirstLastPara="1" vertOverflow="ellipsis" vert="horz" wrap="square" anchor="ctr" anchorCtr="1"/>
+              <a:lstStyle/>
+              <a:p>
+                <a:pPr>
+                  <a:defRPr sz="1000" b="0" i="0" u="none" strike="noStrike" kern="1200" baseline="0">
+                    <a:solidFill>
+                      <a:schemeClr val="tx1">
+                        <a:lumMod val="65000"/>
+                        <a:lumOff val="35000"/>
+                      </a:schemeClr>
+                    </a:solidFill>
+                    <a:latin typeface="+mn-lt"/>
+                    <a:ea typeface="+mn-ea"/>
+                    <a:cs typeface="+mn-cs"/>
+                  </a:defRPr>
+                </a:pPr>
+                <a:r>
+                  <a:rPr lang="da-DK"/>
+                  <a:t>Kraft F / N</a:t>
+                </a:r>
+              </a:p>
+            </c:rich>
+          </c:tx>
+          <c:overlay val="0"/>
+          <c:spPr>
+            <a:noFill/>
+            <a:ln>
+              <a:noFill/>
+            </a:ln>
+            <a:effectLst/>
+          </c:spPr>
+          <c:txPr>
+            <a:bodyPr rot="-5400000" spcFirstLastPara="1" vertOverflow="ellipsis" vert="horz" wrap="square" anchor="ctr" anchorCtr="1"/>
+            <a:lstStyle/>
+            <a:p>
+              <a:pPr>
+                <a:defRPr sz="1000" b="0" i="0" u="none" strike="noStrike" kern="1200" baseline="0">
+                  <a:solidFill>
+                    <a:schemeClr val="tx1">
+                      <a:lumMod val="65000"/>
+                      <a:lumOff val="35000"/>
+                    </a:schemeClr>
+                  </a:solidFill>
+                  <a:latin typeface="+mn-lt"/>
+                  <a:ea typeface="+mn-ea"/>
+                  <a:cs typeface="+mn-cs"/>
+                </a:defRPr>
+              </a:pPr>
+              <a:endParaRPr lang="da-DK"/>
+            </a:p>
+          </c:txPr>
+        </c:title>
+        <c:numFmt formatCode="0.0" sourceLinked="0"/>
+        <c:majorTickMark val="none"/>
+        <c:minorTickMark val="none"/>
+        <c:tickLblPos val="nextTo"/>
+        <c:spPr>
+          <a:noFill/>
+          <a:ln w="9525" cap="flat" cmpd="sng" algn="ctr">
+            <a:solidFill>
+              <a:schemeClr val="tx1">
+                <a:lumMod val="25000"/>
+                <a:lumOff val="75000"/>
+              </a:schemeClr>
+            </a:solidFill>
+            <a:round/>
+          </a:ln>
+          <a:effectLst/>
+        </c:spPr>
+        <c:txPr>
+          <a:bodyPr rot="-60000000" spcFirstLastPara="1" vertOverflow="ellipsis" vert="horz" wrap="square" anchor="ctr" anchorCtr="1"/>
+          <a:lstStyle/>
+          <a:p>
+            <a:pPr>
+              <a:defRPr sz="1000" b="0" i="0" u="none" strike="noStrike" kern="1200" baseline="0">
+                <a:solidFill>
+                  <a:schemeClr val="tx1">
+                    <a:lumMod val="65000"/>
+                    <a:lumOff val="35000"/>
+                  </a:schemeClr>
+                </a:solidFill>
+                <a:latin typeface="+mn-lt"/>
+                <a:ea typeface="+mn-ea"/>
+                <a:cs typeface="+mn-cs"/>
+              </a:defRPr>
+            </a:pPr>
+            <a:endParaRPr lang="da-DK"/>
+          </a:p>
+        </c:txPr>
+        <c:crossAx val="2051632047"/>
+        <c:crosses val="autoZero"/>
+        <c:crossBetween val="midCat"/>
+        <c:majorUnit val="0.5"/>
+      </c:valAx>
+      <c:spPr>
+        <a:noFill/>
+        <a:ln>
+          <a:noFill/>
+        </a:ln>
+        <a:effectLst/>
+      </c:spPr>
+    </c:plotArea>
+    <c:plotVisOnly val="1"/>
+    <c:dispBlanksAs val="gap"/>
+    <c:showDLblsOverMax val="0"/>
+    <c:extLst>
+      <c:ext xmlns:c16r3="http://schemas.microsoft.com/office/drawing/2017/03/chart" uri="{56B9EC1D-385E-4148-901F-78D8002777C0}">
+        <c16r3:dataDisplayOptions16>
+          <c16r3:dispNaAsBlank val="1"/>
+        </c16r3:dataDisplayOptions16>
+      </c:ext>
+    </c:extLst>
+  </c:chart>
+  <c:spPr>
+    <a:solidFill>
+      <a:srgbClr val="FFFFFF"/>
+    </a:solidFill>
+    <a:ln w="9525" cap="flat" cmpd="sng" algn="ctr">
+      <a:noFill/>
+      <a:round/>
+    </a:ln>
+    <a:effectLst/>
+    <a:extLst>
+      <a:ext uri="{91240B29-F687-4F45-9708-019B960494DF}">
+        <a14:hiddenLine xmlns:a14="http://schemas.microsoft.com/office/drawing/2010/main" w="9525" cap="flat" cmpd="sng" algn="ctr">
+          <a:solidFill>
+            <a:sysClr val="windowText" lastClr="000000">
+              <a:lumMod val="15000"/>
+              <a:lumOff val="85000"/>
+            </a:sysClr>
+          </a:solidFill>
+          <a:round/>
+        </a14:hiddenLine>
+      </a:ext>
+    </a:extLst>
+  </c:spPr>
+  <c:txPr>
+    <a:bodyPr/>
+    <a:lstStyle/>
+    <a:p>
+      <a:pPr>
+        <a:defRPr sz="1000"/>
+      </a:pPr>
+      <a:endParaRPr lang="da-DK"/>
+    </a:p>
+  </c:txPr>
+  <c:externalData r:id="rId3">
+    <c:autoUpdate val="0"/>
+  </c:externalData>
+</c:chartSpace>
+</file>
+
+<file path=word/charts/colors1.xml><?xml version="1.0" encoding="utf-8"?>
+<cs:colorStyle xmlns:cs="http://schemas.microsoft.com/office/drawing/2012/chartStyle" xmlns:a="http://schemas.openxmlformats.org/drawingml/2006/main" meth="cycle" id="10">
+  <a:schemeClr val="accent1"/>
+  <a:schemeClr val="accent2"/>
+  <a:schemeClr val="accent3"/>
+  <a:schemeClr val="accent4"/>
+  <a:schemeClr val="accent5"/>
+  <a:schemeClr val="accent6"/>
+  <cs:variation/>
+  <cs:variation>
+    <a:lumMod val="60000"/>
+  </cs:variation>
+  <cs:variation>
+    <a:lumMod val="80000"/>
+    <a:lumOff val="20000"/>
+  </cs:variation>
+  <cs:variation>
+    <a:lumMod val="80000"/>
+  </cs:variation>
+  <cs:variation>
+    <a:lumMod val="60000"/>
+    <a:lumOff val="40000"/>
+  </cs:variation>
+  <cs:variation>
+    <a:lumMod val="50000"/>
+  </cs:variation>
+  <cs:variation>
+    <a:lumMod val="70000"/>
+    <a:lumOff val="30000"/>
+  </cs:variation>
+  <cs:variation>
+    <a:lumMod val="70000"/>
+  </cs:variation>
+  <cs:variation>
+    <a:lumMod val="50000"/>
+    <a:lumOff val="50000"/>
+  </cs:variation>
+</cs:colorStyle>
+</file>
+
+<file path=word/charts/style1.xml><?xml version="1.0" encoding="utf-8"?>
+<cs:chartStyle xmlns:cs="http://schemas.microsoft.com/office/drawing/2012/chartStyle" xmlns:a="http://schemas.openxmlformats.org/drawingml/2006/main" id="240">
+  <cs:axisTitle>
+    <cs:lnRef idx="0"/>
+    <cs:fillRef idx="0"/>
+    <cs:effectRef idx="0"/>
+    <cs:fontRef idx="minor">
+      <a:schemeClr val="tx1">
+        <a:lumMod val="65000"/>
+        <a:lumOff val="35000"/>
+      </a:schemeClr>
+    </cs:fontRef>
+    <cs:defRPr sz="1000" kern="1200"/>
+  </cs:axisTitle>
+  <cs:categoryAxis>
+    <cs:lnRef idx="0"/>
+    <cs:fillRef idx="0"/>
+    <cs:effectRef idx="0"/>
+    <cs:fontRef idx="minor">
+      <a:schemeClr val="tx1">
+        <a:lumMod val="65000"/>
+        <a:lumOff val="35000"/>
+      </a:schemeClr>
+    </cs:fontRef>
+    <cs:spPr>
+      <a:ln w="9525" cap="flat" cmpd="sng" algn="ctr">
+        <a:solidFill>
+          <a:schemeClr val="tx1">
+            <a:lumMod val="25000"/>
+            <a:lumOff val="75000"/>
+          </a:schemeClr>
+        </a:solidFill>
+        <a:round/>
+      </a:ln>
+    </cs:spPr>
+    <cs:defRPr sz="900" kern="1200"/>
+  </cs:categoryAxis>
+  <cs:chartArea mods="allowNoFillOverride allowNoLineOverride">
+    <cs:lnRef idx="0"/>
+    <cs:fillRef idx="0"/>
+    <cs:effectRef idx="0"/>
+    <cs:fontRef idx="minor">
+      <a:schemeClr val="tx1"/>
+    </cs:fontRef>
+    <cs:spPr>
+      <a:solidFill>
+        <a:schemeClr val="bg1"/>
+      </a:solidFill>
+      <a:ln w="9525" cap="flat" cmpd="sng" algn="ctr">
+        <a:solidFill>
+          <a:schemeClr val="tx1">
+            <a:lumMod val="15000"/>
+            <a:lumOff val="85000"/>
+          </a:schemeClr>
+        </a:solidFill>
+        <a:round/>
+      </a:ln>
+    </cs:spPr>
+    <cs:defRPr sz="1000" kern="1200"/>
+  </cs:chartArea>
+  <cs:dataLabel>
+    <cs:lnRef idx="0"/>
+    <cs:fillRef idx="0"/>
+    <cs:effectRef idx="0"/>
+    <cs:fontRef idx="minor">
+      <a:schemeClr val="tx1">
+        <a:lumMod val="75000"/>
+        <a:lumOff val="25000"/>
+      </a:schemeClr>
+    </cs:fontRef>
+    <cs:defRPr sz="900" kern="1200"/>
+  </cs:dataLabel>
+  <cs:dataLabelCallout>
+    <cs:lnRef idx="0"/>
+    <cs:fillRef idx="0"/>
+    <cs:effectRef idx="0"/>
+    <cs:fontRef idx="minor">
+      <a:schemeClr val="dk1">
+        <a:lumMod val="65000"/>
+        <a:lumOff val="35000"/>
+      </a:schemeClr>
+    </cs:fontRef>
+    <cs:spPr>
+      <a:solidFill>
+        <a:schemeClr val="lt1"/>
+      </a:solidFill>
+      <a:ln>
+        <a:solidFill>
+          <a:schemeClr val="dk1">
+            <a:lumMod val="25000"/>
+            <a:lumOff val="75000"/>
+          </a:schemeClr>
+        </a:solidFill>
+      </a:ln>
+    </cs:spPr>
+    <cs:defRPr sz="900" kern="1200"/>
+    <cs:bodyPr rot="0" spcFirstLastPara="1" vertOverflow="clip" horzOverflow="clip" vert="horz" wrap="square" lIns="36576" tIns="18288" rIns="36576" bIns="18288" anchor="ctr" anchorCtr="1">
+      <a:spAutoFit/>
+    </cs:bodyPr>
+  </cs:dataLabelCallout>
+  <cs:dataPoint>
+    <cs:lnRef idx="0"/>
+    <cs:fillRef idx="1">
+      <cs:styleClr val="auto"/>
+    </cs:fillRef>
+    <cs:effectRef idx="0"/>
+    <cs:fontRef idx="minor">
+      <a:schemeClr val="tx1"/>
+    </cs:fontRef>
+  </cs:dataPoint>
+  <cs:dataPoint3D>
+    <cs:lnRef idx="0"/>
+    <cs:fillRef idx="1">
+      <cs:styleClr val="auto"/>
+    </cs:fillRef>
+    <cs:effectRef idx="0"/>
+    <cs:fontRef idx="minor">
+      <a:schemeClr val="tx1"/>
+    </cs:fontRef>
+  </cs:dataPoint3D>
+  <cs:dataPointLine>
+    <cs:lnRef idx="0">
+      <cs:styleClr val="auto"/>
+    </cs:lnRef>
+    <cs:fillRef idx="1"/>
+    <cs:effectRef idx="0"/>
+    <cs:fontRef idx="minor">
+      <a:schemeClr val="tx1"/>
+    </cs:fontRef>
+    <cs:spPr>
+      <a:ln w="19050" cap="rnd">
+        <a:solidFill>
+          <a:schemeClr val="phClr"/>
+        </a:solidFill>
+        <a:round/>
+      </a:ln>
+    </cs:spPr>
+  </cs:dataPointLine>
+  <cs:dataPointMarker>
+    <cs:lnRef idx="0">
+      <cs:styleClr val="auto"/>
+    </cs:lnRef>
+    <cs:fillRef idx="1">
+      <cs:styleClr val="auto"/>
+    </cs:fillRef>
+    <cs:effectRef idx="0"/>
+    <cs:fontRef idx="minor">
+      <a:schemeClr val="tx1"/>
+    </cs:fontRef>
+    <cs:spPr>
+      <a:ln w="9525">
+        <a:solidFill>
+          <a:schemeClr val="phClr"/>
+        </a:solidFill>
+      </a:ln>
+    </cs:spPr>
+  </cs:dataPointMarker>
+  <cs:dataPointMarkerLayout symbol="circle" size="5"/>
+  <cs:dataPointWireframe>
+    <cs:lnRef idx="0">
+      <cs:styleClr val="auto"/>
+    </cs:lnRef>
+    <cs:fillRef idx="0"/>
+    <cs:effectRef idx="0"/>
+    <cs:fontRef idx="minor">
+      <a:schemeClr val="dk1"/>
+    </cs:fontRef>
+    <cs:spPr>
+      <a:ln w="9525" cap="rnd">
+        <a:solidFill>
+          <a:schemeClr val="phClr"/>
+        </a:solidFill>
+        <a:round/>
+      </a:ln>
+    </cs:spPr>
+  </cs:dataPointWireframe>
+  <cs:dataTable>
+    <cs:lnRef idx="0"/>
+    <cs:fillRef idx="0"/>
+    <cs:effectRef idx="0"/>
+    <cs:fontRef idx="minor">
+      <a:schemeClr val="tx1">
+        <a:lumMod val="65000"/>
+        <a:lumOff val="35000"/>
+      </a:schemeClr>
+    </cs:fontRef>
+    <cs:spPr>
+      <a:noFill/>
+      <a:ln w="9525" cap="flat" cmpd="sng" algn="ctr">
+        <a:solidFill>
+          <a:schemeClr val="tx1">
+            <a:lumMod val="15000"/>
+            <a:lumOff val="85000"/>
+          </a:schemeClr>
+        </a:solidFill>
+        <a:round/>
+      </a:ln>
+    </cs:spPr>
+    <cs:defRPr sz="900" kern="1200"/>
+  </cs:dataTable>
+  <cs:downBar>
+    <cs:lnRef idx="0"/>
+    <cs:fillRef idx="0"/>
+    <cs:effectRef idx="0"/>
+    <cs:fontRef idx="minor">
+      <a:schemeClr val="tx1"/>
+    </cs:fontRef>
+    <cs:spPr>
+      <a:solidFill>
+        <a:schemeClr val="dk1">
+          <a:lumMod val="75000"/>
+          <a:lumOff val="25000"/>
+        </a:schemeClr>
+      </a:solidFill>
+      <a:ln w="9525" cap="flat" cmpd="sng" algn="ctr">
+        <a:solidFill>
+          <a:schemeClr val="tx1">
+            <a:lumMod val="65000"/>
+            <a:lumOff val="35000"/>
+          </a:schemeClr>
+        </a:solidFill>
+        <a:round/>
+      </a:ln>
+    </cs:spPr>
+  </cs:downBar>
+  <cs:dropLine>
+    <cs:lnRef idx="0"/>
+    <cs:fillRef idx="0"/>
+    <cs:effectRef idx="0"/>
+    <cs:fontRef idx="minor">
+      <a:schemeClr val="tx1"/>
+    </cs:fontRef>
+    <cs:spPr>
+      <a:ln w="9525" cap="flat" cmpd="sng" algn="ctr">
+        <a:solidFill>
+          <a:schemeClr val="tx1">
+            <a:lumMod val="35000"/>
+            <a:lumOff val="65000"/>
+          </a:schemeClr>
+        </a:solidFill>
+        <a:round/>
+      </a:ln>
+    </cs:spPr>
+  </cs:dropLine>
+  <cs:errorBar>
+    <cs:lnRef idx="0"/>
+    <cs:fillRef idx="0"/>
+    <cs:effectRef idx="0"/>
+    <cs:fontRef idx="minor">
+      <a:schemeClr val="tx1"/>
+    </cs:fontRef>
+    <cs:spPr>
+      <a:ln w="9525" cap="flat" cmpd="sng" algn="ctr">
+        <a:solidFill>
+          <a:schemeClr val="tx1">
+            <a:lumMod val="65000"/>
+            <a:lumOff val="35000"/>
+          </a:schemeClr>
+        </a:solidFill>
+        <a:round/>
+      </a:ln>
+    </cs:spPr>
+  </cs:errorBar>
+  <cs:floor>
+    <cs:lnRef idx="0"/>
+    <cs:fillRef idx="0"/>
+    <cs:effectRef idx="0"/>
+    <cs:fontRef idx="minor">
+      <a:schemeClr val="tx1"/>
+    </cs:fontRef>
+    <cs:spPr>
+      <a:noFill/>
+      <a:ln>
+        <a:noFill/>
+      </a:ln>
+    </cs:spPr>
+  </cs:floor>
+  <cs:gridlineMajor>
+    <cs:lnRef idx="0"/>
+    <cs:fillRef idx="0"/>
+    <cs:effectRef idx="0"/>
+    <cs:fontRef idx="minor">
+      <a:schemeClr val="tx1"/>
+    </cs:fontRef>
+    <cs:spPr>
+      <a:ln w="9525" cap="flat" cmpd="sng" algn="ctr">
+        <a:solidFill>
+          <a:schemeClr val="tx1">
+            <a:lumMod val="15000"/>
+            <a:lumOff val="85000"/>
+          </a:schemeClr>
+        </a:solidFill>
+        <a:round/>
+      </a:ln>
+    </cs:spPr>
+  </cs:gridlineMajor>
+  <cs:gridlineMinor>
+    <cs:lnRef idx="0"/>
+    <cs:fillRef idx="0"/>
+    <cs:effectRef idx="0"/>
+    <cs:fontRef idx="minor">
+      <a:schemeClr val="tx1"/>
+    </cs:fontRef>
+    <cs:spPr>
+      <a:ln w="9525" cap="flat" cmpd="sng" algn="ctr">
+        <a:solidFill>
+          <a:schemeClr val="tx1">
+            <a:lumMod val="5000"/>
+            <a:lumOff val="95000"/>
+          </a:schemeClr>
+        </a:solidFill>
+        <a:round/>
+      </a:ln>
+    </cs:spPr>
+  </cs:gridlineMinor>
+  <cs:hiLoLine>
+    <cs:lnRef idx="0"/>
+    <cs:fillRef idx="0"/>
+    <cs:effectRef idx="0"/>
+    <cs:fontRef idx="minor">
+      <a:schemeClr val="tx1"/>
+    </cs:fontRef>
+    <cs:spPr>
+      <a:ln w="9525" cap="flat" cmpd="sng" algn="ctr">
+        <a:solidFill>
+          <a:schemeClr val="tx1">
+            <a:lumMod val="50000"/>
+            <a:lumOff val="50000"/>
+          </a:schemeClr>
+        </a:solidFill>
+        <a:round/>
+      </a:ln>
+    </cs:spPr>
+  </cs:hiLoLine>
+  <cs:leaderLine>
+    <cs:lnRef idx="0"/>
+    <cs:fillRef idx="0"/>
+    <cs:effectRef idx="0"/>
+    <cs:fontRef idx="minor">
+      <a:schemeClr val="tx1"/>
+    </cs:fontRef>
+    <cs:spPr>
+      <a:ln w="9525" cap="flat" cmpd="sng" algn="ctr">
+        <a:solidFill>
+          <a:schemeClr val="tx1">
+            <a:lumMod val="35000"/>
+            <a:lumOff val="65000"/>
+          </a:schemeClr>
+        </a:solidFill>
+        <a:round/>
+      </a:ln>
+    </cs:spPr>
+  </cs:leaderLine>
+  <cs:legend>
+    <cs:lnRef idx="0"/>
+    <cs:fillRef idx="0"/>
+    <cs:effectRef idx="0"/>
+    <cs:fontRef idx="minor">
+      <a:schemeClr val="tx1">
+        <a:lumMod val="65000"/>
+        <a:lumOff val="35000"/>
+      </a:schemeClr>
+    </cs:fontRef>
+    <cs:defRPr sz="900" kern="1200"/>
+  </cs:legend>
+  <cs:plotArea mods="allowNoFillOverride allowNoLineOverride">
+    <cs:lnRef idx="0"/>
+    <cs:fillRef idx="0"/>
+    <cs:effectRef idx="0"/>
+    <cs:fontRef idx="minor">
+      <a:schemeClr val="tx1"/>
+    </cs:fontRef>
+  </cs:plotArea>
+  <cs:plotArea3D mods="allowNoFillOverride allowNoLineOverride">
+    <cs:lnRef idx="0"/>
+    <cs:fillRef idx="0"/>
+    <cs:effectRef idx="0"/>
+    <cs:fontRef idx="minor">
+      <a:schemeClr val="tx1"/>
+    </cs:fontRef>
+  </cs:plotArea3D>
+  <cs:seriesAxis>
+    <cs:lnRef idx="0"/>
+    <cs:fillRef idx="0"/>
+    <cs:effectRef idx="0"/>
+    <cs:fontRef idx="minor">
+      <a:schemeClr val="tx1">
+        <a:lumMod val="65000"/>
+        <a:lumOff val="35000"/>
+      </a:schemeClr>
+    </cs:fontRef>
+    <cs:defRPr sz="900" kern="1200"/>
+  </cs:seriesAxis>
+  <cs:seriesLine>
+    <cs:lnRef idx="0"/>
+    <cs:fillRef idx="0"/>
+    <cs:effectRef idx="0"/>
+    <cs:fontRef idx="minor">
+      <a:schemeClr val="tx1"/>
+    </cs:fontRef>
+    <cs:spPr>
+      <a:ln w="9525" cap="flat" cmpd="sng" algn="ctr">
+        <a:solidFill>
+          <a:schemeClr val="tx1">
+            <a:lumMod val="35000"/>
+            <a:lumOff val="65000"/>
+          </a:schemeClr>
+        </a:solidFill>
+        <a:round/>
+      </a:ln>
+    </cs:spPr>
+  </cs:seriesLine>
+  <cs:title>
+    <cs:lnRef idx="0"/>
+    <cs:fillRef idx="0"/>
+    <cs:effectRef idx="0"/>
+    <cs:fontRef idx="minor">
+      <a:schemeClr val="tx1">
+        <a:lumMod val="65000"/>
+        <a:lumOff val="35000"/>
+      </a:schemeClr>
+    </cs:fontRef>
+    <cs:defRPr sz="1400" b="0" kern="1200" spc="0" baseline="0"/>
+  </cs:title>
+  <cs:trendline>
+    <cs:lnRef idx="0">
+      <cs:styleClr val="auto"/>
+    </cs:lnRef>
+    <cs:fillRef idx="0"/>
+    <cs:effectRef idx="0"/>
+    <cs:fontRef idx="minor">
+      <a:schemeClr val="tx1"/>
+    </cs:fontRef>
+    <cs:spPr>
+      <a:ln w="19050" cap="rnd">
+        <a:solidFill>
+          <a:schemeClr val="phClr"/>
+        </a:solidFill>
+        <a:prstDash val="sysDot"/>
+      </a:ln>
+    </cs:spPr>
+  </cs:trendline>
+  <cs:trendlineLabel>
+    <cs:lnRef idx="0"/>
+    <cs:fillRef idx="0"/>
+    <cs:effectRef idx="0"/>
+    <cs:fontRef idx="minor">
+      <a:schemeClr val="tx1">
+        <a:lumMod val="65000"/>
+        <a:lumOff val="35000"/>
+      </a:schemeClr>
+    </cs:fontRef>
+    <cs:defRPr sz="900" kern="1200"/>
+  </cs:trendlineLabel>
+  <cs:upBar>
+    <cs:lnRef idx="0"/>
+    <cs:fillRef idx="0"/>
+    <cs:effectRef idx="0"/>
+    <cs:fontRef idx="minor">
+      <a:schemeClr val="tx1"/>
+    </cs:fontRef>
+    <cs:spPr>
+      <a:solidFill>
+        <a:schemeClr val="lt1"/>
+      </a:solidFill>
+      <a:ln w="9525" cap="flat" cmpd="sng" algn="ctr">
+        <a:solidFill>
+          <a:schemeClr val="tx1">
+            <a:lumMod val="65000"/>
+            <a:lumOff val="35000"/>
+          </a:schemeClr>
+        </a:solidFill>
+        <a:round/>
+      </a:ln>
+    </cs:spPr>
+  </cs:upBar>
+  <cs:valueAxis>
+    <cs:lnRef idx="0"/>
+    <cs:fillRef idx="0"/>
+    <cs:effectRef idx="0"/>
+    <cs:fontRef idx="minor">
+      <a:schemeClr val="tx1">
+        <a:lumMod val="65000"/>
+        <a:lumOff val="35000"/>
+      </a:schemeClr>
+    </cs:fontRef>
+    <cs:spPr>
+      <a:ln w="9525" cap="flat" cmpd="sng" algn="ctr">
+        <a:solidFill>
+          <a:schemeClr val="tx1">
+            <a:lumMod val="25000"/>
+            <a:lumOff val="75000"/>
+          </a:schemeClr>
+        </a:solidFill>
+        <a:round/>
+      </a:ln>
+    </cs:spPr>
+    <cs:defRPr sz="900" kern="1200"/>
+  </cs:valueAxis>
+  <cs:wall>
+    <cs:lnRef idx="0"/>
+    <cs:fillRef idx="0"/>
+    <cs:effectRef idx="0"/>
+    <cs:fontRef idx="minor">
+      <a:schemeClr val="tx1"/>
+    </cs:fontRef>
+    <cs:spPr>
+      <a:noFill/>
+      <a:ln>
+        <a:noFill/>
+      </a:ln>
+    </cs:spPr>
+  </cs:wall>
+</cs:chartStyle>
 </file>
 
 <file path=word/theme/theme1.xml><?xml version="1.0" encoding="utf-8"?>

</xml_diff>

<commit_message>
Guide: Tabel med tabeltekst, og journalens tabel laves som i guiden
- Ny Word-guide med rigtige skærmbilleder: indsæt fra Excel, fanen Tabeldesign,
  Gittertabel 1 - lys - farve 1, skygge i overskriften, tilpas bredde, centrering og tabeltekst
- Brede skærmbilleder vises i fuld bredde (.step.wide)
- Journalens datatabel formateres i finish_word.ps1 på samme måde som i guiden
- Tabelkommentaren i journalen linker til guiden
- Skærmbillede til den kommende Excel-guide om formler gemt (formler-decimaler.png)

Co-Authored-By: Claude Opus 5.5 (1M context) <noreply@anthropic.com>
</commit_message>
<xml_diff>
--- a/journal/Hookes lov - journal.docx
+++ b/journal/Hookes lov - journal.docx
@@ -53,7 +53,7 @@
           <w:noProof/>
         </w:rPr>
         <w:drawing>
-          <wp:inline distT="0" distB="0" distL="0" distR="0" wp14:anchorId="71889BE9" wp14:editId="20D2398D">
+          <wp:inline distT="0" distB="0" distL="0" distR="0" wp14:anchorId="01B6F76D" wp14:editId="633EBB9B">
             <wp:extent cx="1809750" cy="1876425"/>
             <wp:effectExtent l="0" t="0" r="0" b="0"/>
             <wp:docPr id="1" name="Billede 1"/>
@@ -112,7 +112,7 @@
           <w:left w:w="10" w:type="dxa"/>
           <w:right w:w="10" w:type="dxa"/>
         </w:tblCellMar>
-        <w:tblLook w:val="0000" w:firstRow="0" w:lastRow="0" w:firstColumn="0" w:lastColumn="0" w:noHBand="0" w:noVBand="0"/>
+        <w:tblLook w:val="04A0" w:firstRow="1" w:lastRow="0" w:firstColumn="1" w:lastColumn="0" w:noHBand="0" w:noVBand="1"/>
       </w:tblPr>
       <w:tblGrid>
         <w:gridCol w:w="2600"/>
@@ -387,7 +387,7 @@
     <w:sdt>
       <w:sdtPr>
         <w:alias w:val="Indholdsfortegnelse"/>
-        <w:id w:val="-1939363160"/>
+        <w:id w:val="414747230"/>
       </w:sdtPr>
       <w:sdtEndPr/>
       <w:sdtContent>
@@ -416,7 +416,7 @@
           <w:r>
             <w:fldChar w:fldCharType="separate"/>
           </w:r>
-          <w:hyperlink w:anchor="_Toc241170179" w:history="1">
+          <w:hyperlink w:anchor="_Toc241172430" w:history="1">
             <w:r>
               <w:rPr>
                 <w:rStyle w:val="Hyperlink"/>
@@ -458,7 +458,7 @@
               <w:rPr>
                 <w:noProof/>
               </w:rPr>
-              <w:instrText xml:space="preserve"> PAGEREF _Toc241170179 \h </w:instrText>
+              <w:instrText xml:space="preserve"> PAGEREF _Toc241172430 \h </w:instrText>
             </w:r>
             <w:r>
               <w:rPr>
@@ -501,7 +501,7 @@
               <w14:ligatures w14:val="standardContextual"/>
             </w:rPr>
           </w:pPr>
-          <w:hyperlink w:anchor="_Toc241170180" w:history="1">
+          <w:hyperlink w:anchor="_Toc241172431" w:history="1">
             <w:r>
               <w:rPr>
                 <w:rStyle w:val="Hyperlink"/>
@@ -543,7 +543,7 @@
               <w:rPr>
                 <w:noProof/>
               </w:rPr>
-              <w:instrText xml:space="preserve"> PAGEREF _Toc241170180 \h </w:instrText>
+              <w:instrText xml:space="preserve"> PAGEREF _Toc241172431 \h </w:instrText>
             </w:r>
             <w:r>
               <w:rPr>
@@ -586,7 +586,7 @@
               <w14:ligatures w14:val="standardContextual"/>
             </w:rPr>
           </w:pPr>
-          <w:hyperlink w:anchor="_Toc241170181" w:history="1">
+          <w:hyperlink w:anchor="_Toc241172432" w:history="1">
             <w:r>
               <w:rPr>
                 <w:rStyle w:val="Hyperlink"/>
@@ -628,7 +628,7 @@
               <w:rPr>
                 <w:noProof/>
               </w:rPr>
-              <w:instrText xml:space="preserve"> PAGEREF _Toc241170181 \h </w:instrText>
+              <w:instrText xml:space="preserve"> PAGEREF _Toc241172432 \h </w:instrText>
             </w:r>
             <w:r>
               <w:rPr>
@@ -671,7 +671,7 @@
               <w14:ligatures w14:val="standardContextual"/>
             </w:rPr>
           </w:pPr>
-          <w:hyperlink w:anchor="_Toc241170182" w:history="1">
+          <w:hyperlink w:anchor="_Toc241172433" w:history="1">
             <w:r>
               <w:rPr>
                 <w:rStyle w:val="Hyperlink"/>
@@ -713,7 +713,7 @@
               <w:rPr>
                 <w:noProof/>
               </w:rPr>
-              <w:instrText xml:space="preserve"> PAGEREF _Toc241170182 \h </w:instrText>
+              <w:instrText xml:space="preserve"> PAGEREF _Toc241172433 \h </w:instrText>
             </w:r>
             <w:r>
               <w:rPr>
@@ -756,7 +756,7 @@
               <w14:ligatures w14:val="standardContextual"/>
             </w:rPr>
           </w:pPr>
-          <w:hyperlink w:anchor="_Toc241170183" w:history="1">
+          <w:hyperlink w:anchor="_Toc241172434" w:history="1">
             <w:r>
               <w:rPr>
                 <w:rStyle w:val="Hyperlink"/>
@@ -798,7 +798,7 @@
               <w:rPr>
                 <w:noProof/>
               </w:rPr>
-              <w:instrText xml:space="preserve"> PAGEREF _Toc241170183 \h </w:instrText>
+              <w:instrText xml:space="preserve"> PAGEREF _Toc241172434 \h </w:instrText>
             </w:r>
             <w:r>
               <w:rPr>
@@ -841,7 +841,7 @@
               <w14:ligatures w14:val="standardContextual"/>
             </w:rPr>
           </w:pPr>
-          <w:hyperlink w:anchor="_Toc241170184" w:history="1">
+          <w:hyperlink w:anchor="_Toc241172435" w:history="1">
             <w:r>
               <w:rPr>
                 <w:rStyle w:val="Hyperlink"/>
@@ -883,7 +883,7 @@
               <w:rPr>
                 <w:noProof/>
               </w:rPr>
-              <w:instrText xml:space="preserve"> PAGEREF _Toc241170184 \h </w:instrText>
+              <w:instrText xml:space="preserve"> PAGEREF _Toc241172435 \h </w:instrText>
             </w:r>
             <w:r>
               <w:rPr>
@@ -926,7 +926,7 @@
               <w14:ligatures w14:val="standardContextual"/>
             </w:rPr>
           </w:pPr>
-          <w:hyperlink w:anchor="_Toc241170185" w:history="1">
+          <w:hyperlink w:anchor="_Toc241172436" w:history="1">
             <w:r>
               <w:rPr>
                 <w:rStyle w:val="Hyperlink"/>
@@ -968,7 +968,7 @@
               <w:rPr>
                 <w:noProof/>
               </w:rPr>
-              <w:instrText xml:space="preserve"> PAGEREF _Toc241170185 \h </w:instrText>
+              <w:instrText xml:space="preserve"> PAGEREF _Toc241172436 \h </w:instrText>
             </w:r>
             <w:r>
               <w:rPr>
@@ -1011,7 +1011,7 @@
               <w14:ligatures w14:val="standardContextual"/>
             </w:rPr>
           </w:pPr>
-          <w:hyperlink w:anchor="_Toc241170186" w:history="1">
+          <w:hyperlink w:anchor="_Toc241172437" w:history="1">
             <w:r>
               <w:rPr>
                 <w:rStyle w:val="Hyperlink"/>
@@ -1053,7 +1053,7 @@
               <w:rPr>
                 <w:noProof/>
               </w:rPr>
-              <w:instrText xml:space="preserve"> PAGEREF _Toc241170186 \h </w:instrText>
+              <w:instrText xml:space="preserve"> PAGEREF _Toc241172437 \h </w:instrText>
             </w:r>
             <w:r>
               <w:rPr>
@@ -1094,7 +1094,7 @@
           <w:tab w:val="left" w:pos="567"/>
         </w:tabs>
       </w:pPr>
-      <w:bookmarkStart w:id="0" w:name="_Toc241170179"/>
+      <w:bookmarkStart w:id="0" w:name="_Toc241172430"/>
       <w:r>
         <w:t>1</w:t>
       </w:r>
@@ -1149,7 +1149,7 @@
           <w:tab w:val="left" w:pos="567"/>
         </w:tabs>
       </w:pPr>
-      <w:bookmarkStart w:id="1" w:name="_Toc241170180"/>
+      <w:bookmarkStart w:id="1" w:name="_Toc241172431"/>
       <w:r>
         <w:t>2</w:t>
       </w:r>
@@ -1508,7 +1508,7 @@
           <w:tab w:val="left" w:pos="567"/>
         </w:tabs>
       </w:pPr>
-      <w:bookmarkStart w:id="2" w:name="_Toc241170181"/>
+      <w:bookmarkStart w:id="2" w:name="_Toc241172432"/>
       <w:r>
         <w:t>3</w:t>
       </w:r>
@@ -1645,10 +1645,10 @@
           <w:noProof/>
         </w:rPr>
         <w:drawing>
-          <wp:inline distT="0" distB="0" distL="0" distR="0" wp14:anchorId="3BF68C19" wp14:editId="7C69658F">
+          <wp:inline distT="0" distB="0" distL="0" distR="0" wp14:anchorId="78B00D30" wp14:editId="14F6E027">
             <wp:extent cx="2381250" cy="2466975"/>
             <wp:effectExtent l="0" t="0" r="0" b="0"/>
-            <wp:docPr id="913265714" name="Billede 913265714"/>
+            <wp:docPr id="275408699" name="Billede 275408699"/>
             <wp:cNvGraphicFramePr>
               <a:graphicFrameLocks xmlns:a="http://schemas.openxmlformats.org/drawingml/2006/main" noChangeAspect="1"/>
             </wp:cNvGraphicFramePr>
@@ -1729,7 +1729,7 @@
           <w:tab w:val="left" w:pos="567"/>
         </w:tabs>
       </w:pPr>
-      <w:bookmarkStart w:id="3" w:name="_Toc241170182"/>
+      <w:bookmarkStart w:id="3" w:name="_Toc241172433"/>
       <w:r>
         <w:t>4</w:t>
       </w:r>
@@ -1884,7 +1884,7 @@
           <w:tab w:val="left" w:pos="567"/>
         </w:tabs>
       </w:pPr>
-      <w:bookmarkStart w:id="4" w:name="_Toc241170183"/>
+      <w:bookmarkStart w:id="4" w:name="_Toc241172434"/>
       <w:r>
         <w:t>5</w:t>
       </w:r>
@@ -1978,214 +1978,97 @@
     </w:p>
     <w:tbl>
       <w:tblPr>
-        <w:tblW w:w="8400" w:type="dxa"/>
-        <w:jc w:val="center"/>
-        <w:tblBorders>
-          <w:top w:val="single" w:sz="4" w:space="0" w:color="auto"/>
-          <w:left w:val="single" w:sz="4" w:space="0" w:color="auto"/>
-          <w:bottom w:val="single" w:sz="4" w:space="0" w:color="auto"/>
-          <w:right w:val="single" w:sz="4" w:space="0" w:color="auto"/>
-          <w:insideH w:val="single" w:sz="4" w:space="0" w:color="auto"/>
-          <w:insideV w:val="single" w:sz="4" w:space="0" w:color="auto"/>
-        </w:tblBorders>
-        <w:tblCellMar>
-          <w:left w:w="10" w:type="dxa"/>
-          <w:right w:w="10" w:type="dxa"/>
-        </w:tblCellMar>
-        <w:tblLook w:val="0000" w:firstRow="0" w:lastRow="0" w:firstColumn="0" w:lastColumn="0" w:noHBand="0" w:noVBand="0"/>
+        <w:tblStyle w:val="Gittertabel1-lys-farve1"/>
+        <w:tblW w:w="5000" w:type="pct"/>
+        <w:tblLook w:val="0420" w:firstRow="1" w:lastRow="0" w:firstColumn="0" w:lastColumn="0" w:noHBand="0" w:noVBand="1"/>
       </w:tblPr>
       <w:tblGrid>
-        <w:gridCol w:w="2000"/>
-        <w:gridCol w:w="2000"/>
-        <w:gridCol w:w="2400"/>
-        <w:gridCol w:w="2000"/>
+        <w:gridCol w:w="2157"/>
+        <w:gridCol w:w="2157"/>
+        <w:gridCol w:w="2590"/>
+        <w:gridCol w:w="2156"/>
       </w:tblGrid>
       <w:tr>
-        <w:tblPrEx>
-          <w:tblCellMar>
-            <w:top w:w="0" w:type="dxa"/>
-            <w:bottom w:w="0" w:type="dxa"/>
-          </w:tblCellMar>
-        </w:tblPrEx>
         <w:trPr>
-          <w:tblHeader/>
-          <w:jc w:val="center"/>
+          <w:cnfStyle w:val="100000000000" w:firstRow="1" w:lastRow="0" w:firstColumn="0" w:lastColumn="0" w:oddVBand="0" w:evenVBand="0" w:oddHBand="0" w:evenHBand="0" w:firstRowFirstColumn="0" w:firstRowLastColumn="0" w:lastRowFirstColumn="0" w:lastRowLastColumn="0"/>
         </w:trPr>
         <w:tc>
           <w:tcPr>
-            <w:tcW w:w="2000" w:type="dxa"/>
-            <w:tcBorders>
-              <w:top w:val="single" w:sz="4" w:space="0" w:color="8EAADB"/>
-              <w:left w:val="single" w:sz="4" w:space="0" w:color="8EAADB"/>
-              <w:bottom w:val="single" w:sz="4" w:space="0" w:color="8EAADB"/>
-              <w:right w:val="single" w:sz="4" w:space="0" w:color="8EAADB"/>
-            </w:tcBorders>
-            <w:shd w:val="clear" w:color="auto" w:fill="D9E2F3"/>
-            <w:tcMar>
-              <w:top w:w="40" w:type="dxa"/>
-              <w:left w:w="100" w:type="dxa"/>
-              <w:bottom w:w="40" w:type="dxa"/>
-              <w:right w:w="100" w:type="dxa"/>
-            </w:tcMar>
+            <w:tcW w:w="1190" w:type="pct"/>
+            <w:shd w:val="clear" w:color="auto" w:fill="C1E4F5" w:themeFill="accent1" w:themeFillTint="33"/>
             <w:vAlign w:val="center"/>
           </w:tcPr>
           <w:p>
             <w:pPr>
-              <w:spacing w:after="0"/>
               <w:jc w:val="center"/>
             </w:pPr>
             <w:r>
-              <w:rPr>
-                <w:b/>
-                <w:bCs/>
-              </w:rPr>
               <w:t>Masse m / g</w:t>
             </w:r>
           </w:p>
         </w:tc>
         <w:tc>
           <w:tcPr>
-            <w:tcW w:w="2000" w:type="dxa"/>
-            <w:tcBorders>
-              <w:top w:val="single" w:sz="4" w:space="0" w:color="8EAADB"/>
-              <w:left w:val="single" w:sz="4" w:space="0" w:color="8EAADB"/>
-              <w:bottom w:val="single" w:sz="4" w:space="0" w:color="8EAADB"/>
-              <w:right w:val="single" w:sz="4" w:space="0" w:color="8EAADB"/>
-            </w:tcBorders>
-            <w:shd w:val="clear" w:color="auto" w:fill="D9E2F3"/>
-            <w:tcMar>
-              <w:top w:w="40" w:type="dxa"/>
-              <w:left w:w="100" w:type="dxa"/>
-              <w:bottom w:w="40" w:type="dxa"/>
-              <w:right w:w="100" w:type="dxa"/>
-            </w:tcMar>
+            <w:tcW w:w="1190" w:type="pct"/>
+            <w:shd w:val="clear" w:color="auto" w:fill="C1E4F5" w:themeFill="accent1" w:themeFillTint="33"/>
             <w:vAlign w:val="center"/>
           </w:tcPr>
           <w:p>
             <w:pPr>
-              <w:spacing w:after="0"/>
               <w:jc w:val="center"/>
             </w:pPr>
             <w:r>
-              <w:rPr>
-                <w:b/>
-                <w:bCs/>
-              </w:rPr>
               <w:t>Position L / cm</w:t>
             </w:r>
           </w:p>
         </w:tc>
         <w:tc>
           <w:tcPr>
-            <w:tcW w:w="2400" w:type="dxa"/>
-            <w:tcBorders>
-              <w:top w:val="single" w:sz="4" w:space="0" w:color="8EAADB"/>
-              <w:left w:val="single" w:sz="4" w:space="0" w:color="8EAADB"/>
-              <w:bottom w:val="single" w:sz="4" w:space="0" w:color="8EAADB"/>
-              <w:right w:val="single" w:sz="4" w:space="0" w:color="8EAADB"/>
-            </w:tcBorders>
-            <w:shd w:val="clear" w:color="auto" w:fill="D9E2F3"/>
-            <w:tcMar>
-              <w:top w:w="40" w:type="dxa"/>
-              <w:left w:w="100" w:type="dxa"/>
-              <w:bottom w:w="40" w:type="dxa"/>
-              <w:right w:w="100" w:type="dxa"/>
-            </w:tcMar>
+            <w:tcW w:w="1429" w:type="pct"/>
+            <w:shd w:val="clear" w:color="auto" w:fill="C1E4F5" w:themeFill="accent1" w:themeFillTint="33"/>
             <w:vAlign w:val="center"/>
           </w:tcPr>
           <w:p>
             <w:pPr>
-              <w:spacing w:after="0"/>
               <w:jc w:val="center"/>
             </w:pPr>
             <w:r>
-              <w:rPr>
-                <w:b/>
-                <w:bCs/>
-              </w:rPr>
               <w:t xml:space="preserve">Forlængelse </w:t>
             </w:r>
             <w:proofErr w:type="spellStart"/>
             <w:r>
-              <w:rPr>
-                <w:b/>
-                <w:bCs/>
-              </w:rPr>
               <w:t>Δx</w:t>
             </w:r>
             <w:proofErr w:type="spellEnd"/>
             <w:r>
-              <w:rPr>
-                <w:b/>
-                <w:bCs/>
-              </w:rPr>
               <w:t xml:space="preserve"> / m</w:t>
             </w:r>
           </w:p>
         </w:tc>
         <w:tc>
           <w:tcPr>
-            <w:tcW w:w="2000" w:type="dxa"/>
-            <w:tcBorders>
-              <w:top w:val="single" w:sz="4" w:space="0" w:color="8EAADB"/>
-              <w:left w:val="single" w:sz="4" w:space="0" w:color="8EAADB"/>
-              <w:bottom w:val="single" w:sz="4" w:space="0" w:color="8EAADB"/>
-              <w:right w:val="single" w:sz="4" w:space="0" w:color="8EAADB"/>
-            </w:tcBorders>
-            <w:shd w:val="clear" w:color="auto" w:fill="D9E2F3"/>
-            <w:tcMar>
-              <w:top w:w="40" w:type="dxa"/>
-              <w:left w:w="100" w:type="dxa"/>
-              <w:bottom w:w="40" w:type="dxa"/>
-              <w:right w:w="100" w:type="dxa"/>
-            </w:tcMar>
+            <w:tcW w:w="1190" w:type="pct"/>
+            <w:shd w:val="clear" w:color="auto" w:fill="C1E4F5" w:themeFill="accent1" w:themeFillTint="33"/>
             <w:vAlign w:val="center"/>
           </w:tcPr>
           <w:p>
             <w:pPr>
-              <w:spacing w:after="0"/>
               <w:jc w:val="center"/>
             </w:pPr>
             <w:r>
-              <w:rPr>
-                <w:b/>
-                <w:bCs/>
-              </w:rPr>
               <w:t>Kraft F / N</w:t>
             </w:r>
           </w:p>
         </w:tc>
       </w:tr>
       <w:tr>
-        <w:tblPrEx>
-          <w:tblCellMar>
-            <w:top w:w="0" w:type="dxa"/>
-            <w:bottom w:w="0" w:type="dxa"/>
-          </w:tblCellMar>
-        </w:tblPrEx>
-        <w:trPr>
-          <w:jc w:val="center"/>
-        </w:trPr>
         <w:tc>
           <w:tcPr>
-            <w:tcW w:w="2000" w:type="dxa"/>
-            <w:tcBorders>
-              <w:top w:val="single" w:sz="4" w:space="0" w:color="8EAADB"/>
-              <w:left w:val="single" w:sz="4" w:space="0" w:color="8EAADB"/>
-              <w:bottom w:val="single" w:sz="4" w:space="0" w:color="8EAADB"/>
-              <w:right w:val="single" w:sz="4" w:space="0" w:color="8EAADB"/>
-            </w:tcBorders>
-            <w:tcMar>
-              <w:top w:w="40" w:type="dxa"/>
-              <w:left w:w="100" w:type="dxa"/>
-              <w:bottom w:w="40" w:type="dxa"/>
-              <w:right w:w="100" w:type="dxa"/>
-            </w:tcMar>
+            <w:tcW w:w="1190" w:type="pct"/>
             <w:vAlign w:val="center"/>
           </w:tcPr>
           <w:p>
             <w:pPr>
-              <w:spacing w:after="0"/>
               <w:jc w:val="center"/>
             </w:pPr>
             <w:r>
@@ -2195,24 +2078,11 @@
         </w:tc>
         <w:tc>
           <w:tcPr>
-            <w:tcW w:w="2000" w:type="dxa"/>
-            <w:tcBorders>
-              <w:top w:val="single" w:sz="4" w:space="0" w:color="8EAADB"/>
-              <w:left w:val="single" w:sz="4" w:space="0" w:color="8EAADB"/>
-              <w:bottom w:val="single" w:sz="4" w:space="0" w:color="8EAADB"/>
-              <w:right w:val="single" w:sz="4" w:space="0" w:color="8EAADB"/>
-            </w:tcBorders>
-            <w:tcMar>
-              <w:top w:w="40" w:type="dxa"/>
-              <w:left w:w="100" w:type="dxa"/>
-              <w:bottom w:w="40" w:type="dxa"/>
-              <w:right w:w="100" w:type="dxa"/>
-            </w:tcMar>
+            <w:tcW w:w="1190" w:type="pct"/>
             <w:vAlign w:val="center"/>
           </w:tcPr>
           <w:p>
             <w:pPr>
-              <w:spacing w:after="0"/>
               <w:jc w:val="center"/>
             </w:pPr>
             <w:r>
@@ -2222,24 +2092,11 @@
         </w:tc>
         <w:tc>
           <w:tcPr>
-            <w:tcW w:w="2400" w:type="dxa"/>
-            <w:tcBorders>
-              <w:top w:val="single" w:sz="4" w:space="0" w:color="8EAADB"/>
-              <w:left w:val="single" w:sz="4" w:space="0" w:color="8EAADB"/>
-              <w:bottom w:val="single" w:sz="4" w:space="0" w:color="8EAADB"/>
-              <w:right w:val="single" w:sz="4" w:space="0" w:color="8EAADB"/>
-            </w:tcBorders>
-            <w:tcMar>
-              <w:top w:w="40" w:type="dxa"/>
-              <w:left w:w="100" w:type="dxa"/>
-              <w:bottom w:w="40" w:type="dxa"/>
-              <w:right w:w="100" w:type="dxa"/>
-            </w:tcMar>
+            <w:tcW w:w="1429" w:type="pct"/>
             <w:vAlign w:val="center"/>
           </w:tcPr>
           <w:p>
             <w:pPr>
-              <w:spacing w:after="0"/>
               <w:jc w:val="center"/>
             </w:pPr>
             <w:r>
@@ -2249,24 +2106,11 @@
         </w:tc>
         <w:tc>
           <w:tcPr>
-            <w:tcW w:w="2000" w:type="dxa"/>
-            <w:tcBorders>
-              <w:top w:val="single" w:sz="4" w:space="0" w:color="8EAADB"/>
-              <w:left w:val="single" w:sz="4" w:space="0" w:color="8EAADB"/>
-              <w:bottom w:val="single" w:sz="4" w:space="0" w:color="8EAADB"/>
-              <w:right w:val="single" w:sz="4" w:space="0" w:color="8EAADB"/>
-            </w:tcBorders>
-            <w:tcMar>
-              <w:top w:w="40" w:type="dxa"/>
-              <w:left w:w="100" w:type="dxa"/>
-              <w:bottom w:w="40" w:type="dxa"/>
-              <w:right w:w="100" w:type="dxa"/>
-            </w:tcMar>
+            <w:tcW w:w="1190" w:type="pct"/>
             <w:vAlign w:val="center"/>
           </w:tcPr>
           <w:p>
             <w:pPr>
-              <w:spacing w:after="0"/>
               <w:jc w:val="center"/>
             </w:pPr>
             <w:r>
@@ -2276,35 +2120,13 @@
         </w:tc>
       </w:tr>
       <w:tr>
-        <w:tblPrEx>
-          <w:tblCellMar>
-            <w:top w:w="0" w:type="dxa"/>
-            <w:bottom w:w="0" w:type="dxa"/>
-          </w:tblCellMar>
-        </w:tblPrEx>
-        <w:trPr>
-          <w:jc w:val="center"/>
-        </w:trPr>
         <w:tc>
           <w:tcPr>
-            <w:tcW w:w="2000" w:type="dxa"/>
-            <w:tcBorders>
-              <w:top w:val="single" w:sz="4" w:space="0" w:color="8EAADB"/>
-              <w:left w:val="single" w:sz="4" w:space="0" w:color="8EAADB"/>
-              <w:bottom w:val="single" w:sz="4" w:space="0" w:color="8EAADB"/>
-              <w:right w:val="single" w:sz="4" w:space="0" w:color="8EAADB"/>
-            </w:tcBorders>
-            <w:tcMar>
-              <w:top w:w="40" w:type="dxa"/>
-              <w:left w:w="100" w:type="dxa"/>
-              <w:bottom w:w="40" w:type="dxa"/>
-              <w:right w:w="100" w:type="dxa"/>
-            </w:tcMar>
+            <w:tcW w:w="1190" w:type="pct"/>
             <w:vAlign w:val="center"/>
           </w:tcPr>
           <w:p>
             <w:pPr>
-              <w:spacing w:after="0"/>
               <w:jc w:val="center"/>
             </w:pPr>
             <w:r>
@@ -2314,24 +2136,11 @@
         </w:tc>
         <w:tc>
           <w:tcPr>
-            <w:tcW w:w="2000" w:type="dxa"/>
-            <w:tcBorders>
-              <w:top w:val="single" w:sz="4" w:space="0" w:color="8EAADB"/>
-              <w:left w:val="single" w:sz="4" w:space="0" w:color="8EAADB"/>
-              <w:bottom w:val="single" w:sz="4" w:space="0" w:color="8EAADB"/>
-              <w:right w:val="single" w:sz="4" w:space="0" w:color="8EAADB"/>
-            </w:tcBorders>
-            <w:tcMar>
-              <w:top w:w="40" w:type="dxa"/>
-              <w:left w:w="100" w:type="dxa"/>
-              <w:bottom w:w="40" w:type="dxa"/>
-              <w:right w:w="100" w:type="dxa"/>
-            </w:tcMar>
+            <w:tcW w:w="1190" w:type="pct"/>
             <w:vAlign w:val="center"/>
           </w:tcPr>
           <w:p>
             <w:pPr>
-              <w:spacing w:after="0"/>
               <w:jc w:val="center"/>
             </w:pPr>
             <w:r>
@@ -2341,24 +2150,11 @@
         </w:tc>
         <w:tc>
           <w:tcPr>
-            <w:tcW w:w="2400" w:type="dxa"/>
-            <w:tcBorders>
-              <w:top w:val="single" w:sz="4" w:space="0" w:color="8EAADB"/>
-              <w:left w:val="single" w:sz="4" w:space="0" w:color="8EAADB"/>
-              <w:bottom w:val="single" w:sz="4" w:space="0" w:color="8EAADB"/>
-              <w:right w:val="single" w:sz="4" w:space="0" w:color="8EAADB"/>
-            </w:tcBorders>
-            <w:tcMar>
-              <w:top w:w="40" w:type="dxa"/>
-              <w:left w:w="100" w:type="dxa"/>
-              <w:bottom w:w="40" w:type="dxa"/>
-              <w:right w:w="100" w:type="dxa"/>
-            </w:tcMar>
+            <w:tcW w:w="1429" w:type="pct"/>
             <w:vAlign w:val="center"/>
           </w:tcPr>
           <w:p>
             <w:pPr>
-              <w:spacing w:after="0"/>
               <w:jc w:val="center"/>
             </w:pPr>
             <w:r>
@@ -2368,24 +2164,11 @@
         </w:tc>
         <w:tc>
           <w:tcPr>
-            <w:tcW w:w="2000" w:type="dxa"/>
-            <w:tcBorders>
-              <w:top w:val="single" w:sz="4" w:space="0" w:color="8EAADB"/>
-              <w:left w:val="single" w:sz="4" w:space="0" w:color="8EAADB"/>
-              <w:bottom w:val="single" w:sz="4" w:space="0" w:color="8EAADB"/>
-              <w:right w:val="single" w:sz="4" w:space="0" w:color="8EAADB"/>
-            </w:tcBorders>
-            <w:tcMar>
-              <w:top w:w="40" w:type="dxa"/>
-              <w:left w:w="100" w:type="dxa"/>
-              <w:bottom w:w="40" w:type="dxa"/>
-              <w:right w:w="100" w:type="dxa"/>
-            </w:tcMar>
+            <w:tcW w:w="1190" w:type="pct"/>
             <w:vAlign w:val="center"/>
           </w:tcPr>
           <w:p>
             <w:pPr>
-              <w:spacing w:after="0"/>
               <w:jc w:val="center"/>
             </w:pPr>
             <w:r>
@@ -2395,35 +2178,13 @@
         </w:tc>
       </w:tr>
       <w:tr>
-        <w:tblPrEx>
-          <w:tblCellMar>
-            <w:top w:w="0" w:type="dxa"/>
-            <w:bottom w:w="0" w:type="dxa"/>
-          </w:tblCellMar>
-        </w:tblPrEx>
-        <w:trPr>
-          <w:jc w:val="center"/>
-        </w:trPr>
         <w:tc>
           <w:tcPr>
-            <w:tcW w:w="2000" w:type="dxa"/>
-            <w:tcBorders>
-              <w:top w:val="single" w:sz="4" w:space="0" w:color="8EAADB"/>
-              <w:left w:val="single" w:sz="4" w:space="0" w:color="8EAADB"/>
-              <w:bottom w:val="single" w:sz="4" w:space="0" w:color="8EAADB"/>
-              <w:right w:val="single" w:sz="4" w:space="0" w:color="8EAADB"/>
-            </w:tcBorders>
-            <w:tcMar>
-              <w:top w:w="40" w:type="dxa"/>
-              <w:left w:w="100" w:type="dxa"/>
-              <w:bottom w:w="40" w:type="dxa"/>
-              <w:right w:w="100" w:type="dxa"/>
-            </w:tcMar>
+            <w:tcW w:w="1190" w:type="pct"/>
             <w:vAlign w:val="center"/>
           </w:tcPr>
           <w:p>
             <w:pPr>
-              <w:spacing w:after="0"/>
               <w:jc w:val="center"/>
             </w:pPr>
             <w:r>
@@ -2433,24 +2194,11 @@
         </w:tc>
         <w:tc>
           <w:tcPr>
-            <w:tcW w:w="2000" w:type="dxa"/>
-            <w:tcBorders>
-              <w:top w:val="single" w:sz="4" w:space="0" w:color="8EAADB"/>
-              <w:left w:val="single" w:sz="4" w:space="0" w:color="8EAADB"/>
-              <w:bottom w:val="single" w:sz="4" w:space="0" w:color="8EAADB"/>
-              <w:right w:val="single" w:sz="4" w:space="0" w:color="8EAADB"/>
-            </w:tcBorders>
-            <w:tcMar>
-              <w:top w:w="40" w:type="dxa"/>
-              <w:left w:w="100" w:type="dxa"/>
-              <w:bottom w:w="40" w:type="dxa"/>
-              <w:right w:w="100" w:type="dxa"/>
-            </w:tcMar>
+            <w:tcW w:w="1190" w:type="pct"/>
             <w:vAlign w:val="center"/>
           </w:tcPr>
           <w:p>
             <w:pPr>
-              <w:spacing w:after="0"/>
               <w:jc w:val="center"/>
             </w:pPr>
             <w:r>
@@ -2460,24 +2208,11 @@
         </w:tc>
         <w:tc>
           <w:tcPr>
-            <w:tcW w:w="2400" w:type="dxa"/>
-            <w:tcBorders>
-              <w:top w:val="single" w:sz="4" w:space="0" w:color="8EAADB"/>
-              <w:left w:val="single" w:sz="4" w:space="0" w:color="8EAADB"/>
-              <w:bottom w:val="single" w:sz="4" w:space="0" w:color="8EAADB"/>
-              <w:right w:val="single" w:sz="4" w:space="0" w:color="8EAADB"/>
-            </w:tcBorders>
-            <w:tcMar>
-              <w:top w:w="40" w:type="dxa"/>
-              <w:left w:w="100" w:type="dxa"/>
-              <w:bottom w:w="40" w:type="dxa"/>
-              <w:right w:w="100" w:type="dxa"/>
-            </w:tcMar>
+            <w:tcW w:w="1429" w:type="pct"/>
             <w:vAlign w:val="center"/>
           </w:tcPr>
           <w:p>
             <w:pPr>
-              <w:spacing w:after="0"/>
               <w:jc w:val="center"/>
             </w:pPr>
             <w:r>
@@ -2487,24 +2222,11 @@
         </w:tc>
         <w:tc>
           <w:tcPr>
-            <w:tcW w:w="2000" w:type="dxa"/>
-            <w:tcBorders>
-              <w:top w:val="single" w:sz="4" w:space="0" w:color="8EAADB"/>
-              <w:left w:val="single" w:sz="4" w:space="0" w:color="8EAADB"/>
-              <w:bottom w:val="single" w:sz="4" w:space="0" w:color="8EAADB"/>
-              <w:right w:val="single" w:sz="4" w:space="0" w:color="8EAADB"/>
-            </w:tcBorders>
-            <w:tcMar>
-              <w:top w:w="40" w:type="dxa"/>
-              <w:left w:w="100" w:type="dxa"/>
-              <w:bottom w:w="40" w:type="dxa"/>
-              <w:right w:w="100" w:type="dxa"/>
-            </w:tcMar>
+            <w:tcW w:w="1190" w:type="pct"/>
             <w:vAlign w:val="center"/>
           </w:tcPr>
           <w:p>
             <w:pPr>
-              <w:spacing w:after="0"/>
               <w:jc w:val="center"/>
             </w:pPr>
             <w:r>
@@ -2514,35 +2236,13 @@
         </w:tc>
       </w:tr>
       <w:tr>
-        <w:tblPrEx>
-          <w:tblCellMar>
-            <w:top w:w="0" w:type="dxa"/>
-            <w:bottom w:w="0" w:type="dxa"/>
-          </w:tblCellMar>
-        </w:tblPrEx>
-        <w:trPr>
-          <w:jc w:val="center"/>
-        </w:trPr>
         <w:tc>
           <w:tcPr>
-            <w:tcW w:w="2000" w:type="dxa"/>
-            <w:tcBorders>
-              <w:top w:val="single" w:sz="4" w:space="0" w:color="8EAADB"/>
-              <w:left w:val="single" w:sz="4" w:space="0" w:color="8EAADB"/>
-              <w:bottom w:val="single" w:sz="4" w:space="0" w:color="8EAADB"/>
-              <w:right w:val="single" w:sz="4" w:space="0" w:color="8EAADB"/>
-            </w:tcBorders>
-            <w:tcMar>
-              <w:top w:w="40" w:type="dxa"/>
-              <w:left w:w="100" w:type="dxa"/>
-              <w:bottom w:w="40" w:type="dxa"/>
-              <w:right w:w="100" w:type="dxa"/>
-            </w:tcMar>
+            <w:tcW w:w="1190" w:type="pct"/>
             <w:vAlign w:val="center"/>
           </w:tcPr>
           <w:p>
             <w:pPr>
-              <w:spacing w:after="0"/>
               <w:jc w:val="center"/>
             </w:pPr>
             <w:r>
@@ -2552,24 +2252,11 @@
         </w:tc>
         <w:tc>
           <w:tcPr>
-            <w:tcW w:w="2000" w:type="dxa"/>
-            <w:tcBorders>
-              <w:top w:val="single" w:sz="4" w:space="0" w:color="8EAADB"/>
-              <w:left w:val="single" w:sz="4" w:space="0" w:color="8EAADB"/>
-              <w:bottom w:val="single" w:sz="4" w:space="0" w:color="8EAADB"/>
-              <w:right w:val="single" w:sz="4" w:space="0" w:color="8EAADB"/>
-            </w:tcBorders>
-            <w:tcMar>
-              <w:top w:w="40" w:type="dxa"/>
-              <w:left w:w="100" w:type="dxa"/>
-              <w:bottom w:w="40" w:type="dxa"/>
-              <w:right w:w="100" w:type="dxa"/>
-            </w:tcMar>
+            <w:tcW w:w="1190" w:type="pct"/>
             <w:vAlign w:val="center"/>
           </w:tcPr>
           <w:p>
             <w:pPr>
-              <w:spacing w:after="0"/>
               <w:jc w:val="center"/>
             </w:pPr>
             <w:r>
@@ -2579,24 +2266,11 @@
         </w:tc>
         <w:tc>
           <w:tcPr>
-            <w:tcW w:w="2400" w:type="dxa"/>
-            <w:tcBorders>
-              <w:top w:val="single" w:sz="4" w:space="0" w:color="8EAADB"/>
-              <w:left w:val="single" w:sz="4" w:space="0" w:color="8EAADB"/>
-              <w:bottom w:val="single" w:sz="4" w:space="0" w:color="8EAADB"/>
-              <w:right w:val="single" w:sz="4" w:space="0" w:color="8EAADB"/>
-            </w:tcBorders>
-            <w:tcMar>
-              <w:top w:w="40" w:type="dxa"/>
-              <w:left w:w="100" w:type="dxa"/>
-              <w:bottom w:w="40" w:type="dxa"/>
-              <w:right w:w="100" w:type="dxa"/>
-            </w:tcMar>
+            <w:tcW w:w="1429" w:type="pct"/>
             <w:vAlign w:val="center"/>
           </w:tcPr>
           <w:p>
             <w:pPr>
-              <w:spacing w:after="0"/>
               <w:jc w:val="center"/>
             </w:pPr>
             <w:r>
@@ -2606,24 +2280,11 @@
         </w:tc>
         <w:tc>
           <w:tcPr>
-            <w:tcW w:w="2000" w:type="dxa"/>
-            <w:tcBorders>
-              <w:top w:val="single" w:sz="4" w:space="0" w:color="8EAADB"/>
-              <w:left w:val="single" w:sz="4" w:space="0" w:color="8EAADB"/>
-              <w:bottom w:val="single" w:sz="4" w:space="0" w:color="8EAADB"/>
-              <w:right w:val="single" w:sz="4" w:space="0" w:color="8EAADB"/>
-            </w:tcBorders>
-            <w:tcMar>
-              <w:top w:w="40" w:type="dxa"/>
-              <w:left w:w="100" w:type="dxa"/>
-              <w:bottom w:w="40" w:type="dxa"/>
-              <w:right w:w="100" w:type="dxa"/>
-            </w:tcMar>
+            <w:tcW w:w="1190" w:type="pct"/>
             <w:vAlign w:val="center"/>
           </w:tcPr>
           <w:p>
             <w:pPr>
-              <w:spacing w:after="0"/>
               <w:jc w:val="center"/>
             </w:pPr>
             <w:r>
@@ -2633,35 +2294,13 @@
         </w:tc>
       </w:tr>
       <w:tr>
-        <w:tblPrEx>
-          <w:tblCellMar>
-            <w:top w:w="0" w:type="dxa"/>
-            <w:bottom w:w="0" w:type="dxa"/>
-          </w:tblCellMar>
-        </w:tblPrEx>
-        <w:trPr>
-          <w:jc w:val="center"/>
-        </w:trPr>
         <w:tc>
           <w:tcPr>
-            <w:tcW w:w="2000" w:type="dxa"/>
-            <w:tcBorders>
-              <w:top w:val="single" w:sz="4" w:space="0" w:color="8EAADB"/>
-              <w:left w:val="single" w:sz="4" w:space="0" w:color="8EAADB"/>
-              <w:bottom w:val="single" w:sz="4" w:space="0" w:color="8EAADB"/>
-              <w:right w:val="single" w:sz="4" w:space="0" w:color="8EAADB"/>
-            </w:tcBorders>
-            <w:tcMar>
-              <w:top w:w="40" w:type="dxa"/>
-              <w:left w:w="100" w:type="dxa"/>
-              <w:bottom w:w="40" w:type="dxa"/>
-              <w:right w:w="100" w:type="dxa"/>
-            </w:tcMar>
+            <w:tcW w:w="1190" w:type="pct"/>
             <w:vAlign w:val="center"/>
           </w:tcPr>
           <w:p>
             <w:pPr>
-              <w:spacing w:after="0"/>
               <w:jc w:val="center"/>
             </w:pPr>
             <w:r>
@@ -2671,24 +2310,11 @@
         </w:tc>
         <w:tc>
           <w:tcPr>
-            <w:tcW w:w="2000" w:type="dxa"/>
-            <w:tcBorders>
-              <w:top w:val="single" w:sz="4" w:space="0" w:color="8EAADB"/>
-              <w:left w:val="single" w:sz="4" w:space="0" w:color="8EAADB"/>
-              <w:bottom w:val="single" w:sz="4" w:space="0" w:color="8EAADB"/>
-              <w:right w:val="single" w:sz="4" w:space="0" w:color="8EAADB"/>
-            </w:tcBorders>
-            <w:tcMar>
-              <w:top w:w="40" w:type="dxa"/>
-              <w:left w:w="100" w:type="dxa"/>
-              <w:bottom w:w="40" w:type="dxa"/>
-              <w:right w:w="100" w:type="dxa"/>
-            </w:tcMar>
+            <w:tcW w:w="1190" w:type="pct"/>
             <w:vAlign w:val="center"/>
           </w:tcPr>
           <w:p>
             <w:pPr>
-              <w:spacing w:after="0"/>
               <w:jc w:val="center"/>
             </w:pPr>
             <w:r>
@@ -2698,24 +2324,11 @@
         </w:tc>
         <w:tc>
           <w:tcPr>
-            <w:tcW w:w="2400" w:type="dxa"/>
-            <w:tcBorders>
-              <w:top w:val="single" w:sz="4" w:space="0" w:color="8EAADB"/>
-              <w:left w:val="single" w:sz="4" w:space="0" w:color="8EAADB"/>
-              <w:bottom w:val="single" w:sz="4" w:space="0" w:color="8EAADB"/>
-              <w:right w:val="single" w:sz="4" w:space="0" w:color="8EAADB"/>
-            </w:tcBorders>
-            <w:tcMar>
-              <w:top w:w="40" w:type="dxa"/>
-              <w:left w:w="100" w:type="dxa"/>
-              <w:bottom w:w="40" w:type="dxa"/>
-              <w:right w:w="100" w:type="dxa"/>
-            </w:tcMar>
+            <w:tcW w:w="1429" w:type="pct"/>
             <w:vAlign w:val="center"/>
           </w:tcPr>
           <w:p>
             <w:pPr>
-              <w:spacing w:after="0"/>
               <w:jc w:val="center"/>
             </w:pPr>
             <w:r>
@@ -2725,24 +2338,11 @@
         </w:tc>
         <w:tc>
           <w:tcPr>
-            <w:tcW w:w="2000" w:type="dxa"/>
-            <w:tcBorders>
-              <w:top w:val="single" w:sz="4" w:space="0" w:color="8EAADB"/>
-              <w:left w:val="single" w:sz="4" w:space="0" w:color="8EAADB"/>
-              <w:bottom w:val="single" w:sz="4" w:space="0" w:color="8EAADB"/>
-              <w:right w:val="single" w:sz="4" w:space="0" w:color="8EAADB"/>
-            </w:tcBorders>
-            <w:tcMar>
-              <w:top w:w="40" w:type="dxa"/>
-              <w:left w:w="100" w:type="dxa"/>
-              <w:bottom w:w="40" w:type="dxa"/>
-              <w:right w:w="100" w:type="dxa"/>
-            </w:tcMar>
+            <w:tcW w:w="1190" w:type="pct"/>
             <w:vAlign w:val="center"/>
           </w:tcPr>
           <w:p>
             <w:pPr>
-              <w:spacing w:after="0"/>
               <w:jc w:val="center"/>
             </w:pPr>
             <w:r>
@@ -2752,35 +2352,13 @@
         </w:tc>
       </w:tr>
       <w:tr>
-        <w:tblPrEx>
-          <w:tblCellMar>
-            <w:top w:w="0" w:type="dxa"/>
-            <w:bottom w:w="0" w:type="dxa"/>
-          </w:tblCellMar>
-        </w:tblPrEx>
-        <w:trPr>
-          <w:jc w:val="center"/>
-        </w:trPr>
         <w:tc>
           <w:tcPr>
-            <w:tcW w:w="2000" w:type="dxa"/>
-            <w:tcBorders>
-              <w:top w:val="single" w:sz="4" w:space="0" w:color="8EAADB"/>
-              <w:left w:val="single" w:sz="4" w:space="0" w:color="8EAADB"/>
-              <w:bottom w:val="single" w:sz="4" w:space="0" w:color="8EAADB"/>
-              <w:right w:val="single" w:sz="4" w:space="0" w:color="8EAADB"/>
-            </w:tcBorders>
-            <w:tcMar>
-              <w:top w:w="40" w:type="dxa"/>
-              <w:left w:w="100" w:type="dxa"/>
-              <w:bottom w:w="40" w:type="dxa"/>
-              <w:right w:w="100" w:type="dxa"/>
-            </w:tcMar>
+            <w:tcW w:w="1190" w:type="pct"/>
             <w:vAlign w:val="center"/>
           </w:tcPr>
           <w:p>
             <w:pPr>
-              <w:spacing w:after="0"/>
               <w:jc w:val="center"/>
             </w:pPr>
             <w:r>
@@ -2790,24 +2368,11 @@
         </w:tc>
         <w:tc>
           <w:tcPr>
-            <w:tcW w:w="2000" w:type="dxa"/>
-            <w:tcBorders>
-              <w:top w:val="single" w:sz="4" w:space="0" w:color="8EAADB"/>
-              <w:left w:val="single" w:sz="4" w:space="0" w:color="8EAADB"/>
-              <w:bottom w:val="single" w:sz="4" w:space="0" w:color="8EAADB"/>
-              <w:right w:val="single" w:sz="4" w:space="0" w:color="8EAADB"/>
-            </w:tcBorders>
-            <w:tcMar>
-              <w:top w:w="40" w:type="dxa"/>
-              <w:left w:w="100" w:type="dxa"/>
-              <w:bottom w:w="40" w:type="dxa"/>
-              <w:right w:w="100" w:type="dxa"/>
-            </w:tcMar>
+            <w:tcW w:w="1190" w:type="pct"/>
             <w:vAlign w:val="center"/>
           </w:tcPr>
           <w:p>
             <w:pPr>
-              <w:spacing w:after="0"/>
               <w:jc w:val="center"/>
             </w:pPr>
             <w:r>
@@ -2817,24 +2382,11 @@
         </w:tc>
         <w:tc>
           <w:tcPr>
-            <w:tcW w:w="2400" w:type="dxa"/>
-            <w:tcBorders>
-              <w:top w:val="single" w:sz="4" w:space="0" w:color="8EAADB"/>
-              <w:left w:val="single" w:sz="4" w:space="0" w:color="8EAADB"/>
-              <w:bottom w:val="single" w:sz="4" w:space="0" w:color="8EAADB"/>
-              <w:right w:val="single" w:sz="4" w:space="0" w:color="8EAADB"/>
-            </w:tcBorders>
-            <w:tcMar>
-              <w:top w:w="40" w:type="dxa"/>
-              <w:left w:w="100" w:type="dxa"/>
-              <w:bottom w:w="40" w:type="dxa"/>
-              <w:right w:w="100" w:type="dxa"/>
-            </w:tcMar>
+            <w:tcW w:w="1429" w:type="pct"/>
             <w:vAlign w:val="center"/>
           </w:tcPr>
           <w:p>
             <w:pPr>
-              <w:spacing w:after="0"/>
               <w:jc w:val="center"/>
             </w:pPr>
             <w:r>
@@ -2844,24 +2396,11 @@
         </w:tc>
         <w:tc>
           <w:tcPr>
-            <w:tcW w:w="2000" w:type="dxa"/>
-            <w:tcBorders>
-              <w:top w:val="single" w:sz="4" w:space="0" w:color="8EAADB"/>
-              <w:left w:val="single" w:sz="4" w:space="0" w:color="8EAADB"/>
-              <w:bottom w:val="single" w:sz="4" w:space="0" w:color="8EAADB"/>
-              <w:right w:val="single" w:sz="4" w:space="0" w:color="8EAADB"/>
-            </w:tcBorders>
-            <w:tcMar>
-              <w:top w:w="40" w:type="dxa"/>
-              <w:left w:w="100" w:type="dxa"/>
-              <w:bottom w:w="40" w:type="dxa"/>
-              <w:right w:w="100" w:type="dxa"/>
-            </w:tcMar>
+            <w:tcW w:w="1190" w:type="pct"/>
             <w:vAlign w:val="center"/>
           </w:tcPr>
           <w:p>
             <w:pPr>
-              <w:spacing w:after="0"/>
               <w:jc w:val="center"/>
             </w:pPr>
             <w:r>
@@ -2871,35 +2410,13 @@
         </w:tc>
       </w:tr>
       <w:tr>
-        <w:tblPrEx>
-          <w:tblCellMar>
-            <w:top w:w="0" w:type="dxa"/>
-            <w:bottom w:w="0" w:type="dxa"/>
-          </w:tblCellMar>
-        </w:tblPrEx>
-        <w:trPr>
-          <w:jc w:val="center"/>
-        </w:trPr>
         <w:tc>
           <w:tcPr>
-            <w:tcW w:w="2000" w:type="dxa"/>
-            <w:tcBorders>
-              <w:top w:val="single" w:sz="4" w:space="0" w:color="8EAADB"/>
-              <w:left w:val="single" w:sz="4" w:space="0" w:color="8EAADB"/>
-              <w:bottom w:val="single" w:sz="4" w:space="0" w:color="8EAADB"/>
-              <w:right w:val="single" w:sz="4" w:space="0" w:color="8EAADB"/>
-            </w:tcBorders>
-            <w:tcMar>
-              <w:top w:w="40" w:type="dxa"/>
-              <w:left w:w="100" w:type="dxa"/>
-              <w:bottom w:w="40" w:type="dxa"/>
-              <w:right w:w="100" w:type="dxa"/>
-            </w:tcMar>
+            <w:tcW w:w="1190" w:type="pct"/>
             <w:vAlign w:val="center"/>
           </w:tcPr>
           <w:p>
             <w:pPr>
-              <w:spacing w:after="0"/>
               <w:jc w:val="center"/>
             </w:pPr>
             <w:r>
@@ -2909,24 +2426,11 @@
         </w:tc>
         <w:tc>
           <w:tcPr>
-            <w:tcW w:w="2000" w:type="dxa"/>
-            <w:tcBorders>
-              <w:top w:val="single" w:sz="4" w:space="0" w:color="8EAADB"/>
-              <w:left w:val="single" w:sz="4" w:space="0" w:color="8EAADB"/>
-              <w:bottom w:val="single" w:sz="4" w:space="0" w:color="8EAADB"/>
-              <w:right w:val="single" w:sz="4" w:space="0" w:color="8EAADB"/>
-            </w:tcBorders>
-            <w:tcMar>
-              <w:top w:w="40" w:type="dxa"/>
-              <w:left w:w="100" w:type="dxa"/>
-              <w:bottom w:w="40" w:type="dxa"/>
-              <w:right w:w="100" w:type="dxa"/>
-            </w:tcMar>
+            <w:tcW w:w="1190" w:type="pct"/>
             <w:vAlign w:val="center"/>
           </w:tcPr>
           <w:p>
             <w:pPr>
-              <w:spacing w:after="0"/>
               <w:jc w:val="center"/>
             </w:pPr>
             <w:r>
@@ -2936,24 +2440,11 @@
         </w:tc>
         <w:tc>
           <w:tcPr>
-            <w:tcW w:w="2400" w:type="dxa"/>
-            <w:tcBorders>
-              <w:top w:val="single" w:sz="4" w:space="0" w:color="8EAADB"/>
-              <w:left w:val="single" w:sz="4" w:space="0" w:color="8EAADB"/>
-              <w:bottom w:val="single" w:sz="4" w:space="0" w:color="8EAADB"/>
-              <w:right w:val="single" w:sz="4" w:space="0" w:color="8EAADB"/>
-            </w:tcBorders>
-            <w:tcMar>
-              <w:top w:w="40" w:type="dxa"/>
-              <w:left w:w="100" w:type="dxa"/>
-              <w:bottom w:w="40" w:type="dxa"/>
-              <w:right w:w="100" w:type="dxa"/>
-            </w:tcMar>
+            <w:tcW w:w="1429" w:type="pct"/>
             <w:vAlign w:val="center"/>
           </w:tcPr>
           <w:p>
             <w:pPr>
-              <w:spacing w:after="0"/>
               <w:jc w:val="center"/>
             </w:pPr>
             <w:r>
@@ -2963,24 +2454,11 @@
         </w:tc>
         <w:tc>
           <w:tcPr>
-            <w:tcW w:w="2000" w:type="dxa"/>
-            <w:tcBorders>
-              <w:top w:val="single" w:sz="4" w:space="0" w:color="8EAADB"/>
-              <w:left w:val="single" w:sz="4" w:space="0" w:color="8EAADB"/>
-              <w:bottom w:val="single" w:sz="4" w:space="0" w:color="8EAADB"/>
-              <w:right w:val="single" w:sz="4" w:space="0" w:color="8EAADB"/>
-            </w:tcBorders>
-            <w:tcMar>
-              <w:top w:w="40" w:type="dxa"/>
-              <w:left w:w="100" w:type="dxa"/>
-              <w:bottom w:w="40" w:type="dxa"/>
-              <w:right w:w="100" w:type="dxa"/>
-            </w:tcMar>
+            <w:tcW w:w="1190" w:type="pct"/>
             <w:vAlign w:val="center"/>
           </w:tcPr>
           <w:p>
             <w:pPr>
-              <w:spacing w:after="0"/>
               <w:jc w:val="center"/>
             </w:pPr>
             <w:r>
@@ -2997,7 +2475,7 @@
           <w:tab w:val="left" w:pos="567"/>
         </w:tabs>
       </w:pPr>
-      <w:bookmarkStart w:id="5" w:name="_Toc241170184"/>
+      <w:bookmarkStart w:id="5" w:name="_Toc241172435"/>
       <w:r>
         <w:lastRenderedPageBreak/>
         <w:t>6</w:t>
@@ -3338,10 +2816,10 @@
           <w:noProof/>
         </w:rPr>
         <w:drawing>
-          <wp:inline distT="0" distB="0" distL="0" distR="0" wp14:anchorId="3D3A5BAA" wp14:editId="0B1156CD">
+          <wp:inline distT="0" distB="0" distL="0" distR="0" wp14:anchorId="733BFBF1" wp14:editId="2853260F">
             <wp:extent cx="5143500" cy="3111500"/>
             <wp:effectExtent l="0" t="0" r="0" b="0"/>
-            <wp:docPr id="517436092" name="Diagram 1" descr="Punktdiagram af kraften F som funktion af forlængelsen Δx med lineær tendenslinje: y = 19,95x + 0,0024, R² = 0,9998."/>
+            <wp:docPr id="324363896" name="Diagram 1" descr="Punktdiagram af kraften F som funktion af forlængelsen Δx med lineær tendenslinje: y = 19,95x + 0,0024, R² = 0,9998."/>
             <wp:cNvGraphicFramePr/>
             <a:graphic xmlns:a="http://schemas.openxmlformats.org/drawingml/2006/main">
               <a:graphicData uri="http://schemas.openxmlformats.org/drawingml/2006/chart">
@@ -3474,7 +2952,7 @@
           <w:tab w:val="left" w:pos="567"/>
         </w:tabs>
       </w:pPr>
-      <w:bookmarkStart w:id="6" w:name="_Toc241170185"/>
+      <w:bookmarkStart w:id="6" w:name="_Toc241172436"/>
       <w:r>
         <w:t>7</w:t>
       </w:r>
@@ -3622,7 +3100,7 @@
           <w:tab w:val="left" w:pos="567"/>
         </w:tabs>
       </w:pPr>
-      <w:bookmarkStart w:id="7" w:name="_Toc241170186"/>
+      <w:bookmarkStart w:id="7" w:name="_Toc241172437"/>
       <w:r>
         <w:t>8</w:t>
       </w:r>
@@ -3936,64 +3414,10 @@
 <file path=word/numbering.xml><?xml version="1.0" encoding="utf-8"?>
 <w:numbering xmlns:wpc="http://schemas.microsoft.com/office/word/2010/wordprocessingCanvas" xmlns:cx="http://schemas.microsoft.com/office/drawing/2014/chartex" xmlns:cx1="http://schemas.microsoft.com/office/drawing/2015/9/8/chartex" xmlns:cx2="http://schemas.microsoft.com/office/drawing/2015/10/21/chartex" xmlns:cx3="http://schemas.microsoft.com/office/drawing/2016/5/9/chartex" xmlns:cx4="http://schemas.microsoft.com/office/drawing/2016/5/10/chartex" xmlns:cx5="http://schemas.microsoft.com/office/drawing/2016/5/11/chartex" xmlns:cx6="http://schemas.microsoft.com/office/drawing/2016/5/12/chartex" xmlns:cx7="http://schemas.microsoft.com/office/drawing/2016/5/13/chartex" xmlns:cx8="http://schemas.microsoft.com/office/drawing/2016/5/14/chartex" xmlns:mc="http://schemas.openxmlformats.org/markup-compatibility/2006" xmlns:aink="http://schemas.microsoft.com/office/drawing/2016/ink" xmlns:am3d="http://schemas.microsoft.com/office/drawing/2017/model3d" xmlns:o="urn:schemas-microsoft-com:office:office" xmlns:oel="http://schemas.microsoft.com/office/2019/extlst" xmlns:r="http://schemas.openxmlformats.org/officeDocument/2006/relationships" xmlns:m="http://schemas.openxmlformats.org/officeDocument/2006/math" xmlns:v="urn:schemas-microsoft-com:vml" xmlns:wp14="http://schemas.microsoft.com/office/word/2010/wordprocessingDrawing" xmlns:wp="http://schemas.openxmlformats.org/drawingml/2006/wordprocessingDrawing" xmlns:w10="urn:schemas-microsoft-com:office:word" xmlns:w="http://schemas.openxmlformats.org/wordprocessingml/2006/main" xmlns:w14="http://schemas.microsoft.com/office/word/2010/wordml" xmlns:w15="http://schemas.microsoft.com/office/word/2012/wordml" xmlns:w16cex="http://schemas.microsoft.com/office/word/2018/wordml/cex" xmlns:w16cid="http://schemas.microsoft.com/office/word/2016/wordml/cid" xmlns:w16="http://schemas.microsoft.com/office/word/2018/wordml" xmlns:w16du="http://schemas.microsoft.com/office/word/2023/wordml/word16du" xmlns:w16sdtdh="http://schemas.microsoft.com/office/word/2020/wordml/sdtdatahash" xmlns:w16sdtfl="http://schemas.microsoft.com/office/word/2024/wordml/sdtformatlock" xmlns:w16se="http://schemas.microsoft.com/office/word/2015/wordml/symex" xmlns:wpg="http://schemas.microsoft.com/office/word/2010/wordprocessingGroup" xmlns:wpi="http://schemas.microsoft.com/office/word/2010/wordprocessingInk" xmlns:wne="http://schemas.microsoft.com/office/word/2006/wordml" xmlns:wps="http://schemas.microsoft.com/office/word/2010/wordprocessingShape" mc:Ignorable="w14 w15 w16se w16cid w16 w16cex w16sdtdh w16sdtfl w16du wp14">
   <w:abstractNum w:abstractNumId="0" w15:restartNumberingAfterBreak="0">
-    <w:nsid w:val="11F81BAF"/>
+    <w:nsid w:val="34A8509B"/>
     <w:multiLevelType w:val="hybridMultilevel"/>
-    <w:tmpl w:val="750001DC"/>
-    <w:lvl w:ilvl="0" w:tplc="9E640BBA">
-      <w:start w:val="1"/>
-      <w:numFmt w:val="bullet"/>
-      <w:lvlText w:val="•"/>
-      <w:lvlJc w:val="left"/>
-      <w:pPr>
-        <w:ind w:left="720" w:hanging="360"/>
-      </w:pPr>
-    </w:lvl>
-    <w:lvl w:ilvl="1" w:tplc="50428662">
-      <w:numFmt w:val="decimal"/>
-      <w:lvlText w:val=""/>
-      <w:lvlJc w:val="left"/>
-    </w:lvl>
-    <w:lvl w:ilvl="2" w:tplc="0666DEDE">
-      <w:numFmt w:val="decimal"/>
-      <w:lvlText w:val=""/>
-      <w:lvlJc w:val="left"/>
-    </w:lvl>
-    <w:lvl w:ilvl="3" w:tplc="6FF0E5CC">
-      <w:numFmt w:val="decimal"/>
-      <w:lvlText w:val=""/>
-      <w:lvlJc w:val="left"/>
-    </w:lvl>
-    <w:lvl w:ilvl="4" w:tplc="613CA3F6">
-      <w:numFmt w:val="decimal"/>
-      <w:lvlText w:val=""/>
-      <w:lvlJc w:val="left"/>
-    </w:lvl>
-    <w:lvl w:ilvl="5" w:tplc="810C41A0">
-      <w:numFmt w:val="decimal"/>
-      <w:lvlText w:val=""/>
-      <w:lvlJc w:val="left"/>
-    </w:lvl>
-    <w:lvl w:ilvl="6" w:tplc="2B4C8E48">
-      <w:numFmt w:val="decimal"/>
-      <w:lvlText w:val=""/>
-      <w:lvlJc w:val="left"/>
-    </w:lvl>
-    <w:lvl w:ilvl="7" w:tplc="FE107794">
-      <w:numFmt w:val="decimal"/>
-      <w:lvlText w:val=""/>
-      <w:lvlJc w:val="left"/>
-    </w:lvl>
-    <w:lvl w:ilvl="8" w:tplc="F10CE58A">
-      <w:numFmt w:val="decimal"/>
-      <w:lvlText w:val=""/>
-      <w:lvlJc w:val="left"/>
-    </w:lvl>
-  </w:abstractNum>
-  <w:abstractNum w:abstractNumId="1" w15:restartNumberingAfterBreak="0">
-    <w:nsid w:val="1D58613C"/>
-    <w:multiLevelType w:val="hybridMultilevel"/>
-    <w:tmpl w:val="E81C16D0"/>
-    <w:lvl w:ilvl="0" w:tplc="80FCCA2C">
+    <w:tmpl w:val="22FA4F82"/>
+    <w:lvl w:ilvl="0" w:tplc="AA340B5E">
       <w:start w:val="1"/>
       <w:numFmt w:val="bullet"/>
       <w:lvlText w:val="●"/>
@@ -4002,7 +3426,7 @@
         <w:ind w:left="720" w:hanging="360"/>
       </w:pPr>
     </w:lvl>
-    <w:lvl w:ilvl="1" w:tplc="9DE4B194">
+    <w:lvl w:ilvl="1" w:tplc="92CAE5FA">
       <w:start w:val="1"/>
       <w:numFmt w:val="bullet"/>
       <w:lvlText w:val="○"/>
@@ -4011,7 +3435,7 @@
         <w:ind w:left="1440" w:hanging="360"/>
       </w:pPr>
     </w:lvl>
-    <w:lvl w:ilvl="2" w:tplc="F4E6B98E">
+    <w:lvl w:ilvl="2" w:tplc="513A975C">
       <w:start w:val="1"/>
       <w:numFmt w:val="bullet"/>
       <w:lvlText w:val="■"/>
@@ -4020,7 +3444,7 @@
         <w:ind w:left="2160" w:hanging="360"/>
       </w:pPr>
     </w:lvl>
-    <w:lvl w:ilvl="3" w:tplc="F0B278EE">
+    <w:lvl w:ilvl="3" w:tplc="1E8E9EF6">
       <w:start w:val="1"/>
       <w:numFmt w:val="bullet"/>
       <w:lvlText w:val="●"/>
@@ -4029,7 +3453,7 @@
         <w:ind w:left="2880" w:hanging="360"/>
       </w:pPr>
     </w:lvl>
-    <w:lvl w:ilvl="4" w:tplc="CC28C504">
+    <w:lvl w:ilvl="4" w:tplc="D48A5686">
       <w:start w:val="1"/>
       <w:numFmt w:val="bullet"/>
       <w:lvlText w:val="○"/>
@@ -4038,7 +3462,7 @@
         <w:ind w:left="3600" w:hanging="360"/>
       </w:pPr>
     </w:lvl>
-    <w:lvl w:ilvl="5" w:tplc="C7B874FA">
+    <w:lvl w:ilvl="5" w:tplc="C868C4DC">
       <w:start w:val="1"/>
       <w:numFmt w:val="bullet"/>
       <w:lvlText w:val="■"/>
@@ -4047,7 +3471,7 @@
         <w:ind w:left="4320" w:hanging="360"/>
       </w:pPr>
     </w:lvl>
-    <w:lvl w:ilvl="6" w:tplc="16E01636">
+    <w:lvl w:ilvl="6" w:tplc="E16453A2">
       <w:start w:val="1"/>
       <w:numFmt w:val="bullet"/>
       <w:lvlText w:val="●"/>
@@ -4056,7 +3480,7 @@
         <w:ind w:left="5040" w:hanging="360"/>
       </w:pPr>
     </w:lvl>
-    <w:lvl w:ilvl="7" w:tplc="5DB8B06C">
+    <w:lvl w:ilvl="7" w:tplc="D09A3962">
       <w:start w:val="1"/>
       <w:numFmt w:val="bullet"/>
       <w:lvlText w:val="●"/>
@@ -4065,7 +3489,7 @@
         <w:ind w:left="5760" w:hanging="360"/>
       </w:pPr>
     </w:lvl>
-    <w:lvl w:ilvl="8" w:tplc="A0D22912">
+    <w:lvl w:ilvl="8" w:tplc="F34C6122">
       <w:start w:val="1"/>
       <w:numFmt w:val="bullet"/>
       <w:lvlText w:val="●"/>
@@ -4075,11 +3499,11 @@
       </w:pPr>
     </w:lvl>
   </w:abstractNum>
-  <w:abstractNum w:abstractNumId="2" w15:restartNumberingAfterBreak="0">
-    <w:nsid w:val="5C5C7A88"/>
+  <w:abstractNum w:abstractNumId="1" w15:restartNumberingAfterBreak="0">
+    <w:nsid w:val="36AF1F51"/>
     <w:multiLevelType w:val="hybridMultilevel"/>
-    <w:tmpl w:val="2F145E18"/>
-    <w:lvl w:ilvl="0" w:tplc="363C03A2">
+    <w:tmpl w:val="22764BC0"/>
+    <w:lvl w:ilvl="0" w:tplc="7ED432AE">
       <w:start w:val="1"/>
       <w:numFmt w:val="decimal"/>
       <w:lvlText w:val="%1."/>
@@ -4088,61 +3512,115 @@
         <w:ind w:left="720" w:hanging="360"/>
       </w:pPr>
     </w:lvl>
-    <w:lvl w:ilvl="1" w:tplc="D5F0101C">
+    <w:lvl w:ilvl="1" w:tplc="93C2E482">
       <w:numFmt w:val="decimal"/>
       <w:lvlText w:val=""/>
       <w:lvlJc w:val="left"/>
     </w:lvl>
-    <w:lvl w:ilvl="2" w:tplc="767C178C">
+    <w:lvl w:ilvl="2" w:tplc="EDEE5AB8">
       <w:numFmt w:val="decimal"/>
       <w:lvlText w:val=""/>
       <w:lvlJc w:val="left"/>
     </w:lvl>
-    <w:lvl w:ilvl="3" w:tplc="A156E088">
+    <w:lvl w:ilvl="3" w:tplc="BA54A83A">
       <w:numFmt w:val="decimal"/>
       <w:lvlText w:val=""/>
       <w:lvlJc w:val="left"/>
     </w:lvl>
-    <w:lvl w:ilvl="4" w:tplc="73D67970">
+    <w:lvl w:ilvl="4" w:tplc="25685EA2">
       <w:numFmt w:val="decimal"/>
       <w:lvlText w:val=""/>
       <w:lvlJc w:val="left"/>
     </w:lvl>
-    <w:lvl w:ilvl="5" w:tplc="184A3012">
+    <w:lvl w:ilvl="5" w:tplc="C8DA02EE">
       <w:numFmt w:val="decimal"/>
       <w:lvlText w:val=""/>
       <w:lvlJc w:val="left"/>
     </w:lvl>
-    <w:lvl w:ilvl="6" w:tplc="8BEC407C">
+    <w:lvl w:ilvl="6" w:tplc="B35E98F6">
       <w:numFmt w:val="decimal"/>
       <w:lvlText w:val=""/>
       <w:lvlJc w:val="left"/>
     </w:lvl>
-    <w:lvl w:ilvl="7" w:tplc="46CED1F6">
+    <w:lvl w:ilvl="7" w:tplc="98E8A440">
       <w:numFmt w:val="decimal"/>
       <w:lvlText w:val=""/>
       <w:lvlJc w:val="left"/>
     </w:lvl>
-    <w:lvl w:ilvl="8" w:tplc="744C0F62">
+    <w:lvl w:ilvl="8" w:tplc="DCEA8F48">
       <w:numFmt w:val="decimal"/>
       <w:lvlText w:val=""/>
       <w:lvlJc w:val="left"/>
     </w:lvl>
   </w:abstractNum>
-  <w:num w:numId="1" w16cid:durableId="1285694698">
-    <w:abstractNumId w:val="1"/>
-    <w:lvlOverride w:ilvl="0">
-      <w:startOverride w:val="1"/>
-    </w:lvlOverride>
-  </w:num>
-  <w:num w:numId="2" w16cid:durableId="1889679027">
+  <w:abstractNum w:abstractNumId="2" w15:restartNumberingAfterBreak="0">
+    <w:nsid w:val="784826D3"/>
+    <w:multiLevelType w:val="hybridMultilevel"/>
+    <w:tmpl w:val="273214DC"/>
+    <w:lvl w:ilvl="0" w:tplc="8550CF08">
+      <w:start w:val="1"/>
+      <w:numFmt w:val="bullet"/>
+      <w:lvlText w:val="•"/>
+      <w:lvlJc w:val="left"/>
+      <w:pPr>
+        <w:ind w:left="720" w:hanging="360"/>
+      </w:pPr>
+    </w:lvl>
+    <w:lvl w:ilvl="1" w:tplc="1E224F1C">
+      <w:numFmt w:val="decimal"/>
+      <w:lvlText w:val=""/>
+      <w:lvlJc w:val="left"/>
+    </w:lvl>
+    <w:lvl w:ilvl="2" w:tplc="5B58AACE">
+      <w:numFmt w:val="decimal"/>
+      <w:lvlText w:val=""/>
+      <w:lvlJc w:val="left"/>
+    </w:lvl>
+    <w:lvl w:ilvl="3" w:tplc="38184600">
+      <w:numFmt w:val="decimal"/>
+      <w:lvlText w:val=""/>
+      <w:lvlJc w:val="left"/>
+    </w:lvl>
+    <w:lvl w:ilvl="4" w:tplc="EBB8A8C8">
+      <w:numFmt w:val="decimal"/>
+      <w:lvlText w:val=""/>
+      <w:lvlJc w:val="left"/>
+    </w:lvl>
+    <w:lvl w:ilvl="5" w:tplc="717C13D4">
+      <w:numFmt w:val="decimal"/>
+      <w:lvlText w:val=""/>
+      <w:lvlJc w:val="left"/>
+    </w:lvl>
+    <w:lvl w:ilvl="6" w:tplc="2C089A76">
+      <w:numFmt w:val="decimal"/>
+      <w:lvlText w:val=""/>
+      <w:lvlJc w:val="left"/>
+    </w:lvl>
+    <w:lvl w:ilvl="7" w:tplc="4B78C5A0">
+      <w:numFmt w:val="decimal"/>
+      <w:lvlText w:val=""/>
+      <w:lvlJc w:val="left"/>
+    </w:lvl>
+    <w:lvl w:ilvl="8" w:tplc="1A3A7AFA">
+      <w:numFmt w:val="decimal"/>
+      <w:lvlText w:val=""/>
+      <w:lvlJc w:val="left"/>
+    </w:lvl>
+  </w:abstractNum>
+  <w:num w:numId="1" w16cid:durableId="2030718331">
     <w:abstractNumId w:val="0"/>
     <w:lvlOverride w:ilvl="0">
       <w:startOverride w:val="1"/>
     </w:lvlOverride>
   </w:num>
-  <w:num w:numId="3" w16cid:durableId="721641168">
+  <w:num w:numId="2" w16cid:durableId="320744626">
     <w:abstractNumId w:val="2"/>
+    <w:lvlOverride w:ilvl="0">
+      <w:startOverride w:val="1"/>
+    </w:lvlOverride>
+  </w:num>
+  <w:num w:numId="3" w16cid:durableId="209928343">
+    <w:abstractNumId w:val="1"/>
     <w:lvlOverride w:ilvl="0">
       <w:startOverride w:val="1"/>
     </w:lvlOverride>
@@ -4800,10 +4278,67 @@
     <w:autoRedefine/>
     <w:uiPriority w:val="39"/>
     <w:unhideWhenUsed/>
-    <w:rsid w:val="004248D7"/>
+    <w:rsid w:val="00243386"/>
     <w:pPr>
       <w:spacing w:after="100"/>
     </w:pPr>
+  </w:style>
+  <w:style w:type="table" w:styleId="Gittertabel1-lys-farve1">
+    <w:name w:val="Grid Table 1 Light Accent 1"/>
+    <w:basedOn w:val="Tabel-Normal"/>
+    <w:uiPriority w:val="46"/>
+    <w:rsid w:val="00243386"/>
+    <w:pPr>
+      <w:spacing w:after="0" w:line="240" w:lineRule="auto"/>
+    </w:pPr>
+    <w:tblPr>
+      <w:tblStyleRowBandSize w:val="1"/>
+      <w:tblStyleColBandSize w:val="1"/>
+      <w:tblBorders>
+        <w:top w:val="single" w:sz="4" w:space="0" w:color="83CAEB" w:themeColor="accent1" w:themeTint="66"/>
+        <w:left w:val="single" w:sz="4" w:space="0" w:color="83CAEB" w:themeColor="accent1" w:themeTint="66"/>
+        <w:bottom w:val="single" w:sz="4" w:space="0" w:color="83CAEB" w:themeColor="accent1" w:themeTint="66"/>
+        <w:right w:val="single" w:sz="4" w:space="0" w:color="83CAEB" w:themeColor="accent1" w:themeTint="66"/>
+        <w:insideH w:val="single" w:sz="4" w:space="0" w:color="83CAEB" w:themeColor="accent1" w:themeTint="66"/>
+        <w:insideV w:val="single" w:sz="4" w:space="0" w:color="83CAEB" w:themeColor="accent1" w:themeTint="66"/>
+      </w:tblBorders>
+    </w:tblPr>
+    <w:tblStylePr w:type="firstRow">
+      <w:rPr>
+        <w:b/>
+        <w:bCs/>
+      </w:rPr>
+      <w:tblPr/>
+      <w:tcPr>
+        <w:tcBorders>
+          <w:bottom w:val="single" w:sz="12" w:space="0" w:color="45B0E1" w:themeColor="accent1" w:themeTint="99"/>
+        </w:tcBorders>
+      </w:tcPr>
+    </w:tblStylePr>
+    <w:tblStylePr w:type="lastRow">
+      <w:rPr>
+        <w:b/>
+        <w:bCs/>
+      </w:rPr>
+      <w:tblPr/>
+      <w:tcPr>
+        <w:tcBorders>
+          <w:top w:val="double" w:sz="2" w:space="0" w:color="45B0E1" w:themeColor="accent1" w:themeTint="99"/>
+        </w:tcBorders>
+      </w:tcPr>
+    </w:tblStylePr>
+    <w:tblStylePr w:type="firstCol">
+      <w:rPr>
+        <w:b/>
+        <w:bCs/>
+      </w:rPr>
+    </w:tblStylePr>
+    <w:tblStylePr w:type="lastCol">
+      <w:rPr>
+        <w:b/>
+        <w:bCs/>
+      </w:rPr>
+    </w:tblStylePr>
   </w:style>
 </w:styles>
 </file>
@@ -5011,7 +4546,7 @@
           <c:smooth val="0"/>
           <c:extLst>
             <c:ext xmlns:c16="http://schemas.microsoft.com/office/drawing/2014/chart" uri="{C3380CC4-5D6E-409C-BE32-E72D297353CC}">
-              <c16:uniqueId val="{00000000-E50E-4C36-BC65-9D5919BAB223}"/>
+              <c16:uniqueId val="{00000000-8A2F-4353-95C4-A93B5723AB36}"/>
             </c:ext>
           </c:extLst>
         </c:ser>
@@ -5023,11 +4558,11 @@
           <c:showPercent val="0"/>
           <c:showBubbleSize val="0"/>
         </c:dLbls>
-        <c:axId val="2051632047"/>
-        <c:axId val="1834013903"/>
+        <c:axId val="239089200"/>
+        <c:axId val="4645872"/>
       </c:scatterChart>
       <c:valAx>
-        <c:axId val="2051632047"/>
+        <c:axId val="239089200"/>
         <c:scaling>
           <c:orientation val="minMax"/>
           <c:max val="0.16"/>
@@ -5149,13 +4684,13 @@
             <a:endParaRPr lang="da-DK"/>
           </a:p>
         </c:txPr>
-        <c:crossAx val="1834013903"/>
+        <c:crossAx val="4645872"/>
         <c:crosses val="autoZero"/>
         <c:crossBetween val="midCat"/>
         <c:majorUnit val="0.02"/>
       </c:valAx>
       <c:valAx>
-        <c:axId val="1834013903"/>
+        <c:axId val="4645872"/>
         <c:scaling>
           <c:orientation val="minMax"/>
           <c:max val="3.5"/>
@@ -5266,7 +4801,7 @@
             <a:endParaRPr lang="da-DK"/>
           </a:p>
         </c:txPr>
-        <c:crossAx val="2051632047"/>
+        <c:crossAx val="239089200"/>
         <c:crosses val="autoZero"/>
         <c:crossBetween val="midCat"/>
         <c:majorUnit val="0.5"/>

</xml_diff>

<commit_message>
Guide: Tabel- og figurtekster, og krydshenvisninger i journalen
- Ny Word-guide: tabeltekst over, figurtekst under, godt indhold, Krydshenvisning og Opdater felt
- Journalen bruger rigtige krydshenvisninger (Figur 1, Tabel 1, Figur 2) via [[REF:...]] i build
- Ny kommentar om tabel- og figurtekster; figurtekst-sætninger fjernet fra de andre kommentarer
- Tabelguiden hedder nu "Tabel i Word" (tabel-i-word.html) og slutter med link til den nye guide
- Grafguidens trin 8 linker til den nye guide

Co-Authored-By: Claude Opus 5.5 (1M context) <noreply@anthropic.com>
</commit_message>
<xml_diff>
--- a/journal/Hookes lov - journal.docx
+++ b/journal/Hookes lov - journal.docx
@@ -53,7 +53,7 @@
           <w:noProof/>
         </w:rPr>
         <w:drawing>
-          <wp:inline distT="0" distB="0" distL="0" distR="0" wp14:anchorId="01B6F76D" wp14:editId="633EBB9B">
+          <wp:inline distT="0" distB="0" distL="0" distR="0" wp14:anchorId="39E43945" wp14:editId="0375CE88">
             <wp:extent cx="1809750" cy="1876425"/>
             <wp:effectExtent l="0" t="0" r="0" b="0"/>
             <wp:docPr id="1" name="Billede 1"/>
@@ -387,7 +387,7 @@
     <w:sdt>
       <w:sdtPr>
         <w:alias w:val="Indholdsfortegnelse"/>
-        <w:id w:val="414747230"/>
+        <w:id w:val="1381360670"/>
       </w:sdtPr>
       <w:sdtEndPr/>
       <w:sdtContent>
@@ -416,7 +416,7 @@
           <w:r>
             <w:fldChar w:fldCharType="separate"/>
           </w:r>
-          <w:hyperlink w:anchor="_Toc241172430" w:history="1">
+          <w:hyperlink w:anchor="_Toc241172850" w:history="1">
             <w:r>
               <w:rPr>
                 <w:rStyle w:val="Hyperlink"/>
@@ -458,7 +458,7 @@
               <w:rPr>
                 <w:noProof/>
               </w:rPr>
-              <w:instrText xml:space="preserve"> PAGEREF _Toc241172430 \h </w:instrText>
+              <w:instrText xml:space="preserve"> PAGEREF _Toc241172850 \h </w:instrText>
             </w:r>
             <w:r>
               <w:rPr>
@@ -501,7 +501,7 @@
               <w14:ligatures w14:val="standardContextual"/>
             </w:rPr>
           </w:pPr>
-          <w:hyperlink w:anchor="_Toc241172431" w:history="1">
+          <w:hyperlink w:anchor="_Toc241172851" w:history="1">
             <w:r>
               <w:rPr>
                 <w:rStyle w:val="Hyperlink"/>
@@ -543,7 +543,7 @@
               <w:rPr>
                 <w:noProof/>
               </w:rPr>
-              <w:instrText xml:space="preserve"> PAGEREF _Toc241172431 \h </w:instrText>
+              <w:instrText xml:space="preserve"> PAGEREF _Toc241172851 \h </w:instrText>
             </w:r>
             <w:r>
               <w:rPr>
@@ -586,7 +586,7 @@
               <w14:ligatures w14:val="standardContextual"/>
             </w:rPr>
           </w:pPr>
-          <w:hyperlink w:anchor="_Toc241172432" w:history="1">
+          <w:hyperlink w:anchor="_Toc241172852" w:history="1">
             <w:r>
               <w:rPr>
                 <w:rStyle w:val="Hyperlink"/>
@@ -628,7 +628,7 @@
               <w:rPr>
                 <w:noProof/>
               </w:rPr>
-              <w:instrText xml:space="preserve"> PAGEREF _Toc241172432 \h </w:instrText>
+              <w:instrText xml:space="preserve"> PAGEREF _Toc241172852 \h </w:instrText>
             </w:r>
             <w:r>
               <w:rPr>
@@ -671,7 +671,7 @@
               <w14:ligatures w14:val="standardContextual"/>
             </w:rPr>
           </w:pPr>
-          <w:hyperlink w:anchor="_Toc241172433" w:history="1">
+          <w:hyperlink w:anchor="_Toc241172853" w:history="1">
             <w:r>
               <w:rPr>
                 <w:rStyle w:val="Hyperlink"/>
@@ -713,7 +713,7 @@
               <w:rPr>
                 <w:noProof/>
               </w:rPr>
-              <w:instrText xml:space="preserve"> PAGEREF _Toc241172433 \h </w:instrText>
+              <w:instrText xml:space="preserve"> PAGEREF _Toc241172853 \h </w:instrText>
             </w:r>
             <w:r>
               <w:rPr>
@@ -756,7 +756,7 @@
               <w14:ligatures w14:val="standardContextual"/>
             </w:rPr>
           </w:pPr>
-          <w:hyperlink w:anchor="_Toc241172434" w:history="1">
+          <w:hyperlink w:anchor="_Toc241172854" w:history="1">
             <w:r>
               <w:rPr>
                 <w:rStyle w:val="Hyperlink"/>
@@ -798,7 +798,7 @@
               <w:rPr>
                 <w:noProof/>
               </w:rPr>
-              <w:instrText xml:space="preserve"> PAGEREF _Toc241172434 \h </w:instrText>
+              <w:instrText xml:space="preserve"> PAGEREF _Toc241172854 \h </w:instrText>
             </w:r>
             <w:r>
               <w:rPr>
@@ -841,7 +841,7 @@
               <w14:ligatures w14:val="standardContextual"/>
             </w:rPr>
           </w:pPr>
-          <w:hyperlink w:anchor="_Toc241172435" w:history="1">
+          <w:hyperlink w:anchor="_Toc241172855" w:history="1">
             <w:r>
               <w:rPr>
                 <w:rStyle w:val="Hyperlink"/>
@@ -883,7 +883,7 @@
               <w:rPr>
                 <w:noProof/>
               </w:rPr>
-              <w:instrText xml:space="preserve"> PAGEREF _Toc241172435 \h </w:instrText>
+              <w:instrText xml:space="preserve"> PAGEREF _Toc241172855 \h </w:instrText>
             </w:r>
             <w:r>
               <w:rPr>
@@ -926,7 +926,7 @@
               <w14:ligatures w14:val="standardContextual"/>
             </w:rPr>
           </w:pPr>
-          <w:hyperlink w:anchor="_Toc241172436" w:history="1">
+          <w:hyperlink w:anchor="_Toc241172856" w:history="1">
             <w:r>
               <w:rPr>
                 <w:rStyle w:val="Hyperlink"/>
@@ -968,7 +968,7 @@
               <w:rPr>
                 <w:noProof/>
               </w:rPr>
-              <w:instrText xml:space="preserve"> PAGEREF _Toc241172436 \h </w:instrText>
+              <w:instrText xml:space="preserve"> PAGEREF _Toc241172856 \h </w:instrText>
             </w:r>
             <w:r>
               <w:rPr>
@@ -1011,7 +1011,7 @@
               <w14:ligatures w14:val="standardContextual"/>
             </w:rPr>
           </w:pPr>
-          <w:hyperlink w:anchor="_Toc241172437" w:history="1">
+          <w:hyperlink w:anchor="_Toc241172857" w:history="1">
             <w:r>
               <w:rPr>
                 <w:rStyle w:val="Hyperlink"/>
@@ -1053,7 +1053,7 @@
               <w:rPr>
                 <w:noProof/>
               </w:rPr>
-              <w:instrText xml:space="preserve"> PAGEREF _Toc241172437 \h </w:instrText>
+              <w:instrText xml:space="preserve"> PAGEREF _Toc241172857 \h </w:instrText>
             </w:r>
             <w:r>
               <w:rPr>
@@ -1094,7 +1094,7 @@
           <w:tab w:val="left" w:pos="567"/>
         </w:tabs>
       </w:pPr>
-      <w:bookmarkStart w:id="0" w:name="_Toc241172430"/>
+      <w:bookmarkStart w:id="0" w:name="_Toc241172850"/>
       <w:r>
         <w:t>1</w:t>
       </w:r>
@@ -1149,7 +1149,7 @@
           <w:tab w:val="left" w:pos="567"/>
         </w:tabs>
       </w:pPr>
-      <w:bookmarkStart w:id="1" w:name="_Toc241172431"/>
+      <w:bookmarkStart w:id="1" w:name="_Toc241172851"/>
       <w:r>
         <w:t>2</w:t>
       </w:r>
@@ -1508,7 +1508,7 @@
           <w:tab w:val="left" w:pos="567"/>
         </w:tabs>
       </w:pPr>
-      <w:bookmarkStart w:id="2" w:name="_Toc241172432"/>
+      <w:bookmarkStart w:id="2" w:name="_Toc241172852"/>
       <w:r>
         <w:t>3</w:t>
       </w:r>
@@ -1636,6 +1636,25 @@
     </w:p>
     <w:p>
       <w:pPr>
+        <w:spacing w:before="120"/>
+      </w:pPr>
+      <w:fldSimple w:instr=" REF _Ref241172847 ">
+        <w:r>
+          <w:t xml:space="preserve">Figur </w:t>
+        </w:r>
+        <w:r>
+          <w:rPr>
+            <w:noProof/>
+          </w:rPr>
+          <w:t>1</w:t>
+        </w:r>
+      </w:fldSimple>
+      <w:r>
+        <w:t xml:space="preserve"> viser opstillingen.</w:t>
+      </w:r>
+    </w:p>
+    <w:p>
+      <w:pPr>
         <w:keepNext/>
         <w:spacing w:before="120" w:after="60"/>
         <w:jc w:val="center"/>
@@ -1645,10 +1664,10 @@
           <w:noProof/>
         </w:rPr>
         <w:drawing>
-          <wp:inline distT="0" distB="0" distL="0" distR="0" wp14:anchorId="78B00D30" wp14:editId="14F6E027">
+          <wp:inline distT="0" distB="0" distL="0" distR="0" wp14:anchorId="5980EF4D" wp14:editId="42694A25">
             <wp:extent cx="2381250" cy="2466975"/>
             <wp:effectExtent l="0" t="0" r="0" b="0"/>
-            <wp:docPr id="275408699" name="Billede 275408699"/>
+            <wp:docPr id="1320253773" name="Billede 1320253773"/>
             <wp:cNvGraphicFramePr>
               <a:graphicFrameLocks xmlns:a="http://schemas.openxmlformats.org/drawingml/2006/main" noChangeAspect="1"/>
             </wp:cNvGraphicFramePr>
@@ -1689,6 +1708,7 @@
         <w:pStyle w:val="Billedtekst"/>
         <w:jc w:val="center"/>
       </w:pPr>
+      <w:bookmarkStart w:id="3" w:name="_Ref241172847"/>
       <w:r>
         <w:t xml:space="preserve">Figur </w:t>
       </w:r>
@@ -1710,6 +1730,7 @@
       <w:r>
         <w:fldChar w:fldCharType="end"/>
       </w:r>
+      <w:bookmarkEnd w:id="3"/>
       <w:r>
         <w:t xml:space="preserve">: Opstillingen. Viserens position L aflæses på linealen, og forlængelsen er </w:t>
       </w:r>
@@ -1729,7 +1750,7 @@
           <w:tab w:val="left" w:pos="567"/>
         </w:tabs>
       </w:pPr>
-      <w:bookmarkStart w:id="3" w:name="_Toc241172433"/>
+      <w:bookmarkStart w:id="4" w:name="_Toc241172853"/>
       <w:r>
         <w:t>4</w:t>
       </w:r>
@@ -1737,7 +1758,7 @@
         <w:tab/>
         <w:t>Fremgangsmåde</w:t>
       </w:r>
-      <w:bookmarkEnd w:id="3"/>
+      <w:bookmarkEnd w:id="4"/>
     </w:p>
     <w:p>
       <w:pPr>
@@ -1884,7 +1905,7 @@
           <w:tab w:val="left" w:pos="567"/>
         </w:tabs>
       </w:pPr>
-      <w:bookmarkStart w:id="4" w:name="_Toc241172434"/>
+      <w:bookmarkStart w:id="5" w:name="_Toc241172854"/>
       <w:r>
         <w:t>5</w:t>
       </w:r>
@@ -1892,7 +1913,7 @@
         <w:tab/>
         <w:t>Måleresultater</w:t>
       </w:r>
-      <w:bookmarkEnd w:id="4"/>
+      <w:bookmarkEnd w:id="5"/>
     </w:p>
     <w:p>
       <w:r>
@@ -1942,7 +1963,21 @@
         </m:r>
       </m:oMath>
       <w:r>
-        <w:t>. Tabellen viser de målte positioner og de beregnede værdier.</w:t>
+        <w:t xml:space="preserve">. </w:t>
+      </w:r>
+      <w:fldSimple w:instr=" REF _Ref241172848 ">
+        <w:r>
+          <w:t xml:space="preserve">Tabel </w:t>
+        </w:r>
+        <w:r>
+          <w:rPr>
+            <w:noProof/>
+          </w:rPr>
+          <w:t>1</w:t>
+        </w:r>
+      </w:fldSimple>
+      <w:r>
+        <w:t xml:space="preserve"> viser de målte positioner og de beregnede værdier.</w:t>
       </w:r>
     </w:p>
     <w:p>
@@ -1951,6 +1986,7 @@
         <w:keepNext/>
         <w:spacing w:before="120" w:after="80"/>
       </w:pPr>
+      <w:bookmarkStart w:id="6" w:name="_Ref241172848"/>
       <w:r>
         <w:t xml:space="preserve">Tabel </w:t>
       </w:r>
@@ -1972,6 +2008,7 @@
       <w:r>
         <w:fldChar w:fldCharType="end"/>
       </w:r>
+      <w:bookmarkEnd w:id="6"/>
       <w:r>
         <w:t>: Målte og beregnede værdier. L er aflæst med en usikkerhed på ±0,1 cm.</w:t>
       </w:r>
@@ -2475,7 +2512,7 @@
           <w:tab w:val="left" w:pos="567"/>
         </w:tabs>
       </w:pPr>
-      <w:bookmarkStart w:id="5" w:name="_Toc241172435"/>
+      <w:bookmarkStart w:id="7" w:name="_Toc241172855"/>
       <w:r>
         <w:lastRenderedPageBreak/>
         <w:t>6</w:t>
@@ -2484,7 +2521,7 @@
         <w:tab/>
         <w:t>Databehandling</w:t>
       </w:r>
-      <w:bookmarkEnd w:id="5"/>
+      <w:bookmarkEnd w:id="7"/>
     </w:p>
     <w:p>
       <w:r>
@@ -2779,8 +2816,19 @@
       <w:pPr>
         <w:keepNext/>
       </w:pPr>
-      <w:r>
-        <w:t xml:space="preserve">Grafen viser </w:t>
+      <w:fldSimple w:instr=" REF _Ref241172849 ">
+        <w:r>
+          <w:t xml:space="preserve">Figur </w:t>
+        </w:r>
+        <w:r>
+          <w:rPr>
+            <w:noProof/>
+          </w:rPr>
+          <w:t>2</w:t>
+        </w:r>
+      </w:fldSimple>
+      <w:r>
+        <w:t xml:space="preserve"> viser </w:t>
       </w:r>
       <m:oMath>
         <m:r>
@@ -2816,10 +2864,10 @@
           <w:noProof/>
         </w:rPr>
         <w:drawing>
-          <wp:inline distT="0" distB="0" distL="0" distR="0" wp14:anchorId="733BFBF1" wp14:editId="2853260F">
+          <wp:inline distT="0" distB="0" distL="0" distR="0" wp14:anchorId="317276D0" wp14:editId="1838AF81">
             <wp:extent cx="5143500" cy="3111500"/>
             <wp:effectExtent l="0" t="0" r="0" b="0"/>
-            <wp:docPr id="324363896" name="Diagram 1" descr="Punktdiagram af kraften F som funktion af forlængelsen Δx med lineær tendenslinje: y = 19,95x + 0,0024, R² = 0,9998."/>
+            <wp:docPr id="1120199177" name="Diagram 1" descr="Punktdiagram af kraften F som funktion af forlængelsen Δx med lineær tendenslinje: y = 19,95x + 0,0024, R² = 0,9998."/>
             <wp:cNvGraphicFramePr/>
             <a:graphic xmlns:a="http://schemas.openxmlformats.org/drawingml/2006/main">
               <a:graphicData uri="http://schemas.openxmlformats.org/drawingml/2006/chart">
@@ -2835,6 +2883,7 @@
         <w:pStyle w:val="Billedtekst"/>
         <w:jc w:val="center"/>
       </w:pPr>
+      <w:bookmarkStart w:id="8" w:name="_Ref241172849"/>
       <w:r>
         <w:t xml:space="preserve">Figur </w:t>
       </w:r>
@@ -2856,6 +2905,7 @@
       <w:r>
         <w:fldChar w:fldCharType="end"/>
       </w:r>
+      <w:bookmarkEnd w:id="8"/>
       <w:r>
         <w:t xml:space="preserve">: Kraften F som funktion af forlængelsen </w:t>
       </w:r>
@@ -2952,7 +3002,7 @@
           <w:tab w:val="left" w:pos="567"/>
         </w:tabs>
       </w:pPr>
-      <w:bookmarkStart w:id="6" w:name="_Toc241172436"/>
+      <w:bookmarkStart w:id="9" w:name="_Toc241172856"/>
       <w:r>
         <w:t>7</w:t>
       </w:r>
@@ -2960,7 +3010,7 @@
         <w:tab/>
         <w:t>Diskussion</w:t>
       </w:r>
-      <w:bookmarkEnd w:id="6"/>
+      <w:bookmarkEnd w:id="9"/>
     </w:p>
     <w:p>
       <w:r>
@@ -3100,7 +3150,7 @@
           <w:tab w:val="left" w:pos="567"/>
         </w:tabs>
       </w:pPr>
-      <w:bookmarkStart w:id="7" w:name="_Toc241172437"/>
+      <w:bookmarkStart w:id="10" w:name="_Toc241172857"/>
       <w:r>
         <w:t>8</w:t>
       </w:r>
@@ -3108,7 +3158,7 @@
         <w:tab/>
         <w:t>Konklusion</w:t>
       </w:r>
-      <w:bookmarkEnd w:id="7"/>
+      <w:bookmarkEnd w:id="10"/>
     </w:p>
     <w:p>
       <w:r>
@@ -3414,10 +3464,64 @@
 <file path=word/numbering.xml><?xml version="1.0" encoding="utf-8"?>
 <w:numbering xmlns:wpc="http://schemas.microsoft.com/office/word/2010/wordprocessingCanvas" xmlns:cx="http://schemas.microsoft.com/office/drawing/2014/chartex" xmlns:cx1="http://schemas.microsoft.com/office/drawing/2015/9/8/chartex" xmlns:cx2="http://schemas.microsoft.com/office/drawing/2015/10/21/chartex" xmlns:cx3="http://schemas.microsoft.com/office/drawing/2016/5/9/chartex" xmlns:cx4="http://schemas.microsoft.com/office/drawing/2016/5/10/chartex" xmlns:cx5="http://schemas.microsoft.com/office/drawing/2016/5/11/chartex" xmlns:cx6="http://schemas.microsoft.com/office/drawing/2016/5/12/chartex" xmlns:cx7="http://schemas.microsoft.com/office/drawing/2016/5/13/chartex" xmlns:cx8="http://schemas.microsoft.com/office/drawing/2016/5/14/chartex" xmlns:mc="http://schemas.openxmlformats.org/markup-compatibility/2006" xmlns:aink="http://schemas.microsoft.com/office/drawing/2016/ink" xmlns:am3d="http://schemas.microsoft.com/office/drawing/2017/model3d" xmlns:o="urn:schemas-microsoft-com:office:office" xmlns:oel="http://schemas.microsoft.com/office/2019/extlst" xmlns:r="http://schemas.openxmlformats.org/officeDocument/2006/relationships" xmlns:m="http://schemas.openxmlformats.org/officeDocument/2006/math" xmlns:v="urn:schemas-microsoft-com:vml" xmlns:wp14="http://schemas.microsoft.com/office/word/2010/wordprocessingDrawing" xmlns:wp="http://schemas.openxmlformats.org/drawingml/2006/wordprocessingDrawing" xmlns:w10="urn:schemas-microsoft-com:office:word" xmlns:w="http://schemas.openxmlformats.org/wordprocessingml/2006/main" xmlns:w14="http://schemas.microsoft.com/office/word/2010/wordml" xmlns:w15="http://schemas.microsoft.com/office/word/2012/wordml" xmlns:w16cex="http://schemas.microsoft.com/office/word/2018/wordml/cex" xmlns:w16cid="http://schemas.microsoft.com/office/word/2016/wordml/cid" xmlns:w16="http://schemas.microsoft.com/office/word/2018/wordml" xmlns:w16du="http://schemas.microsoft.com/office/word/2023/wordml/word16du" xmlns:w16sdtdh="http://schemas.microsoft.com/office/word/2020/wordml/sdtdatahash" xmlns:w16sdtfl="http://schemas.microsoft.com/office/word/2024/wordml/sdtformatlock" xmlns:w16se="http://schemas.microsoft.com/office/word/2015/wordml/symex" xmlns:wpg="http://schemas.microsoft.com/office/word/2010/wordprocessingGroup" xmlns:wpi="http://schemas.microsoft.com/office/word/2010/wordprocessingInk" xmlns:wne="http://schemas.microsoft.com/office/word/2006/wordml" xmlns:wps="http://schemas.microsoft.com/office/word/2010/wordprocessingShape" mc:Ignorable="w14 w15 w16se w16cid w16 w16cex w16sdtdh w16sdtfl w16du wp14">
   <w:abstractNum w:abstractNumId="0" w15:restartNumberingAfterBreak="0">
-    <w:nsid w:val="34A8509B"/>
+    <w:nsid w:val="15EE7D50"/>
     <w:multiLevelType w:val="hybridMultilevel"/>
-    <w:tmpl w:val="22FA4F82"/>
-    <w:lvl w:ilvl="0" w:tplc="AA340B5E">
+    <w:tmpl w:val="548E5814"/>
+    <w:lvl w:ilvl="0" w:tplc="6764D710">
+      <w:start w:val="1"/>
+      <w:numFmt w:val="decimal"/>
+      <w:lvlText w:val="%1."/>
+      <w:lvlJc w:val="left"/>
+      <w:pPr>
+        <w:ind w:left="720" w:hanging="360"/>
+      </w:pPr>
+    </w:lvl>
+    <w:lvl w:ilvl="1" w:tplc="2800F012">
+      <w:numFmt w:val="decimal"/>
+      <w:lvlText w:val=""/>
+      <w:lvlJc w:val="left"/>
+    </w:lvl>
+    <w:lvl w:ilvl="2" w:tplc="91F62D38">
+      <w:numFmt w:val="decimal"/>
+      <w:lvlText w:val=""/>
+      <w:lvlJc w:val="left"/>
+    </w:lvl>
+    <w:lvl w:ilvl="3" w:tplc="31A4D890">
+      <w:numFmt w:val="decimal"/>
+      <w:lvlText w:val=""/>
+      <w:lvlJc w:val="left"/>
+    </w:lvl>
+    <w:lvl w:ilvl="4" w:tplc="BDB2C6EA">
+      <w:numFmt w:val="decimal"/>
+      <w:lvlText w:val=""/>
+      <w:lvlJc w:val="left"/>
+    </w:lvl>
+    <w:lvl w:ilvl="5" w:tplc="7E121EB8">
+      <w:numFmt w:val="decimal"/>
+      <w:lvlText w:val=""/>
+      <w:lvlJc w:val="left"/>
+    </w:lvl>
+    <w:lvl w:ilvl="6" w:tplc="E086009A">
+      <w:numFmt w:val="decimal"/>
+      <w:lvlText w:val=""/>
+      <w:lvlJc w:val="left"/>
+    </w:lvl>
+    <w:lvl w:ilvl="7" w:tplc="8E643CD0">
+      <w:numFmt w:val="decimal"/>
+      <w:lvlText w:val=""/>
+      <w:lvlJc w:val="left"/>
+    </w:lvl>
+    <w:lvl w:ilvl="8" w:tplc="796E1556">
+      <w:numFmt w:val="decimal"/>
+      <w:lvlText w:val=""/>
+      <w:lvlJc w:val="left"/>
+    </w:lvl>
+  </w:abstractNum>
+  <w:abstractNum w:abstractNumId="1" w15:restartNumberingAfterBreak="0">
+    <w:nsid w:val="195164A5"/>
+    <w:multiLevelType w:val="hybridMultilevel"/>
+    <w:tmpl w:val="D2689096"/>
+    <w:lvl w:ilvl="0" w:tplc="35A66F54">
       <w:start w:val="1"/>
       <w:numFmt w:val="bullet"/>
       <w:lvlText w:val="●"/>
@@ -3426,7 +3530,7 @@
         <w:ind w:left="720" w:hanging="360"/>
       </w:pPr>
     </w:lvl>
-    <w:lvl w:ilvl="1" w:tplc="92CAE5FA">
+    <w:lvl w:ilvl="1" w:tplc="867266FC">
       <w:start w:val="1"/>
       <w:numFmt w:val="bullet"/>
       <w:lvlText w:val="○"/>
@@ -3435,7 +3539,7 @@
         <w:ind w:left="1440" w:hanging="360"/>
       </w:pPr>
     </w:lvl>
-    <w:lvl w:ilvl="2" w:tplc="513A975C">
+    <w:lvl w:ilvl="2" w:tplc="48DA260A">
       <w:start w:val="1"/>
       <w:numFmt w:val="bullet"/>
       <w:lvlText w:val="■"/>
@@ -3444,7 +3548,7 @@
         <w:ind w:left="2160" w:hanging="360"/>
       </w:pPr>
     </w:lvl>
-    <w:lvl w:ilvl="3" w:tplc="1E8E9EF6">
+    <w:lvl w:ilvl="3" w:tplc="C1D210C6">
       <w:start w:val="1"/>
       <w:numFmt w:val="bullet"/>
       <w:lvlText w:val="●"/>
@@ -3453,7 +3557,7 @@
         <w:ind w:left="2880" w:hanging="360"/>
       </w:pPr>
     </w:lvl>
-    <w:lvl w:ilvl="4" w:tplc="D48A5686">
+    <w:lvl w:ilvl="4" w:tplc="CA5EF172">
       <w:start w:val="1"/>
       <w:numFmt w:val="bullet"/>
       <w:lvlText w:val="○"/>
@@ -3462,7 +3566,7 @@
         <w:ind w:left="3600" w:hanging="360"/>
       </w:pPr>
     </w:lvl>
-    <w:lvl w:ilvl="5" w:tplc="C868C4DC">
+    <w:lvl w:ilvl="5" w:tplc="2EE2F144">
       <w:start w:val="1"/>
       <w:numFmt w:val="bullet"/>
       <w:lvlText w:val="■"/>
@@ -3471,7 +3575,7 @@
         <w:ind w:left="4320" w:hanging="360"/>
       </w:pPr>
     </w:lvl>
-    <w:lvl w:ilvl="6" w:tplc="E16453A2">
+    <w:lvl w:ilvl="6" w:tplc="48AAFC78">
       <w:start w:val="1"/>
       <w:numFmt w:val="bullet"/>
       <w:lvlText w:val="●"/>
@@ -3480,7 +3584,7 @@
         <w:ind w:left="5040" w:hanging="360"/>
       </w:pPr>
     </w:lvl>
-    <w:lvl w:ilvl="7" w:tplc="D09A3962">
+    <w:lvl w:ilvl="7" w:tplc="2956324E">
       <w:start w:val="1"/>
       <w:numFmt w:val="bullet"/>
       <w:lvlText w:val="●"/>
@@ -3489,7 +3593,7 @@
         <w:ind w:left="5760" w:hanging="360"/>
       </w:pPr>
     </w:lvl>
-    <w:lvl w:ilvl="8" w:tplc="F34C6122">
+    <w:lvl w:ilvl="8" w:tplc="4E4639A0">
       <w:start w:val="1"/>
       <w:numFmt w:val="bullet"/>
       <w:lvlText w:val="●"/>
@@ -3499,65 +3603,11 @@
       </w:pPr>
     </w:lvl>
   </w:abstractNum>
-  <w:abstractNum w:abstractNumId="1" w15:restartNumberingAfterBreak="0">
-    <w:nsid w:val="36AF1F51"/>
+  <w:abstractNum w:abstractNumId="2" w15:restartNumberingAfterBreak="0">
+    <w:nsid w:val="6C222615"/>
     <w:multiLevelType w:val="hybridMultilevel"/>
-    <w:tmpl w:val="22764BC0"/>
-    <w:lvl w:ilvl="0" w:tplc="7ED432AE">
-      <w:start w:val="1"/>
-      <w:numFmt w:val="decimal"/>
-      <w:lvlText w:val="%1."/>
-      <w:lvlJc w:val="left"/>
-      <w:pPr>
-        <w:ind w:left="720" w:hanging="360"/>
-      </w:pPr>
-    </w:lvl>
-    <w:lvl w:ilvl="1" w:tplc="93C2E482">
-      <w:numFmt w:val="decimal"/>
-      <w:lvlText w:val=""/>
-      <w:lvlJc w:val="left"/>
-    </w:lvl>
-    <w:lvl w:ilvl="2" w:tplc="EDEE5AB8">
-      <w:numFmt w:val="decimal"/>
-      <w:lvlText w:val=""/>
-      <w:lvlJc w:val="left"/>
-    </w:lvl>
-    <w:lvl w:ilvl="3" w:tplc="BA54A83A">
-      <w:numFmt w:val="decimal"/>
-      <w:lvlText w:val=""/>
-      <w:lvlJc w:val="left"/>
-    </w:lvl>
-    <w:lvl w:ilvl="4" w:tplc="25685EA2">
-      <w:numFmt w:val="decimal"/>
-      <w:lvlText w:val=""/>
-      <w:lvlJc w:val="left"/>
-    </w:lvl>
-    <w:lvl w:ilvl="5" w:tplc="C8DA02EE">
-      <w:numFmt w:val="decimal"/>
-      <w:lvlText w:val=""/>
-      <w:lvlJc w:val="left"/>
-    </w:lvl>
-    <w:lvl w:ilvl="6" w:tplc="B35E98F6">
-      <w:numFmt w:val="decimal"/>
-      <w:lvlText w:val=""/>
-      <w:lvlJc w:val="left"/>
-    </w:lvl>
-    <w:lvl w:ilvl="7" w:tplc="98E8A440">
-      <w:numFmt w:val="decimal"/>
-      <w:lvlText w:val=""/>
-      <w:lvlJc w:val="left"/>
-    </w:lvl>
-    <w:lvl w:ilvl="8" w:tplc="DCEA8F48">
-      <w:numFmt w:val="decimal"/>
-      <w:lvlText w:val=""/>
-      <w:lvlJc w:val="left"/>
-    </w:lvl>
-  </w:abstractNum>
-  <w:abstractNum w:abstractNumId="2" w15:restartNumberingAfterBreak="0">
-    <w:nsid w:val="784826D3"/>
-    <w:multiLevelType w:val="hybridMultilevel"/>
-    <w:tmpl w:val="273214DC"/>
-    <w:lvl w:ilvl="0" w:tplc="8550CF08">
+    <w:tmpl w:val="3670DB6C"/>
+    <w:lvl w:ilvl="0" w:tplc="68169CE8">
       <w:start w:val="1"/>
       <w:numFmt w:val="bullet"/>
       <w:lvlText w:val="•"/>
@@ -3566,61 +3616,61 @@
         <w:ind w:left="720" w:hanging="360"/>
       </w:pPr>
     </w:lvl>
-    <w:lvl w:ilvl="1" w:tplc="1E224F1C">
+    <w:lvl w:ilvl="1" w:tplc="EBB2B514">
       <w:numFmt w:val="decimal"/>
       <w:lvlText w:val=""/>
       <w:lvlJc w:val="left"/>
     </w:lvl>
-    <w:lvl w:ilvl="2" w:tplc="5B58AACE">
+    <w:lvl w:ilvl="2" w:tplc="7222FC94">
       <w:numFmt w:val="decimal"/>
       <w:lvlText w:val=""/>
       <w:lvlJc w:val="left"/>
     </w:lvl>
-    <w:lvl w:ilvl="3" w:tplc="38184600">
+    <w:lvl w:ilvl="3" w:tplc="4536A2E6">
       <w:numFmt w:val="decimal"/>
       <w:lvlText w:val=""/>
       <w:lvlJc w:val="left"/>
     </w:lvl>
-    <w:lvl w:ilvl="4" w:tplc="EBB8A8C8">
+    <w:lvl w:ilvl="4" w:tplc="EBE2C75C">
       <w:numFmt w:val="decimal"/>
       <w:lvlText w:val=""/>
       <w:lvlJc w:val="left"/>
     </w:lvl>
-    <w:lvl w:ilvl="5" w:tplc="717C13D4">
+    <w:lvl w:ilvl="5" w:tplc="9B22CDA4">
       <w:numFmt w:val="decimal"/>
       <w:lvlText w:val=""/>
       <w:lvlJc w:val="left"/>
     </w:lvl>
-    <w:lvl w:ilvl="6" w:tplc="2C089A76">
+    <w:lvl w:ilvl="6" w:tplc="B29CB634">
       <w:numFmt w:val="decimal"/>
       <w:lvlText w:val=""/>
       <w:lvlJc w:val="left"/>
     </w:lvl>
-    <w:lvl w:ilvl="7" w:tplc="4B78C5A0">
+    <w:lvl w:ilvl="7" w:tplc="7628798A">
       <w:numFmt w:val="decimal"/>
       <w:lvlText w:val=""/>
       <w:lvlJc w:val="left"/>
     </w:lvl>
-    <w:lvl w:ilvl="8" w:tplc="1A3A7AFA">
+    <w:lvl w:ilvl="8" w:tplc="08A879FC">
       <w:numFmt w:val="decimal"/>
       <w:lvlText w:val=""/>
       <w:lvlJc w:val="left"/>
     </w:lvl>
   </w:abstractNum>
-  <w:num w:numId="1" w16cid:durableId="2030718331">
-    <w:abstractNumId w:val="0"/>
+  <w:num w:numId="1" w16cid:durableId="2081705850">
+    <w:abstractNumId w:val="1"/>
     <w:lvlOverride w:ilvl="0">
       <w:startOverride w:val="1"/>
     </w:lvlOverride>
   </w:num>
-  <w:num w:numId="2" w16cid:durableId="320744626">
+  <w:num w:numId="2" w16cid:durableId="733745604">
     <w:abstractNumId w:val="2"/>
     <w:lvlOverride w:ilvl="0">
       <w:startOverride w:val="1"/>
     </w:lvlOverride>
   </w:num>
-  <w:num w:numId="3" w16cid:durableId="209928343">
-    <w:abstractNumId w:val="1"/>
+  <w:num w:numId="3" w16cid:durableId="1087729867">
+    <w:abstractNumId w:val="0"/>
     <w:lvlOverride w:ilvl="0">
       <w:startOverride w:val="1"/>
     </w:lvlOverride>
@@ -4278,7 +4328,7 @@
     <w:autoRedefine/>
     <w:uiPriority w:val="39"/>
     <w:unhideWhenUsed/>
-    <w:rsid w:val="00243386"/>
+    <w:rsid w:val="00C04F92"/>
     <w:pPr>
       <w:spacing w:after="100"/>
     </w:pPr>
@@ -4287,7 +4337,7 @@
     <w:name w:val="Grid Table 1 Light Accent 1"/>
     <w:basedOn w:val="Tabel-Normal"/>
     <w:uiPriority w:val="46"/>
-    <w:rsid w:val="00243386"/>
+    <w:rsid w:val="00C04F92"/>
     <w:pPr>
       <w:spacing w:after="0" w:line="240" w:lineRule="auto"/>
     </w:pPr>
@@ -4546,7 +4596,7 @@
           <c:smooth val="0"/>
           <c:extLst>
             <c:ext xmlns:c16="http://schemas.microsoft.com/office/drawing/2014/chart" uri="{C3380CC4-5D6E-409C-BE32-E72D297353CC}">
-              <c16:uniqueId val="{00000000-8A2F-4353-95C4-A93B5723AB36}"/>
+              <c16:uniqueId val="{00000000-8595-4872-B9AD-52A6EB53A018}"/>
             </c:ext>
           </c:extLst>
         </c:ser>
@@ -4558,11 +4608,11 @@
           <c:showPercent val="0"/>
           <c:showBubbleSize val="0"/>
         </c:dLbls>
-        <c:axId val="239089200"/>
-        <c:axId val="4645872"/>
+        <c:axId val="1984583695"/>
+        <c:axId val="1771603535"/>
       </c:scatterChart>
       <c:valAx>
-        <c:axId val="239089200"/>
+        <c:axId val="1984583695"/>
         <c:scaling>
           <c:orientation val="minMax"/>
           <c:max val="0.16"/>
@@ -4684,13 +4734,13 @@
             <a:endParaRPr lang="da-DK"/>
           </a:p>
         </c:txPr>
-        <c:crossAx val="4645872"/>
+        <c:crossAx val="1771603535"/>
         <c:crosses val="autoZero"/>
         <c:crossBetween val="midCat"/>
         <c:majorUnit val="0.02"/>
       </c:valAx>
       <c:valAx>
-        <c:axId val="4645872"/>
+        <c:axId val="1771603535"/>
         <c:scaling>
           <c:orientation val="minMax"/>
           <c:max val="3.5"/>
@@ -4801,7 +4851,7 @@
             <a:endParaRPr lang="da-DK"/>
           </a:p>
         </c:txPr>
-        <c:crossAx val="239089200"/>
+        <c:crossAx val="1984583695"/>
         <c:crosses val="autoZero"/>
         <c:crossBetween val="midCat"/>
         <c:majorUnit val="0.5"/>

</xml_diff>